<commit_message>
Reorder campaigns: user's seven cohorts first, additions below
Lists the seven shared segments in the order they were given, then the
three added campaigns under a separate banner. Adds an explicit send plan
since list order is not send order.

Co-Authored-By: Claude Opus 5 <noreply@anthropic.com>
Claude-Session: https://claude.ai/code/session_01RjSU6dDwFBwk34LrSdddTP
</commit_message>
<xml_diff>
--- a/campaigns/Dev-Aastha-WhatsApp-Campaign-Brief.docx
+++ b/campaigns/Dev-Aastha-WhatsApp-Campaign-Brief.docx
@@ -1253,6 +1253,42 @@
     </w:p>
     <w:p>
       <w:pPr>
+        <w:spacing w:after="40" w:before="20" w:line="240"/>
+      </w:pPr>
+      <w:r>
+        <w:rPr>
+          <w:rFonts w:ascii="Calibri" w:cs="Calibri" w:eastAsia="Calibri" w:hAnsi="Calibri"/>
+          <w:b/>
+          <w:bCs/>
+          <w:i w:val="false"/>
+          <w:iCs w:val="false"/>
+          <w:color w:val="7C2D12"/>
+          <w:sz w:val="17"/>
+          <w:szCs w:val="17"/>
+        </w:rPr>
+        <w:t xml:space="preserve">Campaigns 1–7 are the seven segments you shared, listed in your order. Campaigns 8–10 are additions of mine.</w:t>
+      </w:r>
+    </w:p>
+    <w:p>
+      <w:pPr>
+        <w:spacing w:after="60" w:before="20" w:line="240"/>
+      </w:pPr>
+      <w:r>
+        <w:rPr>
+          <w:rFonts w:ascii="Calibri" w:cs="Calibri" w:eastAsia="Calibri" w:hAnsi="Calibri"/>
+          <w:b w:val="false"/>
+          <w:bCs w:val="false"/>
+          <w:i w:val="false"/>
+          <w:iCs w:val="false"/>
+          <w:color w:val="1C1917"/>
+          <w:sz w:val="17"/>
+          <w:szCs w:val="17"/>
+        </w:rPr>
+        <w:t xml:space="preserve">List order is not send order. The calendar is driven by the 26 September Shraddh deadline, so read the SEND time in each row — campaigns 1–7 all go out between 24 and 26 September, in the sequence given in the send plan below.</w:t>
+      </w:r>
+    </w:p>
+    <w:p>
+      <w:pPr>
         <w:spacing w:after="100" w:before="20" w:line="240"/>
       </w:pPr>
       <w:r>
@@ -1481,25 +1517,21 @@
         </w:tc>
       </w:tr>
       <w:tr>
-        <w:trPr>
-          <w:cantSplit w:val="false"/>
-        </w:trPr>
-        <w:tc>
-          <w:tcPr>
-            <w:tcW w:type="dxa" w:w="520"/>
-            <w:shd w:fill="FFFFFF" w:color="auto" w:val="clear"/>
-            <w:tcMar>
-              <w:top w:type="dxa" w:w="90"/>
-              <w:left w:type="dxa" w:w="110"/>
-              <w:bottom w:type="dxa" w:w="90"/>
-              <w:right w:type="dxa" w:w="110"/>
-            </w:tcMar>
-            <w:vAlign w:val="top"/>
+        <w:tc>
+          <w:tcPr>
+            <w:tcW w:type="dxa" w:w="14400"/>
+            <w:gridSpan w:val="6"/>
+            <w:shd w:fill="B45309" w:color="auto" w:val="clear"/>
+            <w:tcMar>
+              <w:top w:type="dxa" w:w="80"/>
+              <w:left w:type="dxa" w:w="110"/>
+              <w:bottom w:type="dxa" w:w="80"/>
+              <w:right w:type="dxa" w:w="110"/>
+            </w:tcMar>
           </w:tcPr>
           <w:p>
             <w:pPr>
               <w:spacing w:after="20" w:before="20" w:line="240"/>
-              <w:jc w:val="center"/>
             </w:pPr>
             <w:r>
               <w:rPr>
@@ -1508,544 +1540,24 @@
                 <w:bCs/>
                 <w:i w:val="false"/>
                 <w:iCs w:val="false"/>
-                <w:color w:val="B45309"/>
-                <w:sz w:val="22"/>
-                <w:szCs w:val="22"/>
-              </w:rPr>
-              <w:t xml:space="preserve">1</w:t>
-            </w:r>
-          </w:p>
-        </w:tc>
-        <w:tc>
-          <w:tcPr>
-            <w:tcW w:type="dxa" w:w="2000"/>
-            <w:shd w:fill="FFFFFF" w:color="auto" w:val="clear"/>
-            <w:tcMar>
-              <w:top w:type="dxa" w:w="90"/>
-              <w:left w:type="dxa" w:w="110"/>
-              <w:bottom w:type="dxa" w:w="90"/>
-              <w:right w:type="dxa" w:w="110"/>
-            </w:tcMar>
-            <w:vAlign w:val="top"/>
-          </w:tcPr>
-          <w:p>
-            <w:pPr>
-              <w:spacing w:after="20" w:before="20" w:line="240"/>
-            </w:pPr>
-            <w:r>
-              <w:rPr>
-                <w:rFonts w:ascii="Calibri" w:cs="Calibri" w:eastAsia="Calibri" w:hAnsi="Calibri"/>
-                <w:b/>
-                <w:bCs/>
-                <w:i w:val="false"/>
-                <w:iCs w:val="false"/>
-                <w:color w:val="1C1917"/>
-                <w:sz w:val="18"/>
-                <w:szCs w:val="18"/>
-              </w:rPr>
-              <w:t xml:space="preserve">ATC – 180 Days</w:t>
-            </w:r>
-          </w:p>
-          <w:p>
-            <w:pPr>
-              <w:spacing w:after="20" w:before="20" w:line="240"/>
-            </w:pPr>
-            <w:r>
-              <w:rPr>
-                <w:rFonts w:ascii="Calibri" w:cs="Calibri" w:eastAsia="Calibri" w:hAnsi="Calibri"/>
-                <w:b w:val="false"/>
-                <w:bCs w:val="false"/>
-                <w:i w:val="false"/>
-                <w:iCs w:val="false"/>
-                <w:color w:val="78716C"/>
-                <w:sz w:val="15"/>
-                <w:szCs w:val="15"/>
-              </w:rPr>
-              <w:t xml:space="preserve">2,398 contacts</w:t>
-            </w:r>
-          </w:p>
-          <w:p>
-            <w:pPr>
-              <w:spacing w:after="20" w:before="60" w:line="240"/>
-            </w:pPr>
-            <w:r>
-              <w:rPr>
-                <w:rFonts w:ascii="Calibri" w:cs="Calibri" w:eastAsia="Calibri" w:hAnsi="Calibri"/>
-                <w:b/>
-                <w:bCs/>
-                <w:i w:val="false"/>
-                <w:iCs w:val="false"/>
-                <w:color w:val="B45309"/>
+                <w:color w:val="FFFFFF"/>
+                <w:sz w:val="19"/>
+                <w:szCs w:val="19"/>
+              </w:rPr>
+              <w:t xml:space="preserve">YOUR 7 COHORTS</w:t>
+            </w:r>
+            <w:r>
+              <w:rPr>
+                <w:rFonts w:ascii="Calibri" w:cs="Calibri" w:eastAsia="Calibri" w:hAnsi="Calibri"/>
+                <w:b w:val="false"/>
+                <w:bCs w:val="false"/>
+                <w:i w:val="false"/>
+                <w:iCs w:val="false"/>
+                <w:color w:val="FEF3C7"/>
                 <w:sz w:val="16"/>
                 <w:szCs w:val="16"/>
               </w:rPr>
-              <w:t xml:space="preserve">24 Sep · 7:00 PM</w:t>
-            </w:r>
-          </w:p>
-        </w:tc>
-        <w:tc>
-          <w:tcPr>
-            <w:tcW w:type="dxa" w:w="5200"/>
-            <w:shd w:fill="FFFFFF" w:color="auto" w:val="clear"/>
-            <w:tcMar>
-              <w:top w:type="dxa" w:w="90"/>
-              <w:left w:type="dxa" w:w="110"/>
-              <w:bottom w:type="dxa" w:w="90"/>
-              <w:right w:type="dxa" w:w="110"/>
-            </w:tcMar>
-            <w:vAlign w:val="top"/>
-          </w:tcPr>
-          <w:p>
-            <w:pPr>
-              <w:spacing w:after="0" w:before="0" w:line="230"/>
-            </w:pPr>
-            <w:r>
-              <w:rPr>
-                <w:rFonts w:ascii="Calibri" w:cs="Calibri" w:eastAsia="Calibri" w:hAnsi="Calibri"/>
-                <w:b w:val="false"/>
-                <w:bCs w:val="false"/>
-                <w:i w:val="false"/>
-                <w:iCs w:val="false"/>
-                <w:color w:val="1C1917"/>
-                <w:sz w:val="17"/>
-                <w:szCs w:val="17"/>
-              </w:rPr>
-              <w:t xml:space="preserve">{{1}}, your *{{2}}* is still waiting in your cart 🛒</w:t>
-            </w:r>
-          </w:p>
-          <w:p>
-            <w:pPr>
-              <w:spacing w:after="0" w:before="0" w:line="120"/>
-            </w:pPr>
-            <w:r>
-              <w:rPr>
-                <w:rFonts w:ascii="Calibri" w:cs="Calibri" w:eastAsia="Calibri" w:hAnsi="Calibri"/>
-                <w:b w:val="false"/>
-                <w:bCs w:val="false"/>
-                <w:i w:val="false"/>
-                <w:iCs w:val="false"/>
-                <w:color w:val="1C1917"/>
-                <w:sz w:val="17"/>
-                <w:szCs w:val="17"/>
-              </w:rPr>
-              <w:t xml:space="preserve"/>
-            </w:r>
-          </w:p>
-          <w:p>
-            <w:pPr>
-              <w:spacing w:after="0" w:before="0" w:line="230"/>
-            </w:pPr>
-            <w:r>
-              <w:rPr>
-                <w:rFonts w:ascii="Calibri" w:cs="Calibri" w:eastAsia="Calibri" w:hAnsi="Calibri"/>
-                <w:b w:val="false"/>
-                <w:bCs w:val="false"/>
-                <w:i w:val="false"/>
-                <w:iCs w:val="false"/>
-                <w:color w:val="1C1917"/>
-                <w:sz w:val="17"/>
-                <w:szCs w:val="17"/>
-              </w:rPr>
-              <w:t xml:space="preserve">Bappa has gone home. Now the house prepares for *Maa Lakshmi* 🪔</w:t>
-            </w:r>
-          </w:p>
-          <w:p>
-            <w:pPr>
-              <w:spacing w:after="0" w:before="0" w:line="120"/>
-            </w:pPr>
-            <w:r>
-              <w:rPr>
-                <w:rFonts w:ascii="Calibri" w:cs="Calibri" w:eastAsia="Calibri" w:hAnsi="Calibri"/>
-                <w:b w:val="false"/>
-                <w:bCs w:val="false"/>
-                <w:i w:val="false"/>
-                <w:iCs w:val="false"/>
-                <w:color w:val="1C1917"/>
-                <w:sz w:val="17"/>
-                <w:szCs w:val="17"/>
-              </w:rPr>
-              <w:t xml:space="preserve"/>
-            </w:r>
-          </w:p>
-          <w:p>
-            <w:pPr>
-              <w:spacing w:after="0" w:before="0" w:line="230"/>
-            </w:pPr>
-            <w:r>
-              <w:rPr>
-                <w:rFonts w:ascii="Calibri" w:cs="Calibri" w:eastAsia="Calibri" w:hAnsi="Calibri"/>
-                <w:b w:val="false"/>
-                <w:bCs w:val="false"/>
-                <w:i w:val="false"/>
-                <w:iCs w:val="false"/>
-                <w:color w:val="1C1917"/>
-                <w:sz w:val="17"/>
-                <w:szCs w:val="17"/>
-              </w:rPr>
-              <w:t xml:space="preserve">An *exclusive ₹151 off* is reserved for you 🎁</w:t>
-            </w:r>
-          </w:p>
-          <w:p>
-            <w:pPr>
-              <w:spacing w:after="0" w:before="0" w:line="230"/>
-            </w:pPr>
-            <w:r>
-              <w:rPr>
-                <w:rFonts w:ascii="Calibri" w:cs="Calibri" w:eastAsia="Calibri" w:hAnsi="Calibri"/>
-                <w:b w:val="false"/>
-                <w:bCs w:val="false"/>
-                <w:i w:val="false"/>
-                <w:iCs w:val="false"/>
-                <w:color w:val="1C1917"/>
-                <w:sz w:val="17"/>
-                <w:szCs w:val="17"/>
-              </w:rPr>
-              <w:t xml:space="preserve">Use Coupon Code *CART151*</w:t>
-            </w:r>
-          </w:p>
-          <w:p>
-            <w:pPr>
-              <w:spacing w:after="0" w:before="0" w:line="120"/>
-            </w:pPr>
-            <w:r>
-              <w:rPr>
-                <w:rFonts w:ascii="Calibri" w:cs="Calibri" w:eastAsia="Calibri" w:hAnsi="Calibri"/>
-                <w:b w:val="false"/>
-                <w:bCs w:val="false"/>
-                <w:i w:val="false"/>
-                <w:iCs w:val="false"/>
-                <w:color w:val="1C1917"/>
-                <w:sz w:val="17"/>
-                <w:szCs w:val="17"/>
-              </w:rPr>
-              <w:t xml:space="preserve"/>
-            </w:r>
-          </w:p>
-          <w:p>
-            <w:pPr>
-              <w:spacing w:after="0" w:before="0" w:line="230"/>
-            </w:pPr>
-            <w:r>
-              <w:rPr>
-                <w:rFonts w:ascii="Calibri" w:cs="Calibri" w:eastAsia="Calibri" w:hAnsi="Calibri"/>
-                <w:b w:val="false"/>
-                <w:bCs w:val="false"/>
-                <w:i w:val="false"/>
-                <w:iCs w:val="false"/>
-                <w:color w:val="1C1917"/>
-                <w:sz w:val="17"/>
-                <w:szCs w:val="17"/>
-              </w:rPr>
-              <w:t xml:space="preserve">⌛ Cart clears tonight — 11:59 PM !!</w:t>
-            </w:r>
-          </w:p>
-          <w:p>
-            <w:pPr>
-              <w:spacing w:after="0" w:before="0" w:line="120"/>
-            </w:pPr>
-            <w:r>
-              <w:rPr>
-                <w:rFonts w:ascii="Calibri" w:cs="Calibri" w:eastAsia="Calibri" w:hAnsi="Calibri"/>
-                <w:b w:val="false"/>
-                <w:bCs w:val="false"/>
-                <w:i w:val="false"/>
-                <w:iCs w:val="false"/>
-                <w:color w:val="1C1917"/>
-                <w:sz w:val="17"/>
-                <w:szCs w:val="17"/>
-              </w:rPr>
-              <w:t xml:space="preserve"/>
-            </w:r>
-          </w:p>
-          <w:p>
-            <w:pPr>
-              <w:spacing w:after="0" w:before="0" w:line="230"/>
-            </w:pPr>
-            <w:r>
-              <w:rPr>
-                <w:rFonts w:ascii="Calibri" w:cs="Calibri" w:eastAsia="Calibri" w:hAnsi="Calibri"/>
-                <w:b w:val="false"/>
-                <w:bCs w:val="false"/>
-                <w:i w:val="false"/>
-                <w:iCs w:val="false"/>
-                <w:color w:val="1C1917"/>
-                <w:sz w:val="17"/>
-                <w:szCs w:val="17"/>
-              </w:rPr>
-              <w:t xml:space="preserve">"May what you chose reach your mandir before the doors close 🙏"</w:t>
-            </w:r>
-          </w:p>
-          <w:p>
-            <w:pPr>
-              <w:spacing w:after="0" w:before="0" w:line="230"/>
-            </w:pPr>
-            <w:r>
-              <w:rPr>
-                <w:rFonts w:ascii="Calibri" w:cs="Calibri" w:eastAsia="Calibri" w:hAnsi="Calibri"/>
-                <w:b w:val="false"/>
-                <w:bCs w:val="false"/>
-                <w:i w:val="false"/>
-                <w:iCs w:val="false"/>
-                <w:color w:val="1C1917"/>
-                <w:sz w:val="17"/>
-                <w:szCs w:val="17"/>
-              </w:rPr>
-              <w:t xml:space="preserve">— Dev Aastha</w:t>
-            </w:r>
-          </w:p>
-        </w:tc>
-        <w:tc>
-          <w:tcPr>
-            <w:tcW w:type="dxa" w:w="1900"/>
-            <w:shd w:fill="FFFFFF" w:color="auto" w:val="clear"/>
-            <w:tcMar>
-              <w:top w:type="dxa" w:w="90"/>
-              <w:left w:type="dxa" w:w="110"/>
-              <w:bottom w:type="dxa" w:w="90"/>
-              <w:right w:type="dxa" w:w="110"/>
-            </w:tcMar>
-            <w:vAlign w:val="top"/>
-          </w:tcPr>
-          <w:p>
-            <w:pPr>
-              <w:spacing w:after="30" w:before="0" w:line="220"/>
-            </w:pPr>
-            <w:r>
-              <w:rPr>
-                <w:rFonts w:ascii="Calibri" w:cs="Calibri" w:eastAsia="Calibri" w:hAnsi="Calibri"/>
-                <w:b w:val="false"/>
-                <w:bCs w:val="false"/>
-                <w:i w:val="false"/>
-                <w:iCs w:val="false"/>
-                <w:color w:val="44403C"/>
-                <w:sz w:val="15"/>
-                <w:szCs w:val="15"/>
-              </w:rPr>
-              <w:t xml:space="preserve">• Flat ₹151 off</w:t>
-            </w:r>
-          </w:p>
-          <w:p>
-            <w:pPr>
-              <w:spacing w:after="30" w:before="0" w:line="220"/>
-            </w:pPr>
-            <w:r>
-              <w:rPr>
-                <w:rFonts w:ascii="Calibri" w:cs="Calibri" w:eastAsia="Calibri" w:hAnsi="Calibri"/>
-                <w:b w:val="false"/>
-                <w:bCs w:val="false"/>
-                <w:i w:val="false"/>
-                <w:iCs w:val="false"/>
-                <w:color w:val="44403C"/>
-                <w:sz w:val="15"/>
-                <w:szCs w:val="15"/>
-              </w:rPr>
-              <w:t xml:space="preserve">• Min cart ₹1,499</w:t>
-            </w:r>
-          </w:p>
-          <w:p>
-            <w:pPr>
-              <w:spacing w:after="30" w:before="0" w:line="220"/>
-            </w:pPr>
-            <w:r>
-              <w:rPr>
-                <w:rFonts w:ascii="Calibri" w:cs="Calibri" w:eastAsia="Calibri" w:hAnsi="Calibri"/>
-                <w:b w:val="false"/>
-                <w:bCs w:val="false"/>
-                <w:i w:val="false"/>
-                <w:iCs w:val="false"/>
-                <w:color w:val="44403C"/>
-                <w:sz w:val="15"/>
-                <w:szCs w:val="15"/>
-              </w:rPr>
-              <w:t xml:space="preserve">• Code: CART151</w:t>
-            </w:r>
-          </w:p>
-          <w:p>
-            <w:pPr>
-              <w:spacing w:after="30" w:before="0" w:line="220"/>
-            </w:pPr>
-            <w:r>
-              <w:rPr>
-                <w:rFonts w:ascii="Calibri" w:cs="Calibri" w:eastAsia="Calibri" w:hAnsi="Calibri"/>
-                <w:b w:val="false"/>
-                <w:bCs w:val="false"/>
-                <w:i w:val="false"/>
-                <w:iCs w:val="false"/>
-                <w:color w:val="44403C"/>
-                <w:sz w:val="15"/>
-                <w:szCs w:val="15"/>
-              </w:rPr>
-              <w:t xml:space="preserve">• Effective 10.1%</w:t>
-            </w:r>
-          </w:p>
-          <w:p>
-            <w:pPr>
-              <w:spacing w:after="30" w:before="0" w:line="220"/>
-            </w:pPr>
-            <w:r>
-              <w:rPr>
-                <w:rFonts w:ascii="Calibri" w:cs="Calibri" w:eastAsia="Calibri" w:hAnsi="Calibri"/>
-                <w:b w:val="false"/>
-                <w:bCs w:val="false"/>
-                <w:i w:val="false"/>
-                <w:iCs w:val="false"/>
-                <w:color w:val="44403C"/>
-                <w:sz w:val="15"/>
-                <w:szCs w:val="15"/>
-              </w:rPr>
-              <w:t xml:space="preserve">• Expires 24 Sep, 11:59 PM</w:t>
-            </w:r>
-          </w:p>
-        </w:tc>
-        <w:tc>
-          <w:tcPr>
-            <w:tcW w:type="dxa" w:w="3100"/>
-            <w:shd w:fill="FFFFFF" w:color="auto" w:val="clear"/>
-            <w:tcMar>
-              <w:top w:type="dxa" w:w="90"/>
-              <w:left w:type="dxa" w:w="110"/>
-              <w:bottom w:type="dxa" w:w="90"/>
-              <w:right w:type="dxa" w:w="110"/>
-            </w:tcMar>
-            <w:vAlign w:val="top"/>
-          </w:tcPr>
-          <w:p>
-            <w:pPr>
-              <w:spacing w:after="30" w:before="0" w:line="220"/>
-            </w:pPr>
-            <w:r>
-              <w:rPr>
-                <w:rFonts w:ascii="Calibri" w:cs="Calibri" w:eastAsia="Calibri" w:hAnsi="Calibri"/>
-                <w:b w:val="false"/>
-                <w:bCs w:val="false"/>
-                <w:i w:val="false"/>
-                <w:iCs w:val="false"/>
-                <w:color w:val="44403C"/>
-                <w:sz w:val="15"/>
-                <w:szCs w:val="15"/>
-              </w:rPr>
-              <w:t xml:space="preserve">• DYNAMIC: the exact product in their cart</w:t>
-            </w:r>
-          </w:p>
-          <w:p>
-            <w:pPr>
-              <w:spacing w:after="30" w:before="0" w:line="220"/>
-            </w:pPr>
-            <w:r>
-              <w:rPr>
-                <w:rFonts w:ascii="Calibri" w:cs="Calibri" w:eastAsia="Calibri" w:hAnsi="Calibri"/>
-                <w:b w:val="false"/>
-                <w:bCs w:val="false"/>
-                <w:i w:val="false"/>
-                <w:iCs w:val="false"/>
-                <w:color w:val="44403C"/>
-                <w:sz w:val="15"/>
-                <w:szCs w:val="15"/>
-              </w:rPr>
-              <w:t xml:space="preserve">• House template: product on wooden base, dark green backdrop, jute mat</w:t>
-            </w:r>
-          </w:p>
-          <w:p>
-            <w:pPr>
-              <w:spacing w:after="30" w:before="0" w:line="220"/>
-            </w:pPr>
-            <w:r>
-              <w:rPr>
-                <w:rFonts w:ascii="Calibri" w:cs="Calibri" w:eastAsia="Calibri" w:hAnsi="Calibri"/>
-                <w:b w:val="false"/>
-                <w:bCs w:val="false"/>
-                <w:i w:val="false"/>
-                <w:iCs w:val="false"/>
-                <w:color w:val="44403C"/>
-                <w:sz w:val="15"/>
-                <w:szCs w:val="15"/>
-              </w:rPr>
-              <w:t xml:space="preserve">• Keep the 999 SILVER PLATED maroon badge, top-left</w:t>
-            </w:r>
-          </w:p>
-          <w:p>
-            <w:pPr>
-              <w:spacing w:after="30" w:before="0" w:line="220"/>
-            </w:pPr>
-            <w:r>
-              <w:rPr>
-                <w:rFonts w:ascii="Calibri" w:cs="Calibri" w:eastAsia="Calibri" w:hAnsi="Calibri"/>
-                <w:b w:val="false"/>
-                <w:bCs w:val="false"/>
-                <w:i w:val="false"/>
-                <w:iCs w:val="false"/>
-                <w:color w:val="44403C"/>
-                <w:sz w:val="15"/>
-                <w:szCs w:val="15"/>
-              </w:rPr>
-              <w:t xml:space="preserve">• Swap the arrow callout to point at the product</w:t>
-            </w:r>
-          </w:p>
-          <w:p>
-            <w:pPr>
-              <w:spacing w:after="30" w:before="0" w:line="220"/>
-            </w:pPr>
-            <w:r>
-              <w:rPr>
-                <w:rFonts w:ascii="Calibri" w:cs="Calibri" w:eastAsia="Calibri" w:hAnsi="Calibri"/>
-                <w:b w:val="false"/>
-                <w:bCs w:val="false"/>
-                <w:i w:val="false"/>
-                <w:iCs w:val="false"/>
-                <w:color w:val="44403C"/>
-                <w:sz w:val="15"/>
-                <w:szCs w:val="15"/>
-              </w:rPr>
-              <w:t xml:space="preserve">• Add a small cart icon + "Still yours" ribbon</w:t>
-            </w:r>
-          </w:p>
-        </w:tc>
-        <w:tc>
-          <w:tcPr>
-            <w:tcW w:type="dxa" w:w="1680"/>
-            <w:shd w:fill="FFFFFF" w:color="auto" w:val="clear"/>
-            <w:tcMar>
-              <w:top w:type="dxa" w:w="90"/>
-              <w:left w:type="dxa" w:w="110"/>
-              <w:bottom w:type="dxa" w:w="90"/>
-              <w:right w:type="dxa" w:w="110"/>
-            </w:tcMar>
-            <w:vAlign w:val="top"/>
-          </w:tcPr>
-          <w:p>
-            <w:pPr>
-              <w:spacing w:after="70" w:before="20" w:line="240"/>
-            </w:pPr>
-            <w:r>
-              <w:rPr>
-                <w:rFonts w:ascii="Calibri" w:cs="Calibri" w:eastAsia="Calibri" w:hAnsi="Calibri"/>
-                <w:b/>
-                <w:bCs/>
-                <w:i w:val="false"/>
-                <w:iCs w:val="false"/>
-                <w:color w:val="7C2D12"/>
-                <w:sz w:val="16"/>
-                <w:szCs w:val="16"/>
-              </w:rPr>
-              <w:t xml:space="preserve">▸ Buy Now</w:t>
-            </w:r>
-          </w:p>
-          <w:p>
-            <w:pPr>
-              <w:spacing w:after="70" w:before="20" w:line="240"/>
-            </w:pPr>
-            <w:r>
-              <w:rPr>
-                <w:rFonts w:ascii="Calibri" w:cs="Calibri" w:eastAsia="Calibri" w:hAnsi="Calibri"/>
-                <w:b/>
-                <w:bCs/>
-                <w:i w:val="false"/>
-                <w:iCs w:val="false"/>
-                <w:color w:val="7C2D12"/>
-                <w:sz w:val="16"/>
-                <w:szCs w:val="16"/>
-              </w:rPr>
-              <w:t xml:space="preserve">▸ View Cart</w:t>
+              <w:t xml:space="preserve">   — the segments you shared, in your list order</w:t>
             </w:r>
           </w:p>
         </w:tc>
@@ -2057,7 +1569,7 @@
         <w:tc>
           <w:tcPr>
             <w:tcW w:type="dxa" w:w="520"/>
-            <w:shd w:fill="F5F5F4" w:color="auto" w:val="clear"/>
+            <w:shd w:fill="FFFFFF" w:color="auto" w:val="clear"/>
             <w:tcMar>
               <w:top w:type="dxa" w:w="90"/>
               <w:left w:type="dxa" w:w="110"/>
@@ -2082,14 +1594,14 @@
                 <w:sz w:val="22"/>
                 <w:szCs w:val="22"/>
               </w:rPr>
-              <w:t xml:space="preserve">2</w:t>
+              <w:t xml:space="preserve">1</w:t>
             </w:r>
           </w:p>
         </w:tc>
         <w:tc>
           <w:tcPr>
             <w:tcW w:type="dxa" w:w="2000"/>
-            <w:shd w:fill="F5F5F4" w:color="auto" w:val="clear"/>
+            <w:shd w:fill="FFFFFF" w:color="auto" w:val="clear"/>
             <w:tcMar>
               <w:top w:type="dxa" w:w="90"/>
               <w:left w:type="dxa" w:w="110"/>
@@ -2113,7 +1625,7 @@
                 <w:sz w:val="18"/>
                 <w:szCs w:val="18"/>
               </w:rPr>
-              <w:t xml:space="preserve">PDP Visit 2–7 Days</w:t>
+              <w:t xml:space="preserve">PDP Visit 15–30 Days</w:t>
             </w:r>
           </w:p>
           <w:p>
@@ -2131,7 +1643,7 @@
                 <w:sz w:val="15"/>
                 <w:szCs w:val="15"/>
               </w:rPr>
-              <w:t xml:space="preserve">4,417 contacts</w:t>
+              <w:t xml:space="preserve">6,003 contacts — largest</w:t>
             </w:r>
           </w:p>
           <w:p>
@@ -2149,14 +1661,14 @@
                 <w:sz w:val="16"/>
                 <w:szCs w:val="16"/>
               </w:rPr>
-              <w:t xml:space="preserve">25 Sep · 11:00 AM</w:t>
+              <w:t xml:space="preserve">SEND  26 Sep · 12:00 PM</w:t>
             </w:r>
           </w:p>
         </w:tc>
         <w:tc>
           <w:tcPr>
             <w:tcW w:type="dxa" w:w="5200"/>
-            <w:shd w:fill="F5F5F4" w:color="auto" w:val="clear"/>
+            <w:shd w:fill="FFFFFF" w:color="auto" w:val="clear"/>
             <w:tcMar>
               <w:top w:type="dxa" w:w="90"/>
               <w:left w:type="dxa" w:w="110"/>
@@ -2180,7 +1692,7 @@
                 <w:sz w:val="17"/>
                 <w:szCs w:val="17"/>
               </w:rPr>
-              <w:t xml:space="preserve">{{1}}, you were looking at *{{2}}* 👀</w:t>
+              <w:t xml:space="preserve">{{1}}, Bappa's visarjan is done. Now the *Kalash* is filled 🪔</w:t>
             </w:r>
           </w:p>
           <w:p>
@@ -2216,7 +1728,7 @@
                 <w:sz w:val="17"/>
                 <w:szCs w:val="17"/>
               </w:rPr>
-              <w:t xml:space="preserve">Only *{{3}} pieces* left in this size.</w:t>
+              <w:t xml:space="preserve">Kuber is the treasurer of the gods — his kalash is the vessel Lakshmi fills first.</w:t>
             </w:r>
           </w:p>
           <w:p>
@@ -2252,7 +1764,7 @@
                 <w:sz w:val="17"/>
                 <w:szCs w:val="17"/>
               </w:rPr>
-              <w:t xml:space="preserve">Order by tomorrow and it reaches you before *Shraddh* 🎁</w:t>
+              <w:t xml:space="preserve">999 Silver Plated · *₹1,249*</w:t>
             </w:r>
           </w:p>
           <w:p>
@@ -2262,15 +1774,15 @@
             <w:r>
               <w:rPr>
                 <w:rFonts w:ascii="Calibri" w:cs="Calibri" w:eastAsia="Calibri" w:hAnsi="Calibri"/>
-                <w:b w:val="false"/>
-                <w:bCs w:val="false"/>
-                <w:i w:val="false"/>
-                <w:iCs w:val="false"/>
-                <w:color w:val="1C1917"/>
-                <w:sz w:val="17"/>
-                <w:szCs w:val="17"/>
-              </w:rPr>
-              <w:t xml:space="preserve">Free velvet gift box + priority dispatch today</w:t>
+                <w:b/>
+                <w:bCs/>
+                <w:i w:val="false"/>
+                <w:iCs w:val="false"/>
+                <w:color w:val="1C1917"/>
+                <w:sz w:val="17"/>
+                <w:szCs w:val="17"/>
+              </w:rPr>
+              <w:t xml:space="preserve">🏆 Our most-ordered murti this month</w:t>
             </w:r>
           </w:p>
           <w:p>
@@ -2306,7 +1818,25 @@
                 <w:sz w:val="17"/>
                 <w:szCs w:val="17"/>
               </w:rPr>
-              <w:t xml:space="preserve">⌛ After 27 Sep, sthapana waits till Navratri — 11 Oct !!</w:t>
+              <w:t xml:space="preserve">Add a Lakshmi Charan (₹1,499) → ₹2,748</w:t>
+            </w:r>
+          </w:p>
+          <w:p>
+            <w:pPr>
+              <w:spacing w:after="0" w:before="0" w:line="230"/>
+            </w:pPr>
+            <w:r>
+              <w:rPr>
+                <w:rFonts w:ascii="Calibri" w:cs="Calibri" w:eastAsia="Calibri" w:hAnsi="Calibri"/>
+                <w:b w:val="false"/>
+                <w:bCs w:val="false"/>
+                <w:i w:val="false"/>
+                <w:iCs w:val="false"/>
+                <w:color w:val="1C1917"/>
+                <w:sz w:val="17"/>
+                <w:szCs w:val="17"/>
+              </w:rPr>
+              <w:t xml:space="preserve">Flat *₹251 off* with Coupon Code *LAKSHMI251* → *₹2,497* 🎁</w:t>
             </w:r>
           </w:p>
           <w:p>
@@ -2342,7 +1872,25 @@
                 <w:sz w:val="17"/>
                 <w:szCs w:val="17"/>
               </w:rPr>
-              <w:t xml:space="preserve">"May the murti you chose find its place in your mandir 🙏"</w:t>
+              <w:t xml:space="preserve">⌛ Ends tonight — Shraddh starts tomorrow !!</w:t>
+            </w:r>
+          </w:p>
+          <w:p>
+            <w:pPr>
+              <w:spacing w:after="0" w:before="0" w:line="120"/>
+            </w:pPr>
+            <w:r>
+              <w:rPr>
+                <w:rFonts w:ascii="Calibri" w:cs="Calibri" w:eastAsia="Calibri" w:hAnsi="Calibri"/>
+                <w:b w:val="false"/>
+                <w:bCs w:val="false"/>
+                <w:i w:val="false"/>
+                <w:iCs w:val="false"/>
+                <w:color w:val="1C1917"/>
+                <w:sz w:val="17"/>
+                <w:szCs w:val="17"/>
+              </w:rPr>
+              <w:t xml:space="preserve"/>
             </w:r>
           </w:p>
           <w:p>
@@ -2360,6 +1908,24 @@
                 <w:sz w:val="17"/>
                 <w:szCs w:val="17"/>
               </w:rPr>
+              <w:t xml:space="preserve">"May Kuber fill your kalash and Lakshmi never leave your door 🙏"</w:t>
+            </w:r>
+          </w:p>
+          <w:p>
+            <w:pPr>
+              <w:spacing w:after="0" w:before="0" w:line="230"/>
+            </w:pPr>
+            <w:r>
+              <w:rPr>
+                <w:rFonts w:ascii="Calibri" w:cs="Calibri" w:eastAsia="Calibri" w:hAnsi="Calibri"/>
+                <w:b w:val="false"/>
+                <w:bCs w:val="false"/>
+                <w:i w:val="false"/>
+                <w:iCs w:val="false"/>
+                <w:color w:val="1C1917"/>
+                <w:sz w:val="17"/>
+                <w:szCs w:val="17"/>
+              </w:rPr>
               <w:t xml:space="preserve">— Dev Aastha</w:t>
             </w:r>
           </w:p>
@@ -2367,195 +1933,213 @@
         <w:tc>
           <w:tcPr>
             <w:tcW w:type="dxa" w:w="1900"/>
-            <w:shd w:fill="F5F5F4" w:color="auto" w:val="clear"/>
-            <w:tcMar>
-              <w:top w:type="dxa" w:w="90"/>
-              <w:left w:type="dxa" w:w="110"/>
-              <w:bottom w:type="dxa" w:w="90"/>
-              <w:right w:type="dxa" w:w="110"/>
-            </w:tcMar>
-            <w:vAlign w:val="top"/>
-          </w:tcPr>
-          <w:p>
-            <w:pPr>
-              <w:spacing w:after="30" w:before="0" w:line="220"/>
-            </w:pPr>
-            <w:r>
-              <w:rPr>
-                <w:rFonts w:ascii="Calibri" w:cs="Calibri" w:eastAsia="Calibri" w:hAnsi="Calibri"/>
-                <w:b w:val="false"/>
-                <w:bCs w:val="false"/>
-                <w:i w:val="false"/>
-                <w:iCs w:val="false"/>
-                <w:color w:val="44403C"/>
-                <w:sz w:val="15"/>
-                <w:szCs w:val="15"/>
-              </w:rPr>
-              <w:t xml:space="preserve">• NO DISCOUNT — deliberate</w:t>
-            </w:r>
-          </w:p>
-          <w:p>
-            <w:pPr>
-              <w:spacing w:after="30" w:before="0" w:line="220"/>
-            </w:pPr>
-            <w:r>
-              <w:rPr>
-                <w:rFonts w:ascii="Calibri" w:cs="Calibri" w:eastAsia="Calibri" w:hAnsi="Calibri"/>
-                <w:b w:val="false"/>
-                <w:bCs w:val="false"/>
-                <w:i w:val="false"/>
-                <w:iCs w:val="false"/>
-                <w:color w:val="44403C"/>
-                <w:sz w:val="15"/>
-                <w:szCs w:val="15"/>
-              </w:rPr>
-              <w:t xml:space="preserve">• Free velvet gift box</w:t>
-            </w:r>
-          </w:p>
-          <w:p>
-            <w:pPr>
-              <w:spacing w:after="30" w:before="0" w:line="220"/>
-            </w:pPr>
-            <w:r>
-              <w:rPr>
-                <w:rFonts w:ascii="Calibri" w:cs="Calibri" w:eastAsia="Calibri" w:hAnsi="Calibri"/>
-                <w:b w:val="false"/>
-                <w:bCs w:val="false"/>
-                <w:i w:val="false"/>
-                <w:iCs w:val="false"/>
-                <w:color w:val="44403C"/>
-                <w:sz w:val="15"/>
-                <w:szCs w:val="15"/>
-              </w:rPr>
-              <w:t xml:space="preserve">• Priority dispatch today</w:t>
-            </w:r>
-          </w:p>
-          <w:p>
-            <w:pPr>
-              <w:spacing w:after="30" w:before="0" w:line="220"/>
-            </w:pPr>
-            <w:r>
-              <w:rPr>
-                <w:rFonts w:ascii="Calibri" w:cs="Calibri" w:eastAsia="Calibri" w:hAnsi="Calibri"/>
-                <w:b w:val="false"/>
-                <w:bCs w:val="false"/>
-                <w:i w:val="false"/>
-                <w:iCs w:val="false"/>
-                <w:color w:val="44403C"/>
-                <w:sz w:val="15"/>
-                <w:szCs w:val="15"/>
-              </w:rPr>
-              <w:t xml:space="preserve">• Hottest cohort; discounting here is margin donation</w:t>
+            <w:shd w:fill="FFFFFF" w:color="auto" w:val="clear"/>
+            <w:tcMar>
+              <w:top w:type="dxa" w:w="90"/>
+              <w:left w:type="dxa" w:w="110"/>
+              <w:bottom w:type="dxa" w:w="90"/>
+              <w:right w:type="dxa" w:w="110"/>
+            </w:tcMar>
+            <w:vAlign w:val="top"/>
+          </w:tcPr>
+          <w:p>
+            <w:pPr>
+              <w:spacing w:after="30" w:before="0" w:line="220"/>
+            </w:pPr>
+            <w:r>
+              <w:rPr>
+                <w:rFonts w:ascii="Calibri" w:cs="Calibri" w:eastAsia="Calibri" w:hAnsi="Calibri"/>
+                <w:b w:val="false"/>
+                <w:bCs w:val="false"/>
+                <w:i w:val="false"/>
+                <w:iCs w:val="false"/>
+                <w:color w:val="44403C"/>
+                <w:sz w:val="15"/>
+                <w:szCs w:val="15"/>
+              </w:rPr>
+              <w:t xml:space="preserve">• Flat ₹251 off</w:t>
+            </w:r>
+          </w:p>
+          <w:p>
+            <w:pPr>
+              <w:spacing w:after="30" w:before="0" w:line="220"/>
+            </w:pPr>
+            <w:r>
+              <w:rPr>
+                <w:rFonts w:ascii="Calibri" w:cs="Calibri" w:eastAsia="Calibri" w:hAnsi="Calibri"/>
+                <w:b w:val="false"/>
+                <w:bCs w:val="false"/>
+                <w:i w:val="false"/>
+                <w:iCs w:val="false"/>
+                <w:color w:val="44403C"/>
+                <w:sz w:val="15"/>
+                <w:szCs w:val="15"/>
+              </w:rPr>
+              <w:t xml:space="preserve">• Min cart ₹1,999</w:t>
+            </w:r>
+          </w:p>
+          <w:p>
+            <w:pPr>
+              <w:spacing w:after="30" w:before="0" w:line="220"/>
+            </w:pPr>
+            <w:r>
+              <w:rPr>
+                <w:rFonts w:ascii="Calibri" w:cs="Calibri" w:eastAsia="Calibri" w:hAnsi="Calibri"/>
+                <w:b w:val="false"/>
+                <w:bCs w:val="false"/>
+                <w:i w:val="false"/>
+                <w:iCs w:val="false"/>
+                <w:color w:val="44403C"/>
+                <w:sz w:val="15"/>
+                <w:szCs w:val="15"/>
+              </w:rPr>
+              <w:t xml:space="preserve">• Code: LAKSHMI251</w:t>
+            </w:r>
+          </w:p>
+          <w:p>
+            <w:pPr>
+              <w:spacing w:after="30" w:before="0" w:line="220"/>
+            </w:pPr>
+            <w:r>
+              <w:rPr>
+                <w:rFonts w:ascii="Calibri" w:cs="Calibri" w:eastAsia="Calibri" w:hAnsi="Calibri"/>
+                <w:b w:val="false"/>
+                <w:bCs w:val="false"/>
+                <w:i w:val="false"/>
+                <w:iCs w:val="false"/>
+                <w:color w:val="44403C"/>
+                <w:sz w:val="15"/>
+                <w:szCs w:val="15"/>
+              </w:rPr>
+              <w:t xml:space="preserve">• ₹2,748 → ₹2,497</w:t>
+            </w:r>
+          </w:p>
+          <w:p>
+            <w:pPr>
+              <w:spacing w:after="30" w:before="0" w:line="220"/>
+            </w:pPr>
+            <w:r>
+              <w:rPr>
+                <w:rFonts w:ascii="Calibri" w:cs="Calibri" w:eastAsia="Calibri" w:hAnsi="Calibri"/>
+                <w:b w:val="false"/>
+                <w:bCs w:val="false"/>
+                <w:i w:val="false"/>
+                <w:iCs w:val="false"/>
+                <w:color w:val="44403C"/>
+                <w:sz w:val="15"/>
+                <w:szCs w:val="15"/>
+              </w:rPr>
+              <w:t xml:space="preserve">• The ₹1,999 floor forces a 2-item cart: you collect ₹2,497 instead of ₹1,249</w:t>
             </w:r>
           </w:p>
         </w:tc>
         <w:tc>
           <w:tcPr>
             <w:tcW w:type="dxa" w:w="3100"/>
-            <w:shd w:fill="F5F5F4" w:color="auto" w:val="clear"/>
-            <w:tcMar>
-              <w:top w:type="dxa" w:w="90"/>
-              <w:left w:type="dxa" w:w="110"/>
-              <w:bottom w:type="dxa" w:w="90"/>
-              <w:right w:type="dxa" w:w="110"/>
-            </w:tcMar>
-            <w:vAlign w:val="top"/>
-          </w:tcPr>
-          <w:p>
-            <w:pPr>
-              <w:spacing w:after="30" w:before="0" w:line="220"/>
-            </w:pPr>
-            <w:r>
-              <w:rPr>
-                <w:rFonts w:ascii="Calibri" w:cs="Calibri" w:eastAsia="Calibri" w:hAnsi="Calibri"/>
-                <w:b w:val="false"/>
-                <w:bCs w:val="false"/>
-                <w:i w:val="false"/>
-                <w:iCs w:val="false"/>
-                <w:color w:val="44403C"/>
-                <w:sz w:val="15"/>
-                <w:szCs w:val="15"/>
-              </w:rPr>
-              <w:t xml:space="preserve">• DYNAMIC: the exact product they viewed</w:t>
-            </w:r>
-          </w:p>
-          <w:p>
-            <w:pPr>
-              <w:spacing w:after="30" w:before="0" w:line="220"/>
-            </w:pPr>
-            <w:r>
-              <w:rPr>
-                <w:rFonts w:ascii="Calibri" w:cs="Calibri" w:eastAsia="Calibri" w:hAnsi="Calibri"/>
-                <w:b w:val="false"/>
-                <w:bCs w:val="false"/>
-                <w:i w:val="false"/>
-                <w:iCs w:val="false"/>
-                <w:color w:val="44403C"/>
-                <w:sz w:val="15"/>
-                <w:szCs w:val="15"/>
-              </w:rPr>
-              <w:t xml:space="preserve">• Detail crop — show the hand-work and silver finish</w:t>
-            </w:r>
-          </w:p>
-          <w:p>
-            <w:pPr>
-              <w:spacing w:after="30" w:before="0" w:line="220"/>
-            </w:pPr>
-            <w:r>
-              <w:rPr>
-                <w:rFonts w:ascii="Calibri" w:cs="Calibri" w:eastAsia="Calibri" w:hAnsi="Calibri"/>
-                <w:b w:val="false"/>
-                <w:bCs w:val="false"/>
-                <w:i w:val="false"/>
-                <w:iCs w:val="false"/>
-                <w:color w:val="44403C"/>
-                <w:sz w:val="15"/>
-                <w:szCs w:val="15"/>
-              </w:rPr>
-              <w:t xml:space="preserve">• Red "Only {{3}} left" badge, top-right, replacing the usual price badge</w:t>
-            </w:r>
-          </w:p>
-          <w:p>
-            <w:pPr>
-              <w:spacing w:after="30" w:before="0" w:line="220"/>
-            </w:pPr>
-            <w:r>
-              <w:rPr>
-                <w:rFonts w:ascii="Calibri" w:cs="Calibri" w:eastAsia="Calibri" w:hAnsi="Calibri"/>
-                <w:b w:val="false"/>
-                <w:bCs w:val="false"/>
-                <w:i w:val="false"/>
-                <w:iCs w:val="false"/>
-                <w:color w:val="44403C"/>
-                <w:sz w:val="15"/>
-                <w:szCs w:val="15"/>
-              </w:rPr>
-              <w:t xml:space="preserve">• No price on creative — scarcity is the whole message</w:t>
-            </w:r>
-          </w:p>
-          <w:p>
-            <w:pPr>
-              <w:spacing w:after="30" w:before="0" w:line="220"/>
-            </w:pPr>
-            <w:r>
-              <w:rPr>
-                <w:rFonts w:ascii="Calibri" w:cs="Calibri" w:eastAsia="Calibri" w:hAnsi="Calibri"/>
-                <w:b w:val="false"/>
-                <w:bCs w:val="false"/>
-                <w:i w:val="false"/>
-                <w:iCs w:val="false"/>
-                <w:color w:val="44403C"/>
-                <w:sz w:val="15"/>
-                <w:szCs w:val="15"/>
-              </w:rPr>
-              <w:t xml:space="preserve">• Alt version: product half-out of the velvet box, mid-unboxing</w:t>
+            <w:shd w:fill="FFFFFF" w:color="auto" w:val="clear"/>
+            <w:tcMar>
+              <w:top w:type="dxa" w:w="90"/>
+              <w:left w:type="dxa" w:w="110"/>
+              <w:bottom w:type="dxa" w:w="90"/>
+              <w:right w:type="dxa" w:w="110"/>
+            </w:tcMar>
+            <w:vAlign w:val="top"/>
+          </w:tcPr>
+          <w:p>
+            <w:pPr>
+              <w:spacing w:after="30" w:before="0" w:line="220"/>
+            </w:pPr>
+            <w:r>
+              <w:rPr>
+                <w:rFonts w:ascii="Calibri" w:cs="Calibri" w:eastAsia="Calibri" w:hAnsi="Calibri"/>
+                <w:b w:val="false"/>
+                <w:bCs w:val="false"/>
+                <w:i w:val="false"/>
+                <w:iCs w:val="false"/>
+                <w:color w:val="44403C"/>
+                <w:sz w:val="15"/>
+                <w:szCs w:val="15"/>
+              </w:rPr>
+              <w:t xml:space="preserve">• HERO SHOOT — Kuber Kalash + Lakshmi Charan photographed together as a pair</w:t>
+            </w:r>
+          </w:p>
+          <w:p>
+            <w:pPr>
+              <w:spacing w:after="30" w:before="0" w:line="220"/>
+            </w:pPr>
+            <w:r>
+              <w:rPr>
+                <w:rFonts w:ascii="Calibri" w:cs="Calibri" w:eastAsia="Calibri" w:hAnsi="Calibri"/>
+                <w:b w:val="false"/>
+                <w:bCs w:val="false"/>
+                <w:i w:val="false"/>
+                <w:iCs w:val="false"/>
+                <w:color w:val="44403C"/>
+                <w:sz w:val="15"/>
+                <w:szCs w:val="15"/>
+              </w:rPr>
+              <w:t xml:space="preserve">• House template: wooden base, dark green backdrop, jute mat, 999 SILVER PLATED badge</w:t>
+            </w:r>
+          </w:p>
+          <w:p>
+            <w:pPr>
+              <w:spacing w:after="30" w:before="0" w:line="220"/>
+            </w:pPr>
+            <w:r>
+              <w:rPr>
+                <w:rFonts w:ascii="Calibri" w:cs="Calibri" w:eastAsia="Calibri" w:hAnsi="Calibri"/>
+                <w:b w:val="false"/>
+                <w:bCs w:val="false"/>
+                <w:i w:val="false"/>
+                <w:iCs w:val="false"/>
+                <w:color w:val="44403C"/>
+                <w:sz w:val="15"/>
+                <w:szCs w:val="15"/>
+              </w:rPr>
+              <w:t xml:space="preserve">• Marigold garland and one lit diya at the edge</w:t>
+            </w:r>
+          </w:p>
+          <w:p>
+            <w:pPr>
+              <w:spacing w:after="30" w:before="0" w:line="220"/>
+            </w:pPr>
+            <w:r>
+              <w:rPr>
+                <w:rFonts w:ascii="Calibri" w:cs="Calibri" w:eastAsia="Calibri" w:hAnsi="Calibri"/>
+                <w:b w:val="false"/>
+                <w:bCs w:val="false"/>
+                <w:i w:val="false"/>
+                <w:iCs w:val="false"/>
+                <w:color w:val="44403C"/>
+                <w:sz w:val="15"/>
+                <w:szCs w:val="15"/>
+              </w:rPr>
+              <w:t xml:space="preserve">• Price lockup bottom-right: ₹2,748 struck through, ₹2,497 in saffron</w:t>
+            </w:r>
+          </w:p>
+          <w:p>
+            <w:pPr>
+              <w:spacing w:after="30" w:before="0" w:line="220"/>
+            </w:pPr>
+            <w:r>
+              <w:rPr>
+                <w:rFonts w:ascii="Calibri" w:cs="Calibri" w:eastAsia="Calibri" w:hAnsi="Calibri"/>
+                <w:b w:val="false"/>
+                <w:bCs w:val="false"/>
+                <w:i w:val="false"/>
+                <w:iCs w:val="false"/>
+                <w:color w:val="44403C"/>
+                <w:sz w:val="15"/>
+                <w:szCs w:val="15"/>
+              </w:rPr>
+              <w:t xml:space="preserve">• Highest-value new creative in the pack — shoot this one first</w:t>
             </w:r>
           </w:p>
         </w:tc>
         <w:tc>
           <w:tcPr>
             <w:tcW w:type="dxa" w:w="1680"/>
-            <w:shd w:fill="F5F5F4" w:color="auto" w:val="clear"/>
+            <w:shd w:fill="FFFFFF" w:color="auto" w:val="clear"/>
             <w:tcMar>
               <w:top w:type="dxa" w:w="90"/>
               <w:left w:type="dxa" w:w="110"/>
@@ -2597,7 +2181,7 @@
                 <w:sz w:val="16"/>
                 <w:szCs w:val="16"/>
               </w:rPr>
-              <w:t xml:space="preserve">▸ See Details</w:t>
+              <w:t xml:space="preserve">▸ Explore Collection</w:t>
             </w:r>
           </w:p>
         </w:tc>
@@ -2609,7 +2193,7 @@
         <w:tc>
           <w:tcPr>
             <w:tcW w:type="dxa" w:w="520"/>
-            <w:shd w:fill="FFFFFF" w:color="auto" w:val="clear"/>
+            <w:shd w:fill="F5F5F4" w:color="auto" w:val="clear"/>
             <w:tcMar>
               <w:top w:type="dxa" w:w="90"/>
               <w:left w:type="dxa" w:w="110"/>
@@ -2634,14 +2218,14 @@
                 <w:sz w:val="22"/>
                 <w:szCs w:val="22"/>
               </w:rPr>
-              <w:t xml:space="preserve">3</w:t>
+              <w:t xml:space="preserve">2</w:t>
             </w:r>
           </w:p>
         </w:tc>
         <w:tc>
           <w:tcPr>
             <w:tcW w:type="dxa" w:w="2000"/>
-            <w:shd w:fill="FFFFFF" w:color="auto" w:val="clear"/>
+            <w:shd w:fill="F5F5F4" w:color="auto" w:val="clear"/>
             <w:tcMar>
               <w:top w:type="dxa" w:w="90"/>
               <w:left w:type="dxa" w:w="110"/>
@@ -2701,14 +2285,14 @@
                 <w:sz w:val="16"/>
                 <w:szCs w:val="16"/>
               </w:rPr>
-              <w:t xml:space="preserve">25 Sep · 6:30 PM</w:t>
+              <w:t xml:space="preserve">SEND  25 Sep · 6:30 PM</w:t>
             </w:r>
           </w:p>
         </w:tc>
         <w:tc>
           <w:tcPr>
             <w:tcW w:type="dxa" w:w="5200"/>
-            <w:shd w:fill="FFFFFF" w:color="auto" w:val="clear"/>
+            <w:shd w:fill="F5F5F4" w:color="auto" w:val="clear"/>
             <w:tcMar>
               <w:top w:type="dxa" w:w="90"/>
               <w:left w:type="dxa" w:w="110"/>
@@ -2937,7 +2521,7 @@
         <w:tc>
           <w:tcPr>
             <w:tcW w:type="dxa" w:w="1900"/>
-            <w:shd w:fill="FFFFFF" w:color="auto" w:val="clear"/>
+            <w:shd w:fill="F5F5F4" w:color="auto" w:val="clear"/>
             <w:tcMar>
               <w:top w:type="dxa" w:w="90"/>
               <w:left w:type="dxa" w:w="110"/>
@@ -3040,7 +2624,7 @@
         <w:tc>
           <w:tcPr>
             <w:tcW w:type="dxa" w:w="3100"/>
-            <w:shd w:fill="FFFFFF" w:color="auto" w:val="clear"/>
+            <w:shd w:fill="F5F5F4" w:color="auto" w:val="clear"/>
             <w:tcMar>
               <w:top w:type="dxa" w:w="90"/>
               <w:left w:type="dxa" w:w="110"/>
@@ -3143,7 +2727,7 @@
         <w:tc>
           <w:tcPr>
             <w:tcW w:type="dxa" w:w="1680"/>
-            <w:shd w:fill="FFFFFF" w:color="auto" w:val="clear"/>
+            <w:shd w:fill="F5F5F4" w:color="auto" w:val="clear"/>
             <w:tcMar>
               <w:top w:type="dxa" w:w="90"/>
               <w:left w:type="dxa" w:w="110"/>
@@ -3197,7 +2781,7 @@
         <w:tc>
           <w:tcPr>
             <w:tcW w:type="dxa" w:w="520"/>
-            <w:shd w:fill="F5F5F4" w:color="auto" w:val="clear"/>
+            <w:shd w:fill="FFFFFF" w:color="auto" w:val="clear"/>
             <w:tcMar>
               <w:top w:type="dxa" w:w="90"/>
               <w:left w:type="dxa" w:w="110"/>
@@ -3222,14 +2806,14 @@
                 <w:sz w:val="22"/>
                 <w:szCs w:val="22"/>
               </w:rPr>
-              <w:t xml:space="preserve">4</w:t>
+              <w:t xml:space="preserve">3</w:t>
             </w:r>
           </w:p>
         </w:tc>
         <w:tc>
           <w:tcPr>
             <w:tcW w:type="dxa" w:w="2000"/>
-            <w:shd w:fill="F5F5F4" w:color="auto" w:val="clear"/>
+            <w:shd w:fill="FFFFFF" w:color="auto" w:val="clear"/>
             <w:tcMar>
               <w:top w:type="dxa" w:w="90"/>
               <w:left w:type="dxa" w:w="110"/>
@@ -3253,7 +2837,7 @@
                 <w:sz w:val="18"/>
                 <w:szCs w:val="18"/>
               </w:rPr>
-              <w:t xml:space="preserve">PDP Visit 15–30 Days</w:t>
+              <w:t xml:space="preserve">PDP Visit 2–7 Days</w:t>
             </w:r>
           </w:p>
           <w:p>
@@ -3271,7 +2855,7 @@
                 <w:sz w:val="15"/>
                 <w:szCs w:val="15"/>
               </w:rPr>
-              <w:t xml:space="preserve">6,003 contacts — largest</w:t>
+              <w:t xml:space="preserve">4,417 contacts</w:t>
             </w:r>
           </w:p>
           <w:p>
@@ -3289,14 +2873,14 @@
                 <w:sz w:val="16"/>
                 <w:szCs w:val="16"/>
               </w:rPr>
-              <w:t xml:space="preserve">26 Sep · 12:00 PM</w:t>
+              <w:t xml:space="preserve">SEND  25 Sep · 11:00 AM</w:t>
             </w:r>
           </w:p>
         </w:tc>
         <w:tc>
           <w:tcPr>
             <w:tcW w:type="dxa" w:w="5200"/>
-            <w:shd w:fill="F5F5F4" w:color="auto" w:val="clear"/>
+            <w:shd w:fill="FFFFFF" w:color="auto" w:val="clear"/>
             <w:tcMar>
               <w:top w:type="dxa" w:w="90"/>
               <w:left w:type="dxa" w:w="110"/>
@@ -3320,7 +2904,7 @@
                 <w:sz w:val="17"/>
                 <w:szCs w:val="17"/>
               </w:rPr>
-              <w:t xml:space="preserve">{{1}}, Bappa's visarjan is done. Now the *Kalash* is filled 🪔</w:t>
+              <w:t xml:space="preserve">{{1}}, you were looking at *{{2}}* 👀</w:t>
             </w:r>
           </w:p>
           <w:p>
@@ -3356,7 +2940,7 @@
                 <w:sz w:val="17"/>
                 <w:szCs w:val="17"/>
               </w:rPr>
-              <w:t xml:space="preserve">Kuber is the treasurer of the gods — his kalash is the vessel Lakshmi fills first.</w:t>
+              <w:t xml:space="preserve">Only *{{3}} pieces* left in this size.</w:t>
             </w:r>
           </w:p>
           <w:p>
@@ -3392,7 +2976,7 @@
                 <w:sz w:val="17"/>
                 <w:szCs w:val="17"/>
               </w:rPr>
-              <w:t xml:space="preserve">999 Silver Plated · *₹1,249*</w:t>
+              <w:t xml:space="preserve">Order by tomorrow and it reaches you before *Shraddh* 🎁</w:t>
             </w:r>
           </w:p>
           <w:p>
@@ -3402,15 +2986,15 @@
             <w:r>
               <w:rPr>
                 <w:rFonts w:ascii="Calibri" w:cs="Calibri" w:eastAsia="Calibri" w:hAnsi="Calibri"/>
-                <w:b/>
-                <w:bCs/>
-                <w:i w:val="false"/>
-                <w:iCs w:val="false"/>
-                <w:color w:val="1C1917"/>
-                <w:sz w:val="17"/>
-                <w:szCs w:val="17"/>
-              </w:rPr>
-              <w:t xml:space="preserve">🏆 Our most-ordered murti this month</w:t>
+                <w:b w:val="false"/>
+                <w:bCs w:val="false"/>
+                <w:i w:val="false"/>
+                <w:iCs w:val="false"/>
+                <w:color w:val="1C1917"/>
+                <w:sz w:val="17"/>
+                <w:szCs w:val="17"/>
+              </w:rPr>
+              <w:t xml:space="preserve">Free velvet gift box + priority dispatch today</w:t>
             </w:r>
           </w:p>
           <w:p>
@@ -3446,7 +3030,25 @@
                 <w:sz w:val="17"/>
                 <w:szCs w:val="17"/>
               </w:rPr>
-              <w:t xml:space="preserve">Add a Lakshmi Charan (₹1,499) → ₹2,748</w:t>
+              <w:t xml:space="preserve">⌛ After 27 Sep, sthapana waits till Navratri — 11 Oct !!</w:t>
+            </w:r>
+          </w:p>
+          <w:p>
+            <w:pPr>
+              <w:spacing w:after="0" w:before="0" w:line="120"/>
+            </w:pPr>
+            <w:r>
+              <w:rPr>
+                <w:rFonts w:ascii="Calibri" w:cs="Calibri" w:eastAsia="Calibri" w:hAnsi="Calibri"/>
+                <w:b w:val="false"/>
+                <w:bCs w:val="false"/>
+                <w:i w:val="false"/>
+                <w:iCs w:val="false"/>
+                <w:color w:val="1C1917"/>
+                <w:sz w:val="17"/>
+                <w:szCs w:val="17"/>
+              </w:rPr>
+              <w:t xml:space="preserve"/>
             </w:r>
           </w:p>
           <w:p>
@@ -3464,25 +3066,7 @@
                 <w:sz w:val="17"/>
                 <w:szCs w:val="17"/>
               </w:rPr>
-              <w:t xml:space="preserve">Flat *₹251 off* with Coupon Code *LAKSHMI251* → *₹2,497* 🎁</w:t>
-            </w:r>
-          </w:p>
-          <w:p>
-            <w:pPr>
-              <w:spacing w:after="0" w:before="0" w:line="120"/>
-            </w:pPr>
-            <w:r>
-              <w:rPr>
-                <w:rFonts w:ascii="Calibri" w:cs="Calibri" w:eastAsia="Calibri" w:hAnsi="Calibri"/>
-                <w:b w:val="false"/>
-                <w:bCs w:val="false"/>
-                <w:i w:val="false"/>
-                <w:iCs w:val="false"/>
-                <w:color w:val="1C1917"/>
-                <w:sz w:val="17"/>
-                <w:szCs w:val="17"/>
-              </w:rPr>
-              <w:t xml:space="preserve"/>
+              <w:t xml:space="preserve">"May the murti you chose find its place in your mandir 🙏"</w:t>
             </w:r>
           </w:p>
           <w:p>
@@ -3500,60 +3084,6 @@
                 <w:sz w:val="17"/>
                 <w:szCs w:val="17"/>
               </w:rPr>
-              <w:t xml:space="preserve">⌛ Ends tonight — Shraddh starts tomorrow !!</w:t>
-            </w:r>
-          </w:p>
-          <w:p>
-            <w:pPr>
-              <w:spacing w:after="0" w:before="0" w:line="120"/>
-            </w:pPr>
-            <w:r>
-              <w:rPr>
-                <w:rFonts w:ascii="Calibri" w:cs="Calibri" w:eastAsia="Calibri" w:hAnsi="Calibri"/>
-                <w:b w:val="false"/>
-                <w:bCs w:val="false"/>
-                <w:i w:val="false"/>
-                <w:iCs w:val="false"/>
-                <w:color w:val="1C1917"/>
-                <w:sz w:val="17"/>
-                <w:szCs w:val="17"/>
-              </w:rPr>
-              <w:t xml:space="preserve"/>
-            </w:r>
-          </w:p>
-          <w:p>
-            <w:pPr>
-              <w:spacing w:after="0" w:before="0" w:line="230"/>
-            </w:pPr>
-            <w:r>
-              <w:rPr>
-                <w:rFonts w:ascii="Calibri" w:cs="Calibri" w:eastAsia="Calibri" w:hAnsi="Calibri"/>
-                <w:b w:val="false"/>
-                <w:bCs w:val="false"/>
-                <w:i w:val="false"/>
-                <w:iCs w:val="false"/>
-                <w:color w:val="1C1917"/>
-                <w:sz w:val="17"/>
-                <w:szCs w:val="17"/>
-              </w:rPr>
-              <w:t xml:space="preserve">"May Kuber fill your kalash and Lakshmi never leave your door 🙏"</w:t>
-            </w:r>
-          </w:p>
-          <w:p>
-            <w:pPr>
-              <w:spacing w:after="0" w:before="0" w:line="230"/>
-            </w:pPr>
-            <w:r>
-              <w:rPr>
-                <w:rFonts w:ascii="Calibri" w:cs="Calibri" w:eastAsia="Calibri" w:hAnsi="Calibri"/>
-                <w:b w:val="false"/>
-                <w:bCs w:val="false"/>
-                <w:i w:val="false"/>
-                <w:iCs w:val="false"/>
-                <w:color w:val="1C1917"/>
-                <w:sz w:val="17"/>
-                <w:szCs w:val="17"/>
-              </w:rPr>
               <w:t xml:space="preserve">— Dev Aastha</w:t>
             </w:r>
           </w:p>
@@ -3561,213 +3091,195 @@
         <w:tc>
           <w:tcPr>
             <w:tcW w:type="dxa" w:w="1900"/>
-            <w:shd w:fill="F5F5F4" w:color="auto" w:val="clear"/>
-            <w:tcMar>
-              <w:top w:type="dxa" w:w="90"/>
-              <w:left w:type="dxa" w:w="110"/>
-              <w:bottom w:type="dxa" w:w="90"/>
-              <w:right w:type="dxa" w:w="110"/>
-            </w:tcMar>
-            <w:vAlign w:val="top"/>
-          </w:tcPr>
-          <w:p>
-            <w:pPr>
-              <w:spacing w:after="30" w:before="0" w:line="220"/>
-            </w:pPr>
-            <w:r>
-              <w:rPr>
-                <w:rFonts w:ascii="Calibri" w:cs="Calibri" w:eastAsia="Calibri" w:hAnsi="Calibri"/>
-                <w:b w:val="false"/>
-                <w:bCs w:val="false"/>
-                <w:i w:val="false"/>
-                <w:iCs w:val="false"/>
-                <w:color w:val="44403C"/>
-                <w:sz w:val="15"/>
-                <w:szCs w:val="15"/>
-              </w:rPr>
-              <w:t xml:space="preserve">• Flat ₹251 off</w:t>
-            </w:r>
-          </w:p>
-          <w:p>
-            <w:pPr>
-              <w:spacing w:after="30" w:before="0" w:line="220"/>
-            </w:pPr>
-            <w:r>
-              <w:rPr>
-                <w:rFonts w:ascii="Calibri" w:cs="Calibri" w:eastAsia="Calibri" w:hAnsi="Calibri"/>
-                <w:b w:val="false"/>
-                <w:bCs w:val="false"/>
-                <w:i w:val="false"/>
-                <w:iCs w:val="false"/>
-                <w:color w:val="44403C"/>
-                <w:sz w:val="15"/>
-                <w:szCs w:val="15"/>
-              </w:rPr>
-              <w:t xml:space="preserve">• Min cart ₹1,999</w:t>
-            </w:r>
-          </w:p>
-          <w:p>
-            <w:pPr>
-              <w:spacing w:after="30" w:before="0" w:line="220"/>
-            </w:pPr>
-            <w:r>
-              <w:rPr>
-                <w:rFonts w:ascii="Calibri" w:cs="Calibri" w:eastAsia="Calibri" w:hAnsi="Calibri"/>
-                <w:b w:val="false"/>
-                <w:bCs w:val="false"/>
-                <w:i w:val="false"/>
-                <w:iCs w:val="false"/>
-                <w:color w:val="44403C"/>
-                <w:sz w:val="15"/>
-                <w:szCs w:val="15"/>
-              </w:rPr>
-              <w:t xml:space="preserve">• Code: LAKSHMI251</w:t>
-            </w:r>
-          </w:p>
-          <w:p>
-            <w:pPr>
-              <w:spacing w:after="30" w:before="0" w:line="220"/>
-            </w:pPr>
-            <w:r>
-              <w:rPr>
-                <w:rFonts w:ascii="Calibri" w:cs="Calibri" w:eastAsia="Calibri" w:hAnsi="Calibri"/>
-                <w:b w:val="false"/>
-                <w:bCs w:val="false"/>
-                <w:i w:val="false"/>
-                <w:iCs w:val="false"/>
-                <w:color w:val="44403C"/>
-                <w:sz w:val="15"/>
-                <w:szCs w:val="15"/>
-              </w:rPr>
-              <w:t xml:space="preserve">• ₹2,748 → ₹2,497</w:t>
-            </w:r>
-          </w:p>
-          <w:p>
-            <w:pPr>
-              <w:spacing w:after="30" w:before="0" w:line="220"/>
-            </w:pPr>
-            <w:r>
-              <w:rPr>
-                <w:rFonts w:ascii="Calibri" w:cs="Calibri" w:eastAsia="Calibri" w:hAnsi="Calibri"/>
-                <w:b w:val="false"/>
-                <w:bCs w:val="false"/>
-                <w:i w:val="false"/>
-                <w:iCs w:val="false"/>
-                <w:color w:val="44403C"/>
-                <w:sz w:val="15"/>
-                <w:szCs w:val="15"/>
-              </w:rPr>
-              <w:t xml:space="preserve">• The ₹1,999 floor forces a 2-item cart: you collect ₹2,497 instead of ₹1,249</w:t>
+            <w:shd w:fill="FFFFFF" w:color="auto" w:val="clear"/>
+            <w:tcMar>
+              <w:top w:type="dxa" w:w="90"/>
+              <w:left w:type="dxa" w:w="110"/>
+              <w:bottom w:type="dxa" w:w="90"/>
+              <w:right w:type="dxa" w:w="110"/>
+            </w:tcMar>
+            <w:vAlign w:val="top"/>
+          </w:tcPr>
+          <w:p>
+            <w:pPr>
+              <w:spacing w:after="30" w:before="0" w:line="220"/>
+            </w:pPr>
+            <w:r>
+              <w:rPr>
+                <w:rFonts w:ascii="Calibri" w:cs="Calibri" w:eastAsia="Calibri" w:hAnsi="Calibri"/>
+                <w:b w:val="false"/>
+                <w:bCs w:val="false"/>
+                <w:i w:val="false"/>
+                <w:iCs w:val="false"/>
+                <w:color w:val="44403C"/>
+                <w:sz w:val="15"/>
+                <w:szCs w:val="15"/>
+              </w:rPr>
+              <w:t xml:space="preserve">• NO DISCOUNT — deliberate</w:t>
+            </w:r>
+          </w:p>
+          <w:p>
+            <w:pPr>
+              <w:spacing w:after="30" w:before="0" w:line="220"/>
+            </w:pPr>
+            <w:r>
+              <w:rPr>
+                <w:rFonts w:ascii="Calibri" w:cs="Calibri" w:eastAsia="Calibri" w:hAnsi="Calibri"/>
+                <w:b w:val="false"/>
+                <w:bCs w:val="false"/>
+                <w:i w:val="false"/>
+                <w:iCs w:val="false"/>
+                <w:color w:val="44403C"/>
+                <w:sz w:val="15"/>
+                <w:szCs w:val="15"/>
+              </w:rPr>
+              <w:t xml:space="preserve">• Free velvet gift box</w:t>
+            </w:r>
+          </w:p>
+          <w:p>
+            <w:pPr>
+              <w:spacing w:after="30" w:before="0" w:line="220"/>
+            </w:pPr>
+            <w:r>
+              <w:rPr>
+                <w:rFonts w:ascii="Calibri" w:cs="Calibri" w:eastAsia="Calibri" w:hAnsi="Calibri"/>
+                <w:b w:val="false"/>
+                <w:bCs w:val="false"/>
+                <w:i w:val="false"/>
+                <w:iCs w:val="false"/>
+                <w:color w:val="44403C"/>
+                <w:sz w:val="15"/>
+                <w:szCs w:val="15"/>
+              </w:rPr>
+              <w:t xml:space="preserve">• Priority dispatch today</w:t>
+            </w:r>
+          </w:p>
+          <w:p>
+            <w:pPr>
+              <w:spacing w:after="30" w:before="0" w:line="220"/>
+            </w:pPr>
+            <w:r>
+              <w:rPr>
+                <w:rFonts w:ascii="Calibri" w:cs="Calibri" w:eastAsia="Calibri" w:hAnsi="Calibri"/>
+                <w:b w:val="false"/>
+                <w:bCs w:val="false"/>
+                <w:i w:val="false"/>
+                <w:iCs w:val="false"/>
+                <w:color w:val="44403C"/>
+                <w:sz w:val="15"/>
+                <w:szCs w:val="15"/>
+              </w:rPr>
+              <w:t xml:space="preserve">• Hottest cohort; discounting here is margin donation</w:t>
             </w:r>
           </w:p>
         </w:tc>
         <w:tc>
           <w:tcPr>
             <w:tcW w:type="dxa" w:w="3100"/>
-            <w:shd w:fill="F5F5F4" w:color="auto" w:val="clear"/>
-            <w:tcMar>
-              <w:top w:type="dxa" w:w="90"/>
-              <w:left w:type="dxa" w:w="110"/>
-              <w:bottom w:type="dxa" w:w="90"/>
-              <w:right w:type="dxa" w:w="110"/>
-            </w:tcMar>
-            <w:vAlign w:val="top"/>
-          </w:tcPr>
-          <w:p>
-            <w:pPr>
-              <w:spacing w:after="30" w:before="0" w:line="220"/>
-            </w:pPr>
-            <w:r>
-              <w:rPr>
-                <w:rFonts w:ascii="Calibri" w:cs="Calibri" w:eastAsia="Calibri" w:hAnsi="Calibri"/>
-                <w:b w:val="false"/>
-                <w:bCs w:val="false"/>
-                <w:i w:val="false"/>
-                <w:iCs w:val="false"/>
-                <w:color w:val="44403C"/>
-                <w:sz w:val="15"/>
-                <w:szCs w:val="15"/>
-              </w:rPr>
-              <w:t xml:space="preserve">• HERO SHOOT — Kuber Kalash + Lakshmi Charan photographed together as a pair</w:t>
-            </w:r>
-          </w:p>
-          <w:p>
-            <w:pPr>
-              <w:spacing w:after="30" w:before="0" w:line="220"/>
-            </w:pPr>
-            <w:r>
-              <w:rPr>
-                <w:rFonts w:ascii="Calibri" w:cs="Calibri" w:eastAsia="Calibri" w:hAnsi="Calibri"/>
-                <w:b w:val="false"/>
-                <w:bCs w:val="false"/>
-                <w:i w:val="false"/>
-                <w:iCs w:val="false"/>
-                <w:color w:val="44403C"/>
-                <w:sz w:val="15"/>
-                <w:szCs w:val="15"/>
-              </w:rPr>
-              <w:t xml:space="preserve">• House template: wooden base, dark green backdrop, jute mat, 999 SILVER PLATED badge</w:t>
-            </w:r>
-          </w:p>
-          <w:p>
-            <w:pPr>
-              <w:spacing w:after="30" w:before="0" w:line="220"/>
-            </w:pPr>
-            <w:r>
-              <w:rPr>
-                <w:rFonts w:ascii="Calibri" w:cs="Calibri" w:eastAsia="Calibri" w:hAnsi="Calibri"/>
-                <w:b w:val="false"/>
-                <w:bCs w:val="false"/>
-                <w:i w:val="false"/>
-                <w:iCs w:val="false"/>
-                <w:color w:val="44403C"/>
-                <w:sz w:val="15"/>
-                <w:szCs w:val="15"/>
-              </w:rPr>
-              <w:t xml:space="preserve">• Marigold garland and one lit diya at the edge</w:t>
-            </w:r>
-          </w:p>
-          <w:p>
-            <w:pPr>
-              <w:spacing w:after="30" w:before="0" w:line="220"/>
-            </w:pPr>
-            <w:r>
-              <w:rPr>
-                <w:rFonts w:ascii="Calibri" w:cs="Calibri" w:eastAsia="Calibri" w:hAnsi="Calibri"/>
-                <w:b w:val="false"/>
-                <w:bCs w:val="false"/>
-                <w:i w:val="false"/>
-                <w:iCs w:val="false"/>
-                <w:color w:val="44403C"/>
-                <w:sz w:val="15"/>
-                <w:szCs w:val="15"/>
-              </w:rPr>
-              <w:t xml:space="preserve">• Price lockup bottom-right: ₹2,748 struck through, ₹2,497 in saffron</w:t>
-            </w:r>
-          </w:p>
-          <w:p>
-            <w:pPr>
-              <w:spacing w:after="30" w:before="0" w:line="220"/>
-            </w:pPr>
-            <w:r>
-              <w:rPr>
-                <w:rFonts w:ascii="Calibri" w:cs="Calibri" w:eastAsia="Calibri" w:hAnsi="Calibri"/>
-                <w:b w:val="false"/>
-                <w:bCs w:val="false"/>
-                <w:i w:val="false"/>
-                <w:iCs w:val="false"/>
-                <w:color w:val="44403C"/>
-                <w:sz w:val="15"/>
-                <w:szCs w:val="15"/>
-              </w:rPr>
-              <w:t xml:space="preserve">• Highest-value new creative in the pack — shoot this one first</w:t>
+            <w:shd w:fill="FFFFFF" w:color="auto" w:val="clear"/>
+            <w:tcMar>
+              <w:top w:type="dxa" w:w="90"/>
+              <w:left w:type="dxa" w:w="110"/>
+              <w:bottom w:type="dxa" w:w="90"/>
+              <w:right w:type="dxa" w:w="110"/>
+            </w:tcMar>
+            <w:vAlign w:val="top"/>
+          </w:tcPr>
+          <w:p>
+            <w:pPr>
+              <w:spacing w:after="30" w:before="0" w:line="220"/>
+            </w:pPr>
+            <w:r>
+              <w:rPr>
+                <w:rFonts w:ascii="Calibri" w:cs="Calibri" w:eastAsia="Calibri" w:hAnsi="Calibri"/>
+                <w:b w:val="false"/>
+                <w:bCs w:val="false"/>
+                <w:i w:val="false"/>
+                <w:iCs w:val="false"/>
+                <w:color w:val="44403C"/>
+                <w:sz w:val="15"/>
+                <w:szCs w:val="15"/>
+              </w:rPr>
+              <w:t xml:space="preserve">• DYNAMIC: the exact product they viewed</w:t>
+            </w:r>
+          </w:p>
+          <w:p>
+            <w:pPr>
+              <w:spacing w:after="30" w:before="0" w:line="220"/>
+            </w:pPr>
+            <w:r>
+              <w:rPr>
+                <w:rFonts w:ascii="Calibri" w:cs="Calibri" w:eastAsia="Calibri" w:hAnsi="Calibri"/>
+                <w:b w:val="false"/>
+                <w:bCs w:val="false"/>
+                <w:i w:val="false"/>
+                <w:iCs w:val="false"/>
+                <w:color w:val="44403C"/>
+                <w:sz w:val="15"/>
+                <w:szCs w:val="15"/>
+              </w:rPr>
+              <w:t xml:space="preserve">• Detail crop — show the hand-work and silver finish</w:t>
+            </w:r>
+          </w:p>
+          <w:p>
+            <w:pPr>
+              <w:spacing w:after="30" w:before="0" w:line="220"/>
+            </w:pPr>
+            <w:r>
+              <w:rPr>
+                <w:rFonts w:ascii="Calibri" w:cs="Calibri" w:eastAsia="Calibri" w:hAnsi="Calibri"/>
+                <w:b w:val="false"/>
+                <w:bCs w:val="false"/>
+                <w:i w:val="false"/>
+                <w:iCs w:val="false"/>
+                <w:color w:val="44403C"/>
+                <w:sz w:val="15"/>
+                <w:szCs w:val="15"/>
+              </w:rPr>
+              <w:t xml:space="preserve">• Red "Only {{3}} left" badge, top-right, replacing the usual price badge</w:t>
+            </w:r>
+          </w:p>
+          <w:p>
+            <w:pPr>
+              <w:spacing w:after="30" w:before="0" w:line="220"/>
+            </w:pPr>
+            <w:r>
+              <w:rPr>
+                <w:rFonts w:ascii="Calibri" w:cs="Calibri" w:eastAsia="Calibri" w:hAnsi="Calibri"/>
+                <w:b w:val="false"/>
+                <w:bCs w:val="false"/>
+                <w:i w:val="false"/>
+                <w:iCs w:val="false"/>
+                <w:color w:val="44403C"/>
+                <w:sz w:val="15"/>
+                <w:szCs w:val="15"/>
+              </w:rPr>
+              <w:t xml:space="preserve">• No price on creative — scarcity is the whole message</w:t>
+            </w:r>
+          </w:p>
+          <w:p>
+            <w:pPr>
+              <w:spacing w:after="30" w:before="0" w:line="220"/>
+            </w:pPr>
+            <w:r>
+              <w:rPr>
+                <w:rFonts w:ascii="Calibri" w:cs="Calibri" w:eastAsia="Calibri" w:hAnsi="Calibri"/>
+                <w:b w:val="false"/>
+                <w:bCs w:val="false"/>
+                <w:i w:val="false"/>
+                <w:iCs w:val="false"/>
+                <w:color w:val="44403C"/>
+                <w:sz w:val="15"/>
+                <w:szCs w:val="15"/>
+              </w:rPr>
+              <w:t xml:space="preserve">• Alt version: product half-out of the velvet box, mid-unboxing</w:t>
             </w:r>
           </w:p>
         </w:tc>
         <w:tc>
           <w:tcPr>
             <w:tcW w:type="dxa" w:w="1680"/>
-            <w:shd w:fill="F5F5F4" w:color="auto" w:val="clear"/>
+            <w:shd w:fill="FFFFFF" w:color="auto" w:val="clear"/>
             <w:tcMar>
               <w:top w:type="dxa" w:w="90"/>
               <w:left w:type="dxa" w:w="110"/>
@@ -3809,7 +3321,7 @@
                 <w:sz w:val="16"/>
                 <w:szCs w:val="16"/>
               </w:rPr>
-              <w:t xml:space="preserve">▸ Explore Collection</w:t>
+              <w:t xml:space="preserve">▸ See Details</w:t>
             </w:r>
           </w:p>
         </w:tc>
@@ -3821,7 +3333,7 @@
         <w:tc>
           <w:tcPr>
             <w:tcW w:type="dxa" w:w="520"/>
-            <w:shd w:fill="FFFFFF" w:color="auto" w:val="clear"/>
+            <w:shd w:fill="F5F5F4" w:color="auto" w:val="clear"/>
             <w:tcMar>
               <w:top w:type="dxa" w:w="90"/>
               <w:left w:type="dxa" w:w="110"/>
@@ -3846,14 +3358,14 @@
                 <w:sz w:val="22"/>
                 <w:szCs w:val="22"/>
               </w:rPr>
-              <w:t xml:space="preserve">5</w:t>
+              <w:t xml:space="preserve">4</w:t>
             </w:r>
           </w:p>
         </w:tc>
         <w:tc>
           <w:tcPr>
             <w:tcW w:type="dxa" w:w="2000"/>
-            <w:shd w:fill="FFFFFF" w:color="auto" w:val="clear"/>
+            <w:shd w:fill="F5F5F4" w:color="auto" w:val="clear"/>
             <w:tcMar>
               <w:top w:type="dxa" w:w="90"/>
               <w:left w:type="dxa" w:w="110"/>
@@ -3913,14 +3425,14 @@
                 <w:sz w:val="16"/>
                 <w:szCs w:val="16"/>
               </w:rPr>
-              <w:t xml:space="preserve">26 Sep · 5:00 PM</w:t>
+              <w:t xml:space="preserve">SEND  26 Sep · 5:00 PM</w:t>
             </w:r>
           </w:p>
         </w:tc>
         <w:tc>
           <w:tcPr>
             <w:tcW w:type="dxa" w:w="5200"/>
-            <w:shd w:fill="FFFFFF" w:color="auto" w:val="clear"/>
+            <w:shd w:fill="F5F5F4" w:color="auto" w:val="clear"/>
             <w:tcMar>
               <w:top w:type="dxa" w:w="90"/>
               <w:left w:type="dxa" w:w="110"/>
@@ -4149,7 +3661,7 @@
         <w:tc>
           <w:tcPr>
             <w:tcW w:type="dxa" w:w="1900"/>
-            <w:shd w:fill="FFFFFF" w:color="auto" w:val="clear"/>
+            <w:shd w:fill="F5F5F4" w:color="auto" w:val="clear"/>
             <w:tcMar>
               <w:top w:type="dxa" w:w="90"/>
               <w:left w:type="dxa" w:w="110"/>
@@ -4252,7 +3764,7 @@
         <w:tc>
           <w:tcPr>
             <w:tcW w:type="dxa" w:w="3100"/>
-            <w:shd w:fill="FFFFFF" w:color="auto" w:val="clear"/>
+            <w:shd w:fill="F5F5F4" w:color="auto" w:val="clear"/>
             <w:tcMar>
               <w:top w:type="dxa" w:w="90"/>
               <w:left w:type="dxa" w:w="110"/>
@@ -4355,7 +3867,7 @@
         <w:tc>
           <w:tcPr>
             <w:tcW w:type="dxa" w:w="1680"/>
-            <w:shd w:fill="FFFFFF" w:color="auto" w:val="clear"/>
+            <w:shd w:fill="F5F5F4" w:color="auto" w:val="clear"/>
             <w:tcMar>
               <w:top w:type="dxa" w:w="90"/>
               <w:left w:type="dxa" w:w="110"/>
@@ -4409,7 +3921,7 @@
         <w:tc>
           <w:tcPr>
             <w:tcW w:type="dxa" w:w="520"/>
-            <w:shd w:fill="F5F5F4" w:color="auto" w:val="clear"/>
+            <w:shd w:fill="FFFFFF" w:color="auto" w:val="clear"/>
             <w:tcMar>
               <w:top w:type="dxa" w:w="90"/>
               <w:left w:type="dxa" w:w="110"/>
@@ -4434,14 +3946,14 @@
                 <w:sz w:val="22"/>
                 <w:szCs w:val="22"/>
               </w:rPr>
-              <w:t xml:space="preserve">6</w:t>
+              <w:t xml:space="preserve">5</w:t>
             </w:r>
           </w:p>
         </w:tc>
         <w:tc>
           <w:tcPr>
             <w:tcW w:type="dxa" w:w="2000"/>
-            <w:shd w:fill="F5F5F4" w:color="auto" w:val="clear"/>
+            <w:shd w:fill="FFFFFF" w:color="auto" w:val="clear"/>
             <w:tcMar>
               <w:top w:type="dxa" w:w="90"/>
               <w:left w:type="dxa" w:w="110"/>
@@ -4501,14 +4013,14 @@
                 <w:sz w:val="16"/>
                 <w:szCs w:val="16"/>
               </w:rPr>
-              <w:t xml:space="preserve">26 Sep · 8:00 PM</w:t>
+              <w:t xml:space="preserve">SEND  26 Sep · 8:00 PM</w:t>
             </w:r>
           </w:p>
         </w:tc>
         <w:tc>
           <w:tcPr>
             <w:tcW w:type="dxa" w:w="5200"/>
-            <w:shd w:fill="F5F5F4" w:color="auto" w:val="clear"/>
+            <w:shd w:fill="FFFFFF" w:color="auto" w:val="clear"/>
             <w:tcMar>
               <w:top w:type="dxa" w:w="90"/>
               <w:left w:type="dxa" w:w="110"/>
@@ -4773,7 +4285,7 @@
         <w:tc>
           <w:tcPr>
             <w:tcW w:type="dxa" w:w="1900"/>
-            <w:shd w:fill="F5F5F4" w:color="auto" w:val="clear"/>
+            <w:shd w:fill="FFFFFF" w:color="auto" w:val="clear"/>
             <w:tcMar>
               <w:top w:type="dxa" w:w="90"/>
               <w:left w:type="dxa" w:w="110"/>
@@ -4876,7 +4388,7 @@
         <w:tc>
           <w:tcPr>
             <w:tcW w:type="dxa" w:w="3100"/>
-            <w:shd w:fill="F5F5F4" w:color="auto" w:val="clear"/>
+            <w:shd w:fill="FFFFFF" w:color="auto" w:val="clear"/>
             <w:tcMar>
               <w:top w:type="dxa" w:w="90"/>
               <w:left w:type="dxa" w:w="110"/>
@@ -4979,7 +4491,7 @@
         <w:tc>
           <w:tcPr>
             <w:tcW w:type="dxa" w:w="1680"/>
-            <w:shd w:fill="F5F5F4" w:color="auto" w:val="clear"/>
+            <w:shd w:fill="FFFFFF" w:color="auto" w:val="clear"/>
             <w:tcMar>
               <w:top w:type="dxa" w:w="90"/>
               <w:left w:type="dxa" w:w="110"/>
@@ -5033,7 +4545,7 @@
         <w:tc>
           <w:tcPr>
             <w:tcW w:type="dxa" w:w="520"/>
-            <w:shd w:fill="FFFFFF" w:color="auto" w:val="clear"/>
+            <w:shd w:fill="F5F5F4" w:color="auto" w:val="clear"/>
             <w:tcMar>
               <w:top w:type="dxa" w:w="90"/>
               <w:left w:type="dxa" w:w="110"/>
@@ -5058,14 +4570,14 @@
                 <w:sz w:val="22"/>
                 <w:szCs w:val="22"/>
               </w:rPr>
-              <w:t xml:space="preserve">7</w:t>
+              <w:t xml:space="preserve">6</w:t>
             </w:r>
           </w:p>
         </w:tc>
         <w:tc>
           <w:tcPr>
             <w:tcW w:type="dxa" w:w="2000"/>
-            <w:shd w:fill="FFFFFF" w:color="auto" w:val="clear"/>
+            <w:shd w:fill="F5F5F4" w:color="auto" w:val="clear"/>
             <w:tcMar>
               <w:top w:type="dxa" w:w="90"/>
               <w:left w:type="dxa" w:w="110"/>
@@ -5125,14 +4637,14 @@
                 <w:sz w:val="16"/>
                 <w:szCs w:val="16"/>
               </w:rPr>
-              <w:t xml:space="preserve">26 Sep · 1:00 PM</w:t>
+              <w:t xml:space="preserve">SEND  26 Sep · 1:00 PM</w:t>
             </w:r>
           </w:p>
         </w:tc>
         <w:tc>
           <w:tcPr>
             <w:tcW w:type="dxa" w:w="5200"/>
-            <w:shd w:fill="FFFFFF" w:color="auto" w:val="clear"/>
+            <w:shd w:fill="F5F5F4" w:color="auto" w:val="clear"/>
             <w:tcMar>
               <w:top w:type="dxa" w:w="90"/>
               <w:left w:type="dxa" w:w="110"/>
@@ -5361,7 +4873,7 @@
         <w:tc>
           <w:tcPr>
             <w:tcW w:type="dxa" w:w="1900"/>
-            <w:shd w:fill="FFFFFF" w:color="auto" w:val="clear"/>
+            <w:shd w:fill="F5F5F4" w:color="auto" w:val="clear"/>
             <w:tcMar>
               <w:top w:type="dxa" w:w="90"/>
               <w:left w:type="dxa" w:w="110"/>
@@ -5464,7 +4976,7 @@
         <w:tc>
           <w:tcPr>
             <w:tcW w:type="dxa" w:w="3100"/>
-            <w:shd w:fill="FFFFFF" w:color="auto" w:val="clear"/>
+            <w:shd w:fill="F5F5F4" w:color="auto" w:val="clear"/>
             <w:tcMar>
               <w:top w:type="dxa" w:w="90"/>
               <w:left w:type="dxa" w:w="110"/>
@@ -5567,7 +5079,7 @@
         <w:tc>
           <w:tcPr>
             <w:tcW w:type="dxa" w:w="1680"/>
-            <w:shd w:fill="FFFFFF" w:color="auto" w:val="clear"/>
+            <w:shd w:fill="F5F5F4" w:color="auto" w:val="clear"/>
             <w:tcMar>
               <w:top w:type="dxa" w:w="90"/>
               <w:left w:type="dxa" w:w="110"/>
@@ -5621,7 +5133,7 @@
         <w:tc>
           <w:tcPr>
             <w:tcW w:type="dxa" w:w="520"/>
-            <w:shd w:fill="F5F5F4" w:color="auto" w:val="clear"/>
+            <w:shd w:fill="FFFFFF" w:color="auto" w:val="clear"/>
             <w:tcMar>
               <w:top w:type="dxa" w:w="90"/>
               <w:left w:type="dxa" w:w="110"/>
@@ -5646,14 +5158,14 @@
                 <w:sz w:val="22"/>
                 <w:szCs w:val="22"/>
               </w:rPr>
-              <w:t xml:space="preserve">8</w:t>
+              <w:t xml:space="preserve">7</w:t>
             </w:r>
           </w:p>
         </w:tc>
         <w:tc>
           <w:tcPr>
             <w:tcW w:type="dxa" w:w="2000"/>
-            <w:shd w:fill="F5F5F4" w:color="auto" w:val="clear"/>
+            <w:shd w:fill="FFFFFF" w:color="auto" w:val="clear"/>
             <w:tcMar>
               <w:top w:type="dxa" w:w="90"/>
               <w:left w:type="dxa" w:w="110"/>
@@ -5677,7 +5189,7 @@
                 <w:sz w:val="18"/>
                 <w:szCs w:val="18"/>
               </w:rPr>
-              <w:t xml:space="preserve">Orders – 180 Days (bulk slice)</w:t>
+              <w:t xml:space="preserve">ATC – 180 Days</w:t>
             </w:r>
           </w:p>
           <w:p>
@@ -5695,7 +5207,7 @@
                 <w:sz w:val="15"/>
                 <w:szCs w:val="15"/>
               </w:rPr>
-              <w:t xml:space="preserve">~300 contacts</w:t>
+              <w:t xml:space="preserve">2,398 contacts</w:t>
             </w:r>
           </w:p>
           <w:p>
@@ -5713,14 +5225,14 @@
                 <w:sz w:val="16"/>
                 <w:szCs w:val="16"/>
               </w:rPr>
-              <w:t xml:space="preserve">12 Oct · 11:00 AM</w:t>
+              <w:t xml:space="preserve">SEND  24 Sep · 7:00 PM</w:t>
             </w:r>
           </w:p>
         </w:tc>
         <w:tc>
           <w:tcPr>
             <w:tcW w:type="dxa" w:w="5200"/>
-            <w:shd w:fill="F5F5F4" w:color="auto" w:val="clear"/>
+            <w:shd w:fill="FFFFFF" w:color="auto" w:val="clear"/>
             <w:tcMar>
               <w:top w:type="dxa" w:w="90"/>
               <w:left w:type="dxa" w:w="110"/>
@@ -5744,7 +5256,7 @@
                 <w:sz w:val="17"/>
                 <w:szCs w:val="17"/>
               </w:rPr>
-              <w:t xml:space="preserve">{{1}}, *Diwali gifting lists* close in October 🎁</w:t>
+              <w:t xml:space="preserve">{{1}}, your *{{2}}* is still waiting in your cart 🛒</w:t>
             </w:r>
           </w:p>
           <w:p>
@@ -5780,7 +5292,7 @@
                 <w:sz w:val="17"/>
                 <w:szCs w:val="17"/>
               </w:rPr>
-              <w:t xml:space="preserve">Last year the good pieces were gone by Dhanteras.</w:t>
+              <w:t xml:space="preserve">Bappa has gone home. Now the house prepares for *Maa Lakshmi* 🪔</w:t>
             </w:r>
           </w:p>
           <w:p>
@@ -5816,7 +5328,25 @@
                 <w:sz w:val="17"/>
                 <w:szCs w:val="17"/>
               </w:rPr>
-              <w:t xml:space="preserve">*Shubh Labh* — 'Shubh' for auspiciousness, 'Labh' for profit. The one Diwali gift nobody re-gifts.</w:t>
+              <w:t xml:space="preserve">An *exclusive ₹151 off* is reserved for you 🎁</w:t>
+            </w:r>
+          </w:p>
+          <w:p>
+            <w:pPr>
+              <w:spacing w:after="0" w:before="0" w:line="230"/>
+            </w:pPr>
+            <w:r>
+              <w:rPr>
+                <w:rFonts w:ascii="Calibri" w:cs="Calibri" w:eastAsia="Calibri" w:hAnsi="Calibri"/>
+                <w:b w:val="false"/>
+                <w:bCs w:val="false"/>
+                <w:i w:val="false"/>
+                <w:iCs w:val="false"/>
+                <w:color w:val="1C1917"/>
+                <w:sz w:val="17"/>
+                <w:szCs w:val="17"/>
+              </w:rPr>
+              <w:t xml:space="preserve">Use Coupon Code *CART151*</w:t>
             </w:r>
           </w:p>
           <w:p>
@@ -5852,7 +5382,25 @@
                 <w:sz w:val="17"/>
                 <w:szCs w:val="17"/>
               </w:rPr>
-              <w:t xml:space="preserve">Pack of 6 — ₹7,499 (₹1,250 each)</w:t>
+              <w:t xml:space="preserve">⌛ Cart clears tonight — 11:59 PM !!</w:t>
+            </w:r>
+          </w:p>
+          <w:p>
+            <w:pPr>
+              <w:spacing w:after="0" w:before="0" w:line="120"/>
+            </w:pPr>
+            <w:r>
+              <w:rPr>
+                <w:rFonts w:ascii="Calibri" w:cs="Calibri" w:eastAsia="Calibri" w:hAnsi="Calibri"/>
+                <w:b w:val="false"/>
+                <w:bCs w:val="false"/>
+                <w:i w:val="false"/>
+                <w:iCs w:val="false"/>
+                <w:color w:val="1C1917"/>
+                <w:sz w:val="17"/>
+                <w:szCs w:val="17"/>
+              </w:rPr>
+              <w:t xml:space="preserve"/>
             </w:r>
           </w:p>
           <w:p>
@@ -5870,25 +5418,7 @@
                 <w:sz w:val="17"/>
                 <w:szCs w:val="17"/>
               </w:rPr>
-              <w:t xml:space="preserve">Flat *₹1,100 off* with Coupon Code *BULK1100* → *₹6,399*</w:t>
-            </w:r>
-          </w:p>
-          <w:p>
-            <w:pPr>
-              <w:spacing w:after="0" w:before="0" w:line="120"/>
-            </w:pPr>
-            <w:r>
-              <w:rPr>
-                <w:rFonts w:ascii="Calibri" w:cs="Calibri" w:eastAsia="Calibri" w:hAnsi="Calibri"/>
-                <w:b w:val="false"/>
-                <w:bCs w:val="false"/>
-                <w:i w:val="false"/>
-                <w:iCs w:val="false"/>
-                <w:color w:val="1C1917"/>
-                <w:sz w:val="17"/>
-                <w:szCs w:val="17"/>
-              </w:rPr>
-              <w:t xml:space="preserve"/>
+              <w:t xml:space="preserve">"May what you chose reach your mandir before the doors close 🙏"</w:t>
             </w:r>
           </w:p>
           <w:p>
@@ -5906,132 +5436,6 @@
                 <w:sz w:val="17"/>
                 <w:szCs w:val="17"/>
               </w:rPr>
-              <w:t xml:space="preserve">✅ Free branded gift boxes</w:t>
-            </w:r>
-          </w:p>
-          <w:p>
-            <w:pPr>
-              <w:spacing w:after="0" w:before="0" w:line="230"/>
-            </w:pPr>
-            <w:r>
-              <w:rPr>
-                <w:rFonts w:ascii="Calibri" w:cs="Calibri" w:eastAsia="Calibri" w:hAnsi="Calibri"/>
-                <w:b w:val="false"/>
-                <w:bCs w:val="false"/>
-                <w:i w:val="false"/>
-                <w:iCs w:val="false"/>
-                <w:color w:val="1C1917"/>
-                <w:sz w:val="17"/>
-                <w:szCs w:val="17"/>
-              </w:rPr>
-              <w:t xml:space="preserve">✅ 25+ pieces — dedicated manager</w:t>
-            </w:r>
-          </w:p>
-          <w:p>
-            <w:pPr>
-              <w:spacing w:after="0" w:before="0" w:line="230"/>
-            </w:pPr>
-            <w:r>
-              <w:rPr>
-                <w:rFonts w:ascii="Calibri" w:cs="Calibri" w:eastAsia="Calibri" w:hAnsi="Calibri"/>
-                <w:b w:val="false"/>
-                <w:bCs w:val="false"/>
-                <w:i w:val="false"/>
-                <w:iCs w:val="false"/>
-                <w:color w:val="1C1917"/>
-                <w:sz w:val="17"/>
-                <w:szCs w:val="17"/>
-              </w:rPr>
-              <w:t xml:space="preserve">✅ Dispatch before 1 Nov guaranteed</w:t>
-            </w:r>
-          </w:p>
-          <w:p>
-            <w:pPr>
-              <w:spacing w:after="0" w:before="0" w:line="120"/>
-            </w:pPr>
-            <w:r>
-              <w:rPr>
-                <w:rFonts w:ascii="Calibri" w:cs="Calibri" w:eastAsia="Calibri" w:hAnsi="Calibri"/>
-                <w:b w:val="false"/>
-                <w:bCs w:val="false"/>
-                <w:i w:val="false"/>
-                <w:iCs w:val="false"/>
-                <w:color w:val="1C1917"/>
-                <w:sz w:val="17"/>
-                <w:szCs w:val="17"/>
-              </w:rPr>
-              <w:t xml:space="preserve"/>
-            </w:r>
-          </w:p>
-          <w:p>
-            <w:pPr>
-              <w:spacing w:after="0" w:before="0" w:line="230"/>
-            </w:pPr>
-            <w:r>
-              <w:rPr>
-                <w:rFonts w:ascii="Calibri" w:cs="Calibri" w:eastAsia="Calibri" w:hAnsi="Calibri"/>
-                <w:b w:val="false"/>
-                <w:bCs w:val="false"/>
-                <w:i w:val="false"/>
-                <w:iCs w:val="false"/>
-                <w:color w:val="1C1917"/>
-                <w:sz w:val="17"/>
-                <w:szCs w:val="17"/>
-              </w:rPr>
-              <w:t xml:space="preserve">⌛ Bulk slots close 25 Oct !!</w:t>
-            </w:r>
-          </w:p>
-          <w:p>
-            <w:pPr>
-              <w:spacing w:after="0" w:before="0" w:line="120"/>
-            </w:pPr>
-            <w:r>
-              <w:rPr>
-                <w:rFonts w:ascii="Calibri" w:cs="Calibri" w:eastAsia="Calibri" w:hAnsi="Calibri"/>
-                <w:b w:val="false"/>
-                <w:bCs w:val="false"/>
-                <w:i w:val="false"/>
-                <w:iCs w:val="false"/>
-                <w:color w:val="1C1917"/>
-                <w:sz w:val="17"/>
-                <w:szCs w:val="17"/>
-              </w:rPr>
-              <w:t xml:space="preserve"/>
-            </w:r>
-          </w:p>
-          <w:p>
-            <w:pPr>
-              <w:spacing w:after="0" w:before="0" w:line="230"/>
-            </w:pPr>
-            <w:r>
-              <w:rPr>
-                <w:rFonts w:ascii="Calibri" w:cs="Calibri" w:eastAsia="Calibri" w:hAnsi="Calibri"/>
-                <w:b w:val="false"/>
-                <w:bCs w:val="false"/>
-                <w:i w:val="false"/>
-                <w:iCs w:val="false"/>
-                <w:color w:val="1C1917"/>
-                <w:sz w:val="17"/>
-                <w:szCs w:val="17"/>
-              </w:rPr>
-              <w:t xml:space="preserve">"May every name on your list receive something that stays 🙏"</w:t>
-            </w:r>
-          </w:p>
-          <w:p>
-            <w:pPr>
-              <w:spacing w:after="0" w:before="0" w:line="230"/>
-            </w:pPr>
-            <w:r>
-              <w:rPr>
-                <w:rFonts w:ascii="Calibri" w:cs="Calibri" w:eastAsia="Calibri" w:hAnsi="Calibri"/>
-                <w:b w:val="false"/>
-                <w:bCs w:val="false"/>
-                <w:i w:val="false"/>
-                <w:iCs w:val="false"/>
-                <w:color w:val="1C1917"/>
-                <w:sz w:val="17"/>
-                <w:szCs w:val="17"/>
-              </w:rPr>
               <w:t xml:space="preserve">— Dev Aastha</w:t>
             </w:r>
           </w:p>
@@ -6039,213 +5443,213 @@
         <w:tc>
           <w:tcPr>
             <w:tcW w:type="dxa" w:w="1900"/>
-            <w:shd w:fill="F5F5F4" w:color="auto" w:val="clear"/>
-            <w:tcMar>
-              <w:top w:type="dxa" w:w="90"/>
-              <w:left w:type="dxa" w:w="110"/>
-              <w:bottom w:type="dxa" w:w="90"/>
-              <w:right w:type="dxa" w:w="110"/>
-            </w:tcMar>
-            <w:vAlign w:val="top"/>
-          </w:tcPr>
-          <w:p>
-            <w:pPr>
-              <w:spacing w:after="30" w:before="0" w:line="220"/>
-            </w:pPr>
-            <w:r>
-              <w:rPr>
-                <w:rFonts w:ascii="Calibri" w:cs="Calibri" w:eastAsia="Calibri" w:hAnsi="Calibri"/>
-                <w:b w:val="false"/>
-                <w:bCs w:val="false"/>
-                <w:i w:val="false"/>
-                <w:iCs w:val="false"/>
-                <w:color w:val="44403C"/>
-                <w:sz w:val="15"/>
-                <w:szCs w:val="15"/>
-              </w:rPr>
-              <w:t xml:space="preserve">• Flat ₹1,100 off</w:t>
-            </w:r>
-          </w:p>
-          <w:p>
-            <w:pPr>
-              <w:spacing w:after="30" w:before="0" w:line="220"/>
-            </w:pPr>
-            <w:r>
-              <w:rPr>
-                <w:rFonts w:ascii="Calibri" w:cs="Calibri" w:eastAsia="Calibri" w:hAnsi="Calibri"/>
-                <w:b w:val="false"/>
-                <w:bCs w:val="false"/>
-                <w:i w:val="false"/>
-                <w:iCs w:val="false"/>
-                <w:color w:val="44403C"/>
-                <w:sz w:val="15"/>
-                <w:szCs w:val="15"/>
-              </w:rPr>
-              <w:t xml:space="preserve">• Min cart ₹7,499</w:t>
-            </w:r>
-          </w:p>
-          <w:p>
-            <w:pPr>
-              <w:spacing w:after="30" w:before="0" w:line="220"/>
-            </w:pPr>
-            <w:r>
-              <w:rPr>
-                <w:rFonts w:ascii="Calibri" w:cs="Calibri" w:eastAsia="Calibri" w:hAnsi="Calibri"/>
-                <w:b w:val="false"/>
-                <w:bCs w:val="false"/>
-                <w:i w:val="false"/>
-                <w:iCs w:val="false"/>
-                <w:color w:val="44403C"/>
-                <w:sz w:val="15"/>
-                <w:szCs w:val="15"/>
-              </w:rPr>
-              <w:t xml:space="preserve">• Code: BULK1100</w:t>
-            </w:r>
-          </w:p>
-          <w:p>
-            <w:pPr>
-              <w:spacing w:after="30" w:before="0" w:line="220"/>
-            </w:pPr>
-            <w:r>
-              <w:rPr>
-                <w:rFonts w:ascii="Calibri" w:cs="Calibri" w:eastAsia="Calibri" w:hAnsi="Calibri"/>
-                <w:b w:val="false"/>
-                <w:bCs w:val="false"/>
-                <w:i w:val="false"/>
-                <w:iCs w:val="false"/>
-                <w:color w:val="44403C"/>
-                <w:sz w:val="15"/>
-                <w:szCs w:val="15"/>
-              </w:rPr>
-              <w:t xml:space="preserve">• ₹7,499 → ₹6,399</w:t>
-            </w:r>
-          </w:p>
-          <w:p>
-            <w:pPr>
-              <w:spacing w:after="30" w:before="0" w:line="220"/>
-            </w:pPr>
-            <w:r>
-              <w:rPr>
-                <w:rFonts w:ascii="Calibri" w:cs="Calibri" w:eastAsia="Calibri" w:hAnsi="Calibri"/>
-                <w:b w:val="false"/>
-                <w:bCs w:val="false"/>
-                <w:i w:val="false"/>
-                <w:iCs w:val="false"/>
-                <w:color w:val="44403C"/>
-                <w:sz w:val="15"/>
-                <w:szCs w:val="15"/>
-              </w:rPr>
-              <w:t xml:space="preserve">• Lakshmi Charan averaged ₹9,857/order, Shubh Labh ₹3,570 — vs ₹1,900 store AOV</w:t>
+            <w:shd w:fill="FFFFFF" w:color="auto" w:val="clear"/>
+            <w:tcMar>
+              <w:top w:type="dxa" w:w="90"/>
+              <w:left w:type="dxa" w:w="110"/>
+              <w:bottom w:type="dxa" w:w="90"/>
+              <w:right w:type="dxa" w:w="110"/>
+            </w:tcMar>
+            <w:vAlign w:val="top"/>
+          </w:tcPr>
+          <w:p>
+            <w:pPr>
+              <w:spacing w:after="30" w:before="0" w:line="220"/>
+            </w:pPr>
+            <w:r>
+              <w:rPr>
+                <w:rFonts w:ascii="Calibri" w:cs="Calibri" w:eastAsia="Calibri" w:hAnsi="Calibri"/>
+                <w:b w:val="false"/>
+                <w:bCs w:val="false"/>
+                <w:i w:val="false"/>
+                <w:iCs w:val="false"/>
+                <w:color w:val="44403C"/>
+                <w:sz w:val="15"/>
+                <w:szCs w:val="15"/>
+              </w:rPr>
+              <w:t xml:space="preserve">• Flat ₹151 off</w:t>
+            </w:r>
+          </w:p>
+          <w:p>
+            <w:pPr>
+              <w:spacing w:after="30" w:before="0" w:line="220"/>
+            </w:pPr>
+            <w:r>
+              <w:rPr>
+                <w:rFonts w:ascii="Calibri" w:cs="Calibri" w:eastAsia="Calibri" w:hAnsi="Calibri"/>
+                <w:b w:val="false"/>
+                <w:bCs w:val="false"/>
+                <w:i w:val="false"/>
+                <w:iCs w:val="false"/>
+                <w:color w:val="44403C"/>
+                <w:sz w:val="15"/>
+                <w:szCs w:val="15"/>
+              </w:rPr>
+              <w:t xml:space="preserve">• Min cart ₹1,499</w:t>
+            </w:r>
+          </w:p>
+          <w:p>
+            <w:pPr>
+              <w:spacing w:after="30" w:before="0" w:line="220"/>
+            </w:pPr>
+            <w:r>
+              <w:rPr>
+                <w:rFonts w:ascii="Calibri" w:cs="Calibri" w:eastAsia="Calibri" w:hAnsi="Calibri"/>
+                <w:b w:val="false"/>
+                <w:bCs w:val="false"/>
+                <w:i w:val="false"/>
+                <w:iCs w:val="false"/>
+                <w:color w:val="44403C"/>
+                <w:sz w:val="15"/>
+                <w:szCs w:val="15"/>
+              </w:rPr>
+              <w:t xml:space="preserve">• Code: CART151</w:t>
+            </w:r>
+          </w:p>
+          <w:p>
+            <w:pPr>
+              <w:spacing w:after="30" w:before="0" w:line="220"/>
+            </w:pPr>
+            <w:r>
+              <w:rPr>
+                <w:rFonts w:ascii="Calibri" w:cs="Calibri" w:eastAsia="Calibri" w:hAnsi="Calibri"/>
+                <w:b w:val="false"/>
+                <w:bCs w:val="false"/>
+                <w:i w:val="false"/>
+                <w:iCs w:val="false"/>
+                <w:color w:val="44403C"/>
+                <w:sz w:val="15"/>
+                <w:szCs w:val="15"/>
+              </w:rPr>
+              <w:t xml:space="preserve">• Effective 10.1%</w:t>
+            </w:r>
+          </w:p>
+          <w:p>
+            <w:pPr>
+              <w:spacing w:after="30" w:before="0" w:line="220"/>
+            </w:pPr>
+            <w:r>
+              <w:rPr>
+                <w:rFonts w:ascii="Calibri" w:cs="Calibri" w:eastAsia="Calibri" w:hAnsi="Calibri"/>
+                <w:b w:val="false"/>
+                <w:bCs w:val="false"/>
+                <w:i w:val="false"/>
+                <w:iCs w:val="false"/>
+                <w:color w:val="44403C"/>
+                <w:sz w:val="15"/>
+                <w:szCs w:val="15"/>
+              </w:rPr>
+              <w:t xml:space="preserve">• Expires 24 Sep, 11:59 PM</w:t>
             </w:r>
           </w:p>
         </w:tc>
         <w:tc>
           <w:tcPr>
             <w:tcW w:type="dxa" w:w="3100"/>
-            <w:shd w:fill="F5F5F4" w:color="auto" w:val="clear"/>
-            <w:tcMar>
-              <w:top w:type="dxa" w:w="90"/>
-              <w:left w:type="dxa" w:w="110"/>
-              <w:bottom w:type="dxa" w:w="90"/>
-              <w:right w:type="dxa" w:w="110"/>
-            </w:tcMar>
-            <w:vAlign w:val="top"/>
-          </w:tcPr>
-          <w:p>
-            <w:pPr>
-              <w:spacing w:after="30" w:before="0" w:line="220"/>
-            </w:pPr>
-            <w:r>
-              <w:rPr>
-                <w:rFonts w:ascii="Calibri" w:cs="Calibri" w:eastAsia="Calibri" w:hAnsi="Calibri"/>
-                <w:b w:val="false"/>
-                <w:bCs w:val="false"/>
-                <w:i w:val="false"/>
-                <w:iCs w:val="false"/>
-                <w:color w:val="44403C"/>
-                <w:sz w:val="15"/>
-                <w:szCs w:val="15"/>
-              </w:rPr>
-              <w:t xml:space="preserve">• Flat-lay: all 6 Shubh Labh pieces in an overhead grid</w:t>
-            </w:r>
-          </w:p>
-          <w:p>
-            <w:pPr>
-              <w:spacing w:after="30" w:before="0" w:line="220"/>
-            </w:pPr>
-            <w:r>
-              <w:rPr>
-                <w:rFonts w:ascii="Calibri" w:cs="Calibri" w:eastAsia="Calibri" w:hAnsi="Calibri"/>
-                <w:b w:val="false"/>
-                <w:bCs w:val="false"/>
-                <w:i w:val="false"/>
-                <w:iCs w:val="false"/>
-                <w:color w:val="44403C"/>
-                <w:sz w:val="15"/>
-                <w:szCs w:val="15"/>
-              </w:rPr>
-              <w:t xml:space="preserve">• Beside them, a stack of branded Dev Aastha boxes with ribbon</w:t>
-            </w:r>
-          </w:p>
-          <w:p>
-            <w:pPr>
-              <w:spacing w:after="30" w:before="0" w:line="220"/>
-            </w:pPr>
-            <w:r>
-              <w:rPr>
-                <w:rFonts w:ascii="Calibri" w:cs="Calibri" w:eastAsia="Calibri" w:hAnsi="Calibri"/>
-                <w:b w:val="false"/>
-                <w:bCs w:val="false"/>
-                <w:i w:val="false"/>
-                <w:iCs w:val="false"/>
-                <w:color w:val="44403C"/>
-                <w:sz w:val="15"/>
-                <w:szCs w:val="15"/>
-              </w:rPr>
-              <w:t xml:space="preserve">• Corporate-clean styling — neutral linen, even lighting</w:t>
-            </w:r>
-          </w:p>
-          <w:p>
-            <w:pPr>
-              <w:spacing w:after="30" w:before="0" w:line="220"/>
-            </w:pPr>
-            <w:r>
-              <w:rPr>
-                <w:rFonts w:ascii="Calibri" w:cs="Calibri" w:eastAsia="Calibri" w:hAnsi="Calibri"/>
-                <w:b w:val="false"/>
-                <w:bCs w:val="false"/>
-                <w:i w:val="false"/>
-                <w:iCs w:val="false"/>
-                <w:color w:val="44403C"/>
-                <w:sz w:val="15"/>
-                <w:szCs w:val="15"/>
-              </w:rPr>
-              <w:t xml:space="preserve">• Small inset: one piece hung on an office door</w:t>
-            </w:r>
-          </w:p>
-          <w:p>
-            <w:pPr>
-              <w:spacing w:after="30" w:before="0" w:line="220"/>
-            </w:pPr>
-            <w:r>
-              <w:rPr>
-                <w:rFonts w:ascii="Calibri" w:cs="Calibri" w:eastAsia="Calibri" w:hAnsi="Calibri"/>
-                <w:b w:val="false"/>
-                <w:bCs w:val="false"/>
-                <w:i w:val="false"/>
-                <w:iCs w:val="false"/>
-                <w:color w:val="44403C"/>
-                <w:sz w:val="15"/>
-                <w:szCs w:val="15"/>
-              </w:rPr>
-              <w:t xml:space="preserve">• Sells volume and finish, not devotion. Different tone from the rest.</w:t>
+            <w:shd w:fill="FFFFFF" w:color="auto" w:val="clear"/>
+            <w:tcMar>
+              <w:top w:type="dxa" w:w="90"/>
+              <w:left w:type="dxa" w:w="110"/>
+              <w:bottom w:type="dxa" w:w="90"/>
+              <w:right w:type="dxa" w:w="110"/>
+            </w:tcMar>
+            <w:vAlign w:val="top"/>
+          </w:tcPr>
+          <w:p>
+            <w:pPr>
+              <w:spacing w:after="30" w:before="0" w:line="220"/>
+            </w:pPr>
+            <w:r>
+              <w:rPr>
+                <w:rFonts w:ascii="Calibri" w:cs="Calibri" w:eastAsia="Calibri" w:hAnsi="Calibri"/>
+                <w:b w:val="false"/>
+                <w:bCs w:val="false"/>
+                <w:i w:val="false"/>
+                <w:iCs w:val="false"/>
+                <w:color w:val="44403C"/>
+                <w:sz w:val="15"/>
+                <w:szCs w:val="15"/>
+              </w:rPr>
+              <w:t xml:space="preserve">• DYNAMIC: the exact product in their cart</w:t>
+            </w:r>
+          </w:p>
+          <w:p>
+            <w:pPr>
+              <w:spacing w:after="30" w:before="0" w:line="220"/>
+            </w:pPr>
+            <w:r>
+              <w:rPr>
+                <w:rFonts w:ascii="Calibri" w:cs="Calibri" w:eastAsia="Calibri" w:hAnsi="Calibri"/>
+                <w:b w:val="false"/>
+                <w:bCs w:val="false"/>
+                <w:i w:val="false"/>
+                <w:iCs w:val="false"/>
+                <w:color w:val="44403C"/>
+                <w:sz w:val="15"/>
+                <w:szCs w:val="15"/>
+              </w:rPr>
+              <w:t xml:space="preserve">• House template: product on wooden base, dark green backdrop, jute mat</w:t>
+            </w:r>
+          </w:p>
+          <w:p>
+            <w:pPr>
+              <w:spacing w:after="30" w:before="0" w:line="220"/>
+            </w:pPr>
+            <w:r>
+              <w:rPr>
+                <w:rFonts w:ascii="Calibri" w:cs="Calibri" w:eastAsia="Calibri" w:hAnsi="Calibri"/>
+                <w:b w:val="false"/>
+                <w:bCs w:val="false"/>
+                <w:i w:val="false"/>
+                <w:iCs w:val="false"/>
+                <w:color w:val="44403C"/>
+                <w:sz w:val="15"/>
+                <w:szCs w:val="15"/>
+              </w:rPr>
+              <w:t xml:space="preserve">• Keep the 999 SILVER PLATED maroon badge, top-left</w:t>
+            </w:r>
+          </w:p>
+          <w:p>
+            <w:pPr>
+              <w:spacing w:after="30" w:before="0" w:line="220"/>
+            </w:pPr>
+            <w:r>
+              <w:rPr>
+                <w:rFonts w:ascii="Calibri" w:cs="Calibri" w:eastAsia="Calibri" w:hAnsi="Calibri"/>
+                <w:b w:val="false"/>
+                <w:bCs w:val="false"/>
+                <w:i w:val="false"/>
+                <w:iCs w:val="false"/>
+                <w:color w:val="44403C"/>
+                <w:sz w:val="15"/>
+                <w:szCs w:val="15"/>
+              </w:rPr>
+              <w:t xml:space="preserve">• Swap the arrow callout to point at the product</w:t>
+            </w:r>
+          </w:p>
+          <w:p>
+            <w:pPr>
+              <w:spacing w:after="30" w:before="0" w:line="220"/>
+            </w:pPr>
+            <w:r>
+              <w:rPr>
+                <w:rFonts w:ascii="Calibri" w:cs="Calibri" w:eastAsia="Calibri" w:hAnsi="Calibri"/>
+                <w:b w:val="false"/>
+                <w:bCs w:val="false"/>
+                <w:i w:val="false"/>
+                <w:iCs w:val="false"/>
+                <w:color w:val="44403C"/>
+                <w:sz w:val="15"/>
+                <w:szCs w:val="15"/>
+              </w:rPr>
+              <w:t xml:space="preserve">• Add a small cart icon + "Still yours" ribbon</w:t>
             </w:r>
           </w:p>
         </w:tc>
         <w:tc>
           <w:tcPr>
             <w:tcW w:type="dxa" w:w="1680"/>
-            <w:shd w:fill="F5F5F4" w:color="auto" w:val="clear"/>
+            <w:shd w:fill="FFFFFF" w:color="auto" w:val="clear"/>
             <w:tcMar>
               <w:top w:type="dxa" w:w="90"/>
               <w:left w:type="dxa" w:w="110"/>
@@ -6269,7 +5673,7 @@
                 <w:sz w:val="16"/>
                 <w:szCs w:val="16"/>
               </w:rPr>
-              <w:t xml:space="preserve">▸ Get Bulk Quote</w:t>
+              <w:t xml:space="preserve">▸ Buy Now</w:t>
             </w:r>
           </w:p>
           <w:p>
@@ -6287,7 +5691,53 @@
                 <w:sz w:val="16"/>
                 <w:szCs w:val="16"/>
               </w:rPr>
-              <w:t xml:space="preserve">▸ See Corporate Range</w:t>
+              <w:t xml:space="preserve">▸ View Cart</w:t>
+            </w:r>
+          </w:p>
+        </w:tc>
+      </w:tr>
+      <w:tr>
+        <w:tc>
+          <w:tcPr>
+            <w:tcW w:type="dxa" w:w="14400"/>
+            <w:gridSpan w:val="6"/>
+            <w:shd w:fill="B45309" w:color="auto" w:val="clear"/>
+            <w:tcMar>
+              <w:top w:type="dxa" w:w="80"/>
+              <w:left w:type="dxa" w:w="110"/>
+              <w:bottom w:type="dxa" w:w="80"/>
+              <w:right w:type="dxa" w:w="110"/>
+            </w:tcMar>
+          </w:tcPr>
+          <w:p>
+            <w:pPr>
+              <w:spacing w:after="20" w:before="20" w:line="240"/>
+            </w:pPr>
+            <w:r>
+              <w:rPr>
+                <w:rFonts w:ascii="Calibri" w:cs="Calibri" w:eastAsia="Calibri" w:hAnsi="Calibri"/>
+                <w:b/>
+                <w:bCs/>
+                <w:i w:val="false"/>
+                <w:iCs w:val="false"/>
+                <w:color w:val="FFFFFF"/>
+                <w:sz w:val="19"/>
+                <w:szCs w:val="19"/>
+              </w:rPr>
+              <w:t xml:space="preserve">ADDITIONAL — SUGGESTED</w:t>
+            </w:r>
+            <w:r>
+              <w:rPr>
+                <w:rFonts w:ascii="Calibri" w:cs="Calibri" w:eastAsia="Calibri" w:hAnsi="Calibri"/>
+                <w:b w:val="false"/>
+                <w:bCs w:val="false"/>
+                <w:i w:val="false"/>
+                <w:iCs w:val="false"/>
+                <w:color w:val="FEF3C7"/>
+                <w:sz w:val="16"/>
+                <w:szCs w:val="16"/>
+              </w:rPr>
+              <w:t xml:space="preserve">   — three campaigns I have added to cover the gaps in the festive calendar</w:t>
             </w:r>
           </w:p>
         </w:tc>
@@ -6299,7 +5749,7 @@
         <w:tc>
           <w:tcPr>
             <w:tcW w:type="dxa" w:w="520"/>
-            <w:shd w:fill="FFFFFF" w:color="auto" w:val="clear"/>
+            <w:shd w:fill="F5F5F4" w:color="auto" w:val="clear"/>
             <w:tcMar>
               <w:top w:type="dxa" w:w="90"/>
               <w:left w:type="dxa" w:w="110"/>
@@ -6324,14 +5774,14 @@
                 <w:sz w:val="22"/>
                 <w:szCs w:val="22"/>
               </w:rPr>
-              <w:t xml:space="preserve">9</w:t>
+              <w:t xml:space="preserve">8</w:t>
             </w:r>
           </w:p>
         </w:tc>
         <w:tc>
           <w:tcPr>
             <w:tcW w:type="dxa" w:w="2000"/>
-            <w:shd w:fill="FFFFFF" w:color="auto" w:val="clear"/>
+            <w:shd w:fill="F5F5F4" w:color="auto" w:val="clear"/>
             <w:tcMar>
               <w:top w:type="dxa" w:w="90"/>
               <w:left w:type="dxa" w:w="110"/>
@@ -6355,7 +5805,7 @@
                 <w:sz w:val="18"/>
                 <w:szCs w:val="18"/>
               </w:rPr>
-              <w:t xml:space="preserve">ALL COHORTS — Pitru Paksha</w:t>
+              <w:t xml:space="preserve">Orders – 180 Days (bulk slice)</w:t>
             </w:r>
           </w:p>
           <w:p>
@@ -6373,7 +5823,7 @@
                 <w:sz w:val="15"/>
                 <w:szCs w:val="15"/>
               </w:rPr>
-              <w:t xml:space="preserve">~27,000 contacts</w:t>
+              <w:t xml:space="preserve">~300 contacts</w:t>
             </w:r>
           </w:p>
           <w:p>
@@ -6391,14 +5841,14 @@
                 <w:sz w:val="16"/>
                 <w:szCs w:val="16"/>
               </w:rPr>
-              <w:t xml:space="preserve">28 Sep · 9:00 AM</w:t>
+              <w:t xml:space="preserve">SEND  12 Oct · 11:00 AM</w:t>
             </w:r>
           </w:p>
         </w:tc>
         <w:tc>
           <w:tcPr>
             <w:tcW w:type="dxa" w:w="5200"/>
-            <w:shd w:fill="FFFFFF" w:color="auto" w:val="clear"/>
+            <w:shd w:fill="F5F5F4" w:color="auto" w:val="clear"/>
             <w:tcMar>
               <w:top w:type="dxa" w:w="90"/>
               <w:left w:type="dxa" w:w="110"/>
@@ -6422,7 +5872,7 @@
                 <w:sz w:val="17"/>
                 <w:szCs w:val="17"/>
               </w:rPr>
-              <w:t xml:space="preserve">{{1}}, these fifteen days belong to the *elders* 🙏</w:t>
+              <w:t xml:space="preserve">{{1}}, *Diwali gifting lists* close in October 🎁</w:t>
             </w:r>
           </w:p>
           <w:p>
@@ -6458,7 +5908,25 @@
                 <w:sz w:val="17"/>
                 <w:szCs w:val="17"/>
               </w:rPr>
-              <w:t xml:space="preserve">*Pitru Paksha*, 27 September to 10 October.</w:t>
+              <w:t xml:space="preserve">Last year the good pieces were gone by Dhanteras.</w:t>
+            </w:r>
+          </w:p>
+          <w:p>
+            <w:pPr>
+              <w:spacing w:after="0" w:before="0" w:line="120"/>
+            </w:pPr>
+            <w:r>
+              <w:rPr>
+                <w:rFonts w:ascii="Calibri" w:cs="Calibri" w:eastAsia="Calibri" w:hAnsi="Calibri"/>
+                <w:b w:val="false"/>
+                <w:bCs w:val="false"/>
+                <w:i w:val="false"/>
+                <w:iCs w:val="false"/>
+                <w:color w:val="1C1917"/>
+                <w:sz w:val="17"/>
+                <w:szCs w:val="17"/>
+              </w:rPr>
+              <w:t xml:space="preserve"/>
             </w:r>
           </w:p>
           <w:p>
@@ -6476,7 +5944,7 @@
                 <w:sz w:val="17"/>
                 <w:szCs w:val="17"/>
               </w:rPr>
-              <w:t xml:space="preserve">A fortnight for shraddh and tarpan — not for new beginnings.</w:t>
+              <w:t xml:space="preserve">*Shubh Labh* — 'Shubh' for auspiciousness, 'Labh' for profit. The one Diwali gift nobody re-gifts.</w:t>
             </w:r>
           </w:p>
           <w:p>
@@ -6512,7 +5980,25 @@
                 <w:sz w:val="17"/>
                 <w:szCs w:val="17"/>
               </w:rPr>
-              <w:t xml:space="preserve">So we are not selling you anything today.</w:t>
+              <w:t xml:space="preserve">Pack of 6 — ₹7,499 (₹1,250 each)</w:t>
+            </w:r>
+          </w:p>
+          <w:p>
+            <w:pPr>
+              <w:spacing w:after="0" w:before="0" w:line="230"/>
+            </w:pPr>
+            <w:r>
+              <w:rPr>
+                <w:rFonts w:ascii="Calibri" w:cs="Calibri" w:eastAsia="Calibri" w:hAnsi="Calibri"/>
+                <w:b w:val="false"/>
+                <w:bCs w:val="false"/>
+                <w:i w:val="false"/>
+                <w:iCs w:val="false"/>
+                <w:color w:val="1C1917"/>
+                <w:sz w:val="17"/>
+                <w:szCs w:val="17"/>
+              </w:rPr>
+              <w:t xml:space="preserve">Flat *₹1,100 off* with Coupon Code *BULK1100* → *₹6,399*</w:t>
             </w:r>
           </w:p>
           <w:p>
@@ -6548,7 +6034,43 @@
                 <w:sz w:val="17"/>
                 <w:szCs w:val="17"/>
               </w:rPr>
-              <w:t xml:space="preserve">When *Navratri* opens on 11 October, the Ghatasthapana pieces go live — Kalash, Ashta Lakshmi, Panchmukhi Diya.</w:t>
+              <w:t xml:space="preserve">✅ Free branded gift boxes</w:t>
+            </w:r>
+          </w:p>
+          <w:p>
+            <w:pPr>
+              <w:spacing w:after="0" w:before="0" w:line="230"/>
+            </w:pPr>
+            <w:r>
+              <w:rPr>
+                <w:rFonts w:ascii="Calibri" w:cs="Calibri" w:eastAsia="Calibri" w:hAnsi="Calibri"/>
+                <w:b w:val="false"/>
+                <w:bCs w:val="false"/>
+                <w:i w:val="false"/>
+                <w:iCs w:val="false"/>
+                <w:color w:val="1C1917"/>
+                <w:sz w:val="17"/>
+                <w:szCs w:val="17"/>
+              </w:rPr>
+              <w:t xml:space="preserve">✅ 25+ pieces — dedicated manager</w:t>
+            </w:r>
+          </w:p>
+          <w:p>
+            <w:pPr>
+              <w:spacing w:after="0" w:before="0" w:line="230"/>
+            </w:pPr>
+            <w:r>
+              <w:rPr>
+                <w:rFonts w:ascii="Calibri" w:cs="Calibri" w:eastAsia="Calibri" w:hAnsi="Calibri"/>
+                <w:b w:val="false"/>
+                <w:bCs w:val="false"/>
+                <w:i w:val="false"/>
+                <w:iCs w:val="false"/>
+                <w:color w:val="1C1917"/>
+                <w:sz w:val="17"/>
+                <w:szCs w:val="17"/>
+              </w:rPr>
+              <w:t xml:space="preserve">✅ Dispatch before 1 Nov guaranteed</w:t>
             </w:r>
           </w:p>
           <w:p>
@@ -6584,7 +6106,7 @@
                 <w:sz w:val="17"/>
                 <w:szCs w:val="17"/>
               </w:rPr>
-              <w:t xml:space="preserve">Reserve yours now. Nothing is charged until 11 October.</w:t>
+              <w:t xml:space="preserve">⌛ Bulk slots close 25 Oct !!</w:t>
             </w:r>
           </w:p>
           <w:p>
@@ -6620,7 +6142,7 @@
                 <w:sz w:val="17"/>
                 <w:szCs w:val="17"/>
               </w:rPr>
-              <w:t xml:space="preserve">"May your ancestors be remembered, and your home be ready 🙏"</w:t>
+              <w:t xml:space="preserve">"May every name on your list receive something that stays 🙏"</w:t>
             </w:r>
           </w:p>
           <w:p>
@@ -6645,213 +6167,213 @@
         <w:tc>
           <w:tcPr>
             <w:tcW w:type="dxa" w:w="1900"/>
-            <w:shd w:fill="FFFFFF" w:color="auto" w:val="clear"/>
-            <w:tcMar>
-              <w:top w:type="dxa" w:w="90"/>
-              <w:left w:type="dxa" w:w="110"/>
-              <w:bottom w:type="dxa" w:w="90"/>
-              <w:right w:type="dxa" w:w="110"/>
-            </w:tcMar>
-            <w:vAlign w:val="top"/>
-          </w:tcPr>
-          <w:p>
-            <w:pPr>
-              <w:spacing w:after="30" w:before="0" w:line="220"/>
-            </w:pPr>
-            <w:r>
-              <w:rPr>
-                <w:rFonts w:ascii="Calibri" w:cs="Calibri" w:eastAsia="Calibri" w:hAnsi="Calibri"/>
-                <w:b w:val="false"/>
-                <w:bCs w:val="false"/>
-                <w:i w:val="false"/>
-                <w:iCs w:val="false"/>
-                <w:color w:val="44403C"/>
-                <w:sz w:val="15"/>
-                <w:szCs w:val="15"/>
-              </w:rPr>
-              <w:t xml:space="preserve">• NO OFFER. NO SELLING.</w:t>
-            </w:r>
-          </w:p>
-          <w:p>
-            <w:pPr>
-              <w:spacing w:after="30" w:before="0" w:line="220"/>
-            </w:pPr>
-            <w:r>
-              <w:rPr>
-                <w:rFonts w:ascii="Calibri" w:cs="Calibri" w:eastAsia="Calibri" w:hAnsi="Calibri"/>
-                <w:b w:val="false"/>
-                <w:bCs w:val="false"/>
-                <w:i w:val="false"/>
-                <w:iCs w:val="false"/>
-                <w:color w:val="44403C"/>
-                <w:sz w:val="15"/>
-                <w:szCs w:val="15"/>
-              </w:rPr>
-              <w:t xml:space="preserve">• Zero-risk reservation; nothing charged until 11 Oct</w:t>
-            </w:r>
-          </w:p>
-          <w:p>
-            <w:pPr>
-              <w:spacing w:after="30" w:before="0" w:line="220"/>
-            </w:pPr>
-            <w:r>
-              <w:rPr>
-                <w:rFonts w:ascii="Calibri" w:cs="Calibri" w:eastAsia="Calibri" w:hAnsi="Calibri"/>
-                <w:b w:val="false"/>
-                <w:bCs w:val="false"/>
-                <w:i w:val="false"/>
-                <w:iCs w:val="false"/>
-                <w:color w:val="44403C"/>
-                <w:sz w:val="15"/>
-                <w:szCs w:val="15"/>
-              </w:rPr>
-              <w:t xml:space="preserve">• Competitors will blast discounts through Shraddh and get muted</w:t>
-            </w:r>
-          </w:p>
-          <w:p>
-            <w:pPr>
-              <w:spacing w:after="30" w:before="0" w:line="220"/>
-            </w:pPr>
-            <w:r>
-              <w:rPr>
-                <w:rFonts w:ascii="Calibri" w:cs="Calibri" w:eastAsia="Calibri" w:hAnsi="Calibri"/>
-                <w:b w:val="false"/>
-                <w:bCs w:val="false"/>
-                <w:i w:val="false"/>
-                <w:iCs w:val="false"/>
-                <w:color w:val="44403C"/>
-                <w:sz w:val="15"/>
-                <w:szCs w:val="15"/>
-              </w:rPr>
-              <w:t xml:space="preserve">• Standing down publicly is how you own the 11 Oct open</w:t>
-            </w:r>
-          </w:p>
-          <w:p>
-            <w:pPr>
-              <w:spacing w:after="30" w:before="0" w:line="220"/>
-            </w:pPr>
-            <w:r>
-              <w:rPr>
-                <w:rFonts w:ascii="Calibri" w:cs="Calibri" w:eastAsia="Calibri" w:hAnsi="Calibri"/>
-                <w:b w:val="false"/>
-                <w:bCs w:val="false"/>
-                <w:i w:val="false"/>
-                <w:iCs w:val="false"/>
-                <w:color w:val="44403C"/>
-                <w:sz w:val="15"/>
-                <w:szCs w:val="15"/>
-              </w:rPr>
-              <w:t xml:space="preserve">• Parks all ~27,000 into a warm pre-book list</w:t>
+            <w:shd w:fill="F5F5F4" w:color="auto" w:val="clear"/>
+            <w:tcMar>
+              <w:top w:type="dxa" w:w="90"/>
+              <w:left w:type="dxa" w:w="110"/>
+              <w:bottom w:type="dxa" w:w="90"/>
+              <w:right w:type="dxa" w:w="110"/>
+            </w:tcMar>
+            <w:vAlign w:val="top"/>
+          </w:tcPr>
+          <w:p>
+            <w:pPr>
+              <w:spacing w:after="30" w:before="0" w:line="220"/>
+            </w:pPr>
+            <w:r>
+              <w:rPr>
+                <w:rFonts w:ascii="Calibri" w:cs="Calibri" w:eastAsia="Calibri" w:hAnsi="Calibri"/>
+                <w:b w:val="false"/>
+                <w:bCs w:val="false"/>
+                <w:i w:val="false"/>
+                <w:iCs w:val="false"/>
+                <w:color w:val="44403C"/>
+                <w:sz w:val="15"/>
+                <w:szCs w:val="15"/>
+              </w:rPr>
+              <w:t xml:space="preserve">• Flat ₹1,100 off</w:t>
+            </w:r>
+          </w:p>
+          <w:p>
+            <w:pPr>
+              <w:spacing w:after="30" w:before="0" w:line="220"/>
+            </w:pPr>
+            <w:r>
+              <w:rPr>
+                <w:rFonts w:ascii="Calibri" w:cs="Calibri" w:eastAsia="Calibri" w:hAnsi="Calibri"/>
+                <w:b w:val="false"/>
+                <w:bCs w:val="false"/>
+                <w:i w:val="false"/>
+                <w:iCs w:val="false"/>
+                <w:color w:val="44403C"/>
+                <w:sz w:val="15"/>
+                <w:szCs w:val="15"/>
+              </w:rPr>
+              <w:t xml:space="preserve">• Min cart ₹7,499</w:t>
+            </w:r>
+          </w:p>
+          <w:p>
+            <w:pPr>
+              <w:spacing w:after="30" w:before="0" w:line="220"/>
+            </w:pPr>
+            <w:r>
+              <w:rPr>
+                <w:rFonts w:ascii="Calibri" w:cs="Calibri" w:eastAsia="Calibri" w:hAnsi="Calibri"/>
+                <w:b w:val="false"/>
+                <w:bCs w:val="false"/>
+                <w:i w:val="false"/>
+                <w:iCs w:val="false"/>
+                <w:color w:val="44403C"/>
+                <w:sz w:val="15"/>
+                <w:szCs w:val="15"/>
+              </w:rPr>
+              <w:t xml:space="preserve">• Code: BULK1100</w:t>
+            </w:r>
+          </w:p>
+          <w:p>
+            <w:pPr>
+              <w:spacing w:after="30" w:before="0" w:line="220"/>
+            </w:pPr>
+            <w:r>
+              <w:rPr>
+                <w:rFonts w:ascii="Calibri" w:cs="Calibri" w:eastAsia="Calibri" w:hAnsi="Calibri"/>
+                <w:b w:val="false"/>
+                <w:bCs w:val="false"/>
+                <w:i w:val="false"/>
+                <w:iCs w:val="false"/>
+                <w:color w:val="44403C"/>
+                <w:sz w:val="15"/>
+                <w:szCs w:val="15"/>
+              </w:rPr>
+              <w:t xml:space="preserve">• ₹7,499 → ₹6,399</w:t>
+            </w:r>
+          </w:p>
+          <w:p>
+            <w:pPr>
+              <w:spacing w:after="30" w:before="0" w:line="220"/>
+            </w:pPr>
+            <w:r>
+              <w:rPr>
+                <w:rFonts w:ascii="Calibri" w:cs="Calibri" w:eastAsia="Calibri" w:hAnsi="Calibri"/>
+                <w:b w:val="false"/>
+                <w:bCs w:val="false"/>
+                <w:i w:val="false"/>
+                <w:iCs w:val="false"/>
+                <w:color w:val="44403C"/>
+                <w:sz w:val="15"/>
+                <w:szCs w:val="15"/>
+              </w:rPr>
+              <w:t xml:space="preserve">• Lakshmi Charan averaged ₹9,857/order, Shubh Labh ₹3,570 — vs ₹1,900 store AOV</w:t>
             </w:r>
           </w:p>
         </w:tc>
         <w:tc>
           <w:tcPr>
             <w:tcW w:type="dxa" w:w="3100"/>
-            <w:shd w:fill="FFFFFF" w:color="auto" w:val="clear"/>
-            <w:tcMar>
-              <w:top w:type="dxa" w:w="90"/>
-              <w:left w:type="dxa" w:w="110"/>
-              <w:bottom w:type="dxa" w:w="90"/>
-              <w:right w:type="dxa" w:w="110"/>
-            </w:tcMar>
-            <w:vAlign w:val="top"/>
-          </w:tcPr>
-          <w:p>
-            <w:pPr>
-              <w:spacing w:after="30" w:before="0" w:line="220"/>
-            </w:pPr>
-            <w:r>
-              <w:rPr>
-                <w:rFonts w:ascii="Calibri" w:cs="Calibri" w:eastAsia="Calibri" w:hAnsi="Calibri"/>
-                <w:b w:val="false"/>
-                <w:bCs w:val="false"/>
-                <w:i w:val="false"/>
-                <w:iCs w:val="false"/>
-                <w:color w:val="44403C"/>
-                <w:sz w:val="15"/>
-                <w:szCs w:val="15"/>
-              </w:rPr>
-              <w:t xml:space="preserve">• NO PRODUCT IN FRAME — that is the entire point</w:t>
-            </w:r>
-          </w:p>
-          <w:p>
-            <w:pPr>
-              <w:spacing w:after="30" w:before="0" w:line="220"/>
-            </w:pPr>
-            <w:r>
-              <w:rPr>
-                <w:rFonts w:ascii="Calibri" w:cs="Calibri" w:eastAsia="Calibri" w:hAnsi="Calibri"/>
-                <w:b w:val="false"/>
-                <w:bCs w:val="false"/>
-                <w:i w:val="false"/>
-                <w:iCs w:val="false"/>
-                <w:color w:val="44403C"/>
-                <w:sz w:val="15"/>
-                <w:szCs w:val="15"/>
-              </w:rPr>
-              <w:t xml:space="preserve">• A single lit oil diya against a dark, warm, near-black ground</w:t>
-            </w:r>
-          </w:p>
-          <w:p>
-            <w:pPr>
-              <w:spacing w:after="30" w:before="0" w:line="220"/>
-            </w:pPr>
-            <w:r>
-              <w:rPr>
-                <w:rFonts w:ascii="Calibri" w:cs="Calibri" w:eastAsia="Calibri" w:hAnsi="Calibri"/>
-                <w:b w:val="false"/>
-                <w:bCs w:val="false"/>
-                <w:i w:val="false"/>
-                <w:iCs w:val="false"/>
-                <w:color w:val="44403C"/>
-                <w:sz w:val="15"/>
-                <w:szCs w:val="15"/>
-              </w:rPr>
-              <w:t xml:space="preserve">• Generous empty space, small centred text, nothing else</w:t>
-            </w:r>
-          </w:p>
-          <w:p>
-            <w:pPr>
-              <w:spacing w:after="30" w:before="0" w:line="220"/>
-            </w:pPr>
-            <w:r>
-              <w:rPr>
-                <w:rFonts w:ascii="Calibri" w:cs="Calibri" w:eastAsia="Calibri" w:hAnsi="Calibri"/>
-                <w:b w:val="false"/>
-                <w:bCs w:val="false"/>
-                <w:i w:val="false"/>
-                <w:iCs w:val="false"/>
-                <w:color w:val="44403C"/>
-                <w:sz w:val="15"/>
-                <w:szCs w:val="15"/>
-              </w:rPr>
-              <w:t xml:space="preserve">• No 999 SILVER PLATED badge, no price, no button graphic</w:t>
-            </w:r>
-          </w:p>
-          <w:p>
-            <w:pPr>
-              <w:spacing w:after="30" w:before="0" w:line="220"/>
-            </w:pPr>
-            <w:r>
-              <w:rPr>
-                <w:rFonts w:ascii="Calibri" w:cs="Calibri" w:eastAsia="Calibri" w:hAnsi="Calibri"/>
-                <w:b w:val="false"/>
-                <w:bCs w:val="false"/>
-                <w:i w:val="false"/>
-                <w:iCs w:val="false"/>
-                <w:color w:val="44403C"/>
-                <w:sz w:val="15"/>
-                <w:szCs w:val="15"/>
-              </w:rPr>
-              <w:t xml:space="preserve">• If it looks like an ad, the message fails. Make it look like a note.</w:t>
+            <w:shd w:fill="F5F5F4" w:color="auto" w:val="clear"/>
+            <w:tcMar>
+              <w:top w:type="dxa" w:w="90"/>
+              <w:left w:type="dxa" w:w="110"/>
+              <w:bottom w:type="dxa" w:w="90"/>
+              <w:right w:type="dxa" w:w="110"/>
+            </w:tcMar>
+            <w:vAlign w:val="top"/>
+          </w:tcPr>
+          <w:p>
+            <w:pPr>
+              <w:spacing w:after="30" w:before="0" w:line="220"/>
+            </w:pPr>
+            <w:r>
+              <w:rPr>
+                <w:rFonts w:ascii="Calibri" w:cs="Calibri" w:eastAsia="Calibri" w:hAnsi="Calibri"/>
+                <w:b w:val="false"/>
+                <w:bCs w:val="false"/>
+                <w:i w:val="false"/>
+                <w:iCs w:val="false"/>
+                <w:color w:val="44403C"/>
+                <w:sz w:val="15"/>
+                <w:szCs w:val="15"/>
+              </w:rPr>
+              <w:t xml:space="preserve">• Flat-lay: all 6 Shubh Labh pieces in an overhead grid</w:t>
+            </w:r>
+          </w:p>
+          <w:p>
+            <w:pPr>
+              <w:spacing w:after="30" w:before="0" w:line="220"/>
+            </w:pPr>
+            <w:r>
+              <w:rPr>
+                <w:rFonts w:ascii="Calibri" w:cs="Calibri" w:eastAsia="Calibri" w:hAnsi="Calibri"/>
+                <w:b w:val="false"/>
+                <w:bCs w:val="false"/>
+                <w:i w:val="false"/>
+                <w:iCs w:val="false"/>
+                <w:color w:val="44403C"/>
+                <w:sz w:val="15"/>
+                <w:szCs w:val="15"/>
+              </w:rPr>
+              <w:t xml:space="preserve">• Beside them, a stack of branded Dev Aastha boxes with ribbon</w:t>
+            </w:r>
+          </w:p>
+          <w:p>
+            <w:pPr>
+              <w:spacing w:after="30" w:before="0" w:line="220"/>
+            </w:pPr>
+            <w:r>
+              <w:rPr>
+                <w:rFonts w:ascii="Calibri" w:cs="Calibri" w:eastAsia="Calibri" w:hAnsi="Calibri"/>
+                <w:b w:val="false"/>
+                <w:bCs w:val="false"/>
+                <w:i w:val="false"/>
+                <w:iCs w:val="false"/>
+                <w:color w:val="44403C"/>
+                <w:sz w:val="15"/>
+                <w:szCs w:val="15"/>
+              </w:rPr>
+              <w:t xml:space="preserve">• Corporate-clean styling — neutral linen, even lighting</w:t>
+            </w:r>
+          </w:p>
+          <w:p>
+            <w:pPr>
+              <w:spacing w:after="30" w:before="0" w:line="220"/>
+            </w:pPr>
+            <w:r>
+              <w:rPr>
+                <w:rFonts w:ascii="Calibri" w:cs="Calibri" w:eastAsia="Calibri" w:hAnsi="Calibri"/>
+                <w:b w:val="false"/>
+                <w:bCs w:val="false"/>
+                <w:i w:val="false"/>
+                <w:iCs w:val="false"/>
+                <w:color w:val="44403C"/>
+                <w:sz w:val="15"/>
+                <w:szCs w:val="15"/>
+              </w:rPr>
+              <w:t xml:space="preserve">• Small inset: one piece hung on an office door</w:t>
+            </w:r>
+          </w:p>
+          <w:p>
+            <w:pPr>
+              <w:spacing w:after="30" w:before="0" w:line="220"/>
+            </w:pPr>
+            <w:r>
+              <w:rPr>
+                <w:rFonts w:ascii="Calibri" w:cs="Calibri" w:eastAsia="Calibri" w:hAnsi="Calibri"/>
+                <w:b w:val="false"/>
+                <w:bCs w:val="false"/>
+                <w:i w:val="false"/>
+                <w:iCs w:val="false"/>
+                <w:color w:val="44403C"/>
+                <w:sz w:val="15"/>
+                <w:szCs w:val="15"/>
+              </w:rPr>
+              <w:t xml:space="preserve">• Sells volume and finish, not devotion. Different tone from the rest.</w:t>
             </w:r>
           </w:p>
         </w:tc>
         <w:tc>
           <w:tcPr>
             <w:tcW w:type="dxa" w:w="1680"/>
-            <w:shd w:fill="FFFFFF" w:color="auto" w:val="clear"/>
+            <w:shd w:fill="F5F5F4" w:color="auto" w:val="clear"/>
             <w:tcMar>
               <w:top w:type="dxa" w:w="90"/>
               <w:left w:type="dxa" w:w="110"/>
@@ -6875,7 +6397,7 @@
                 <w:sz w:val="16"/>
                 <w:szCs w:val="16"/>
               </w:rPr>
-              <w:t xml:space="preserve">▸ Reserve for Navratri</w:t>
+              <w:t xml:space="preserve">▸ Get Bulk Quote</w:t>
             </w:r>
           </w:p>
           <w:p>
@@ -6893,7 +6415,7 @@
                 <w:sz w:val="16"/>
                 <w:szCs w:val="16"/>
               </w:rPr>
-              <w:t xml:space="preserve">▸ Set a Reminder</w:t>
+              <w:t xml:space="preserve">▸ See Corporate Range</w:t>
             </w:r>
           </w:p>
         </w:tc>
@@ -6905,7 +6427,7 @@
         <w:tc>
           <w:tcPr>
             <w:tcW w:type="dxa" w:w="520"/>
-            <w:shd w:fill="F5F5F4" w:color="auto" w:val="clear"/>
+            <w:shd w:fill="FFFFFF" w:color="auto" w:val="clear"/>
             <w:tcMar>
               <w:top w:type="dxa" w:w="90"/>
               <w:left w:type="dxa" w:w="110"/>
@@ -6930,14 +6452,14 @@
                 <w:sz w:val="22"/>
                 <w:szCs w:val="22"/>
               </w:rPr>
-              <w:t xml:space="preserve">10</w:t>
+              <w:t xml:space="preserve">9</w:t>
             </w:r>
           </w:p>
         </w:tc>
         <w:tc>
           <w:tcPr>
             <w:tcW w:type="dxa" w:w="2000"/>
-            <w:shd w:fill="F5F5F4" w:color="auto" w:val="clear"/>
+            <w:shd w:fill="FFFFFF" w:color="auto" w:val="clear"/>
             <w:tcMar>
               <w:top w:type="dxa" w:w="90"/>
               <w:left w:type="dxa" w:w="110"/>
@@ -6961,7 +6483,7 @@
                 <w:sz w:val="18"/>
                 <w:szCs w:val="18"/>
               </w:rPr>
-              <w:t xml:space="preserve">ALL COHORTS — Dhanteras</w:t>
+              <w:t xml:space="preserve">ALL COHORTS — Pitru Paksha</w:t>
             </w:r>
           </w:p>
           <w:p>
@@ -6997,14 +6519,14 @@
                 <w:sz w:val="16"/>
                 <w:szCs w:val="16"/>
               </w:rPr>
-              <w:t xml:space="preserve">6 Nov · 7:00 AM</w:t>
+              <w:t xml:space="preserve">SEND  28 Sep · 9:00 AM</w:t>
             </w:r>
           </w:p>
         </w:tc>
         <w:tc>
           <w:tcPr>
             <w:tcW w:type="dxa" w:w="5200"/>
-            <w:shd w:fill="F5F5F4" w:color="auto" w:val="clear"/>
+            <w:shd w:fill="FFFFFF" w:color="auto" w:val="clear"/>
             <w:tcMar>
               <w:top w:type="dxa" w:w="90"/>
               <w:left w:type="dxa" w:w="110"/>
@@ -7028,7 +6550,7 @@
                 <w:sz w:val="17"/>
                 <w:szCs w:val="17"/>
               </w:rPr>
-              <w:t xml:space="preserve">{{1}}, today is the one day *silver* must enter the house 🪔</w:t>
+              <w:t xml:space="preserve">{{1}}, these fifteen days belong to the *elders* 🙏</w:t>
             </w:r>
           </w:p>
           <w:p>
@@ -7064,7 +6586,25 @@
                 <w:sz w:val="17"/>
                 <w:szCs w:val="17"/>
               </w:rPr>
-              <w:t xml:space="preserve">*Dhanteras.* Silver bought today is not decoration — it is for the year ahead.</w:t>
+              <w:t xml:space="preserve">*Pitru Paksha*, 27 September to 10 October.</w:t>
+            </w:r>
+          </w:p>
+          <w:p>
+            <w:pPr>
+              <w:spacing w:after="0" w:before="0" w:line="230"/>
+            </w:pPr>
+            <w:r>
+              <w:rPr>
+                <w:rFonts w:ascii="Calibri" w:cs="Calibri" w:eastAsia="Calibri" w:hAnsi="Calibri"/>
+                <w:b w:val="false"/>
+                <w:bCs w:val="false"/>
+                <w:i w:val="false"/>
+                <w:iCs w:val="false"/>
+                <w:color w:val="1C1917"/>
+                <w:sz w:val="17"/>
+                <w:szCs w:val="17"/>
+              </w:rPr>
+              <w:t xml:space="preserve">A fortnight for shraddh and tarpan — not for new beginnings.</w:t>
             </w:r>
           </w:p>
           <w:p>
@@ -7100,7 +6640,25 @@
                 <w:sz w:val="17"/>
                 <w:szCs w:val="17"/>
               </w:rPr>
-              <w:t xml:space="preserve">Lakshmi Charan ₹1,499 · Kuber Kalash ₹1,249</w:t>
+              <w:t xml:space="preserve">So we are not selling you anything today.</w:t>
+            </w:r>
+          </w:p>
+          <w:p>
+            <w:pPr>
+              <w:spacing w:after="0" w:before="0" w:line="120"/>
+            </w:pPr>
+            <w:r>
+              <w:rPr>
+                <w:rFonts w:ascii="Calibri" w:cs="Calibri" w:eastAsia="Calibri" w:hAnsi="Calibri"/>
+                <w:b w:val="false"/>
+                <w:bCs w:val="false"/>
+                <w:i w:val="false"/>
+                <w:iCs w:val="false"/>
+                <w:color w:val="1C1917"/>
+                <w:sz w:val="17"/>
+                <w:szCs w:val="17"/>
+              </w:rPr>
+              <w:t xml:space="preserve"/>
             </w:r>
           </w:p>
           <w:p>
@@ -7118,7 +6676,25 @@
                 <w:sz w:val="17"/>
                 <w:szCs w:val="17"/>
               </w:rPr>
-              <w:t xml:space="preserve">Both together ₹2,748</w:t>
+              <w:t xml:space="preserve">When *Navratri* opens on 11 October, the Ghatasthapana pieces go live — Kalash, Ashta Lakshmi, Panchmukhi Diya.</w:t>
+            </w:r>
+          </w:p>
+          <w:p>
+            <w:pPr>
+              <w:spacing w:after="0" w:before="0" w:line="120"/>
+            </w:pPr>
+            <w:r>
+              <w:rPr>
+                <w:rFonts w:ascii="Calibri" w:cs="Calibri" w:eastAsia="Calibri" w:hAnsi="Calibri"/>
+                <w:b w:val="false"/>
+                <w:bCs w:val="false"/>
+                <w:i w:val="false"/>
+                <w:iCs w:val="false"/>
+                <w:color w:val="1C1917"/>
+                <w:sz w:val="17"/>
+                <w:szCs w:val="17"/>
+              </w:rPr>
+              <w:t xml:space="preserve"/>
             </w:r>
           </w:p>
           <w:p>
@@ -7136,7 +6712,7 @@
                 <w:sz w:val="17"/>
                 <w:szCs w:val="17"/>
               </w:rPr>
-              <w:t xml:space="preserve">Flat *₹251 off* with Coupon Code *DHAN251* → *₹2,497* 🎁</w:t>
+              <w:t xml:space="preserve">Reserve yours now. Nothing is charged until 11 October.</w:t>
             </w:r>
           </w:p>
           <w:p>
@@ -7172,25 +6748,7 @@
                 <w:sz w:val="17"/>
                 <w:szCs w:val="17"/>
               </w:rPr>
-              <w:t xml:space="preserve">⌛ Muhurat closes tonight — same-day dispatch till 2 PM !!</w:t>
-            </w:r>
-          </w:p>
-          <w:p>
-            <w:pPr>
-              <w:spacing w:after="0" w:before="0" w:line="120"/>
-            </w:pPr>
-            <w:r>
-              <w:rPr>
-                <w:rFonts w:ascii="Calibri" w:cs="Calibri" w:eastAsia="Calibri" w:hAnsi="Calibri"/>
-                <w:b w:val="false"/>
-                <w:bCs w:val="false"/>
-                <w:i w:val="false"/>
-                <w:iCs w:val="false"/>
-                <w:color w:val="1C1917"/>
-                <w:sz w:val="17"/>
-                <w:szCs w:val="17"/>
-              </w:rPr>
-              <w:t xml:space="preserve"/>
+              <w:t xml:space="preserve">"May your ancestors be remembered, and your home be ready 🙏"</w:t>
             </w:r>
           </w:p>
           <w:p>
@@ -7208,24 +6766,6 @@
                 <w:sz w:val="17"/>
                 <w:szCs w:val="17"/>
               </w:rPr>
-              <w:t xml:space="preserve">"May Lakshmi walk in today and stay all year 🙏"</w:t>
-            </w:r>
-          </w:p>
-          <w:p>
-            <w:pPr>
-              <w:spacing w:after="0" w:before="0" w:line="230"/>
-            </w:pPr>
-            <w:r>
-              <w:rPr>
-                <w:rFonts w:ascii="Calibri" w:cs="Calibri" w:eastAsia="Calibri" w:hAnsi="Calibri"/>
-                <w:b w:val="false"/>
-                <w:bCs w:val="false"/>
-                <w:i w:val="false"/>
-                <w:iCs w:val="false"/>
-                <w:color w:val="1C1917"/>
-                <w:sz w:val="17"/>
-                <w:szCs w:val="17"/>
-              </w:rPr>
               <w:t xml:space="preserve">— Dev Aastha</w:t>
             </w:r>
           </w:p>
@@ -7233,213 +6773,213 @@
         <w:tc>
           <w:tcPr>
             <w:tcW w:type="dxa" w:w="1900"/>
-            <w:shd w:fill="F5F5F4" w:color="auto" w:val="clear"/>
-            <w:tcMar>
-              <w:top w:type="dxa" w:w="90"/>
-              <w:left w:type="dxa" w:w="110"/>
-              <w:bottom w:type="dxa" w:w="90"/>
-              <w:right w:type="dxa" w:w="110"/>
-            </w:tcMar>
-            <w:vAlign w:val="top"/>
-          </w:tcPr>
-          <w:p>
-            <w:pPr>
-              <w:spacing w:after="30" w:before="0" w:line="220"/>
-            </w:pPr>
-            <w:r>
-              <w:rPr>
-                <w:rFonts w:ascii="Calibri" w:cs="Calibri" w:eastAsia="Calibri" w:hAnsi="Calibri"/>
-                <w:b w:val="false"/>
-                <w:bCs w:val="false"/>
-                <w:i w:val="false"/>
-                <w:iCs w:val="false"/>
-                <w:color w:val="44403C"/>
-                <w:sz w:val="15"/>
-                <w:szCs w:val="15"/>
-              </w:rPr>
-              <w:t xml:space="preserve">• Flat ₹251 off</w:t>
-            </w:r>
-          </w:p>
-          <w:p>
-            <w:pPr>
-              <w:spacing w:after="30" w:before="0" w:line="220"/>
-            </w:pPr>
-            <w:r>
-              <w:rPr>
-                <w:rFonts w:ascii="Calibri" w:cs="Calibri" w:eastAsia="Calibri" w:hAnsi="Calibri"/>
-                <w:b w:val="false"/>
-                <w:bCs w:val="false"/>
-                <w:i w:val="false"/>
-                <w:iCs w:val="false"/>
-                <w:color w:val="44403C"/>
-                <w:sz w:val="15"/>
-                <w:szCs w:val="15"/>
-              </w:rPr>
-              <w:t xml:space="preserve">• Min cart ₹1,999</w:t>
-            </w:r>
-          </w:p>
-          <w:p>
-            <w:pPr>
-              <w:spacing w:after="30" w:before="0" w:line="220"/>
-            </w:pPr>
-            <w:r>
-              <w:rPr>
-                <w:rFonts w:ascii="Calibri" w:cs="Calibri" w:eastAsia="Calibri" w:hAnsi="Calibri"/>
-                <w:b w:val="false"/>
-                <w:bCs w:val="false"/>
-                <w:i w:val="false"/>
-                <w:iCs w:val="false"/>
-                <w:color w:val="44403C"/>
-                <w:sz w:val="15"/>
-                <w:szCs w:val="15"/>
-              </w:rPr>
-              <w:t xml:space="preserve">• Code: DHAN251</w:t>
-            </w:r>
-          </w:p>
-          <w:p>
-            <w:pPr>
-              <w:spacing w:after="30" w:before="0" w:line="220"/>
-            </w:pPr>
-            <w:r>
-              <w:rPr>
-                <w:rFonts w:ascii="Calibri" w:cs="Calibri" w:eastAsia="Calibri" w:hAnsi="Calibri"/>
-                <w:b w:val="false"/>
-                <w:bCs w:val="false"/>
-                <w:i w:val="false"/>
-                <w:iCs w:val="false"/>
-                <w:color w:val="44403C"/>
-                <w:sz w:val="15"/>
-                <w:szCs w:val="15"/>
-              </w:rPr>
-              <w:t xml:space="preserve">• ₹2,748 → ₹2,497</w:t>
-            </w:r>
-          </w:p>
-          <w:p>
-            <w:pPr>
-              <w:spacing w:after="30" w:before="0" w:line="220"/>
-            </w:pPr>
-            <w:r>
-              <w:rPr>
-                <w:rFonts w:ascii="Calibri" w:cs="Calibri" w:eastAsia="Calibri" w:hAnsi="Calibri"/>
-                <w:b w:val="false"/>
-                <w:bCs w:val="false"/>
-                <w:i w:val="false"/>
-                <w:iCs w:val="false"/>
-                <w:color w:val="44403C"/>
-                <w:sz w:val="15"/>
-                <w:szCs w:val="15"/>
-              </w:rPr>
-              <w:t xml:space="preserve">• Cap the code to 6 Nov only — biggest silver-buying day of the year</w:t>
+            <w:shd w:fill="FFFFFF" w:color="auto" w:val="clear"/>
+            <w:tcMar>
+              <w:top w:type="dxa" w:w="90"/>
+              <w:left w:type="dxa" w:w="110"/>
+              <w:bottom w:type="dxa" w:w="90"/>
+              <w:right w:type="dxa" w:w="110"/>
+            </w:tcMar>
+            <w:vAlign w:val="top"/>
+          </w:tcPr>
+          <w:p>
+            <w:pPr>
+              <w:spacing w:after="30" w:before="0" w:line="220"/>
+            </w:pPr>
+            <w:r>
+              <w:rPr>
+                <w:rFonts w:ascii="Calibri" w:cs="Calibri" w:eastAsia="Calibri" w:hAnsi="Calibri"/>
+                <w:b w:val="false"/>
+                <w:bCs w:val="false"/>
+                <w:i w:val="false"/>
+                <w:iCs w:val="false"/>
+                <w:color w:val="44403C"/>
+                <w:sz w:val="15"/>
+                <w:szCs w:val="15"/>
+              </w:rPr>
+              <w:t xml:space="preserve">• NO OFFER. NO SELLING.</w:t>
+            </w:r>
+          </w:p>
+          <w:p>
+            <w:pPr>
+              <w:spacing w:after="30" w:before="0" w:line="220"/>
+            </w:pPr>
+            <w:r>
+              <w:rPr>
+                <w:rFonts w:ascii="Calibri" w:cs="Calibri" w:eastAsia="Calibri" w:hAnsi="Calibri"/>
+                <w:b w:val="false"/>
+                <w:bCs w:val="false"/>
+                <w:i w:val="false"/>
+                <w:iCs w:val="false"/>
+                <w:color w:val="44403C"/>
+                <w:sz w:val="15"/>
+                <w:szCs w:val="15"/>
+              </w:rPr>
+              <w:t xml:space="preserve">• Zero-risk reservation; nothing charged until 11 Oct</w:t>
+            </w:r>
+          </w:p>
+          <w:p>
+            <w:pPr>
+              <w:spacing w:after="30" w:before="0" w:line="220"/>
+            </w:pPr>
+            <w:r>
+              <w:rPr>
+                <w:rFonts w:ascii="Calibri" w:cs="Calibri" w:eastAsia="Calibri" w:hAnsi="Calibri"/>
+                <w:b w:val="false"/>
+                <w:bCs w:val="false"/>
+                <w:i w:val="false"/>
+                <w:iCs w:val="false"/>
+                <w:color w:val="44403C"/>
+                <w:sz w:val="15"/>
+                <w:szCs w:val="15"/>
+              </w:rPr>
+              <w:t xml:space="preserve">• Competitors will blast discounts through Shraddh and get muted</w:t>
+            </w:r>
+          </w:p>
+          <w:p>
+            <w:pPr>
+              <w:spacing w:after="30" w:before="0" w:line="220"/>
+            </w:pPr>
+            <w:r>
+              <w:rPr>
+                <w:rFonts w:ascii="Calibri" w:cs="Calibri" w:eastAsia="Calibri" w:hAnsi="Calibri"/>
+                <w:b w:val="false"/>
+                <w:bCs w:val="false"/>
+                <w:i w:val="false"/>
+                <w:iCs w:val="false"/>
+                <w:color w:val="44403C"/>
+                <w:sz w:val="15"/>
+                <w:szCs w:val="15"/>
+              </w:rPr>
+              <w:t xml:space="preserve">• Standing down publicly is how you own the 11 Oct open</w:t>
+            </w:r>
+          </w:p>
+          <w:p>
+            <w:pPr>
+              <w:spacing w:after="30" w:before="0" w:line="220"/>
+            </w:pPr>
+            <w:r>
+              <w:rPr>
+                <w:rFonts w:ascii="Calibri" w:cs="Calibri" w:eastAsia="Calibri" w:hAnsi="Calibri"/>
+                <w:b w:val="false"/>
+                <w:bCs w:val="false"/>
+                <w:i w:val="false"/>
+                <w:iCs w:val="false"/>
+                <w:color w:val="44403C"/>
+                <w:sz w:val="15"/>
+                <w:szCs w:val="15"/>
+              </w:rPr>
+              <w:t xml:space="preserve">• Parks all ~27,000 into a warm pre-book list</w:t>
             </w:r>
           </w:p>
         </w:tc>
         <w:tc>
           <w:tcPr>
             <w:tcW w:type="dxa" w:w="3100"/>
-            <w:shd w:fill="F5F5F4" w:color="auto" w:val="clear"/>
-            <w:tcMar>
-              <w:top w:type="dxa" w:w="90"/>
-              <w:left w:type="dxa" w:w="110"/>
-              <w:bottom w:type="dxa" w:w="90"/>
-              <w:right w:type="dxa" w:w="110"/>
-            </w:tcMar>
-            <w:vAlign w:val="top"/>
-          </w:tcPr>
-          <w:p>
-            <w:pPr>
-              <w:spacing w:after="30" w:before="0" w:line="220"/>
-            </w:pPr>
-            <w:r>
-              <w:rPr>
-                <w:rFonts w:ascii="Calibri" w:cs="Calibri" w:eastAsia="Calibri" w:hAnsi="Calibri"/>
-                <w:b w:val="false"/>
-                <w:bCs w:val="false"/>
-                <w:i w:val="false"/>
-                <w:iCs w:val="false"/>
-                <w:color w:val="44403C"/>
-                <w:sz w:val="15"/>
-                <w:szCs w:val="15"/>
-              </w:rPr>
-              <w:t xml:space="preserve">• Both pieces arranged on a silver puja thali</w:t>
-            </w:r>
-          </w:p>
-          <w:p>
-            <w:pPr>
-              <w:spacing w:after="30" w:before="0" w:line="220"/>
-            </w:pPr>
-            <w:r>
-              <w:rPr>
-                <w:rFonts w:ascii="Calibri" w:cs="Calibri" w:eastAsia="Calibri" w:hAnsi="Calibri"/>
-                <w:b w:val="false"/>
-                <w:bCs w:val="false"/>
-                <w:i w:val="false"/>
-                <w:iCs w:val="false"/>
-                <w:color w:val="44403C"/>
-                <w:sz w:val="15"/>
-                <w:szCs w:val="15"/>
-              </w:rPr>
-              <w:t xml:space="preserve">• Marigold petals, a few coins, one lit diya</w:t>
-            </w:r>
-          </w:p>
-          <w:p>
-            <w:pPr>
-              <w:spacing w:after="30" w:before="0" w:line="220"/>
-            </w:pPr>
-            <w:r>
-              <w:rPr>
-                <w:rFonts w:ascii="Calibri" w:cs="Calibri" w:eastAsia="Calibri" w:hAnsi="Calibri"/>
-                <w:b w:val="false"/>
-                <w:bCs w:val="false"/>
-                <w:i w:val="false"/>
-                <w:iCs w:val="false"/>
-                <w:color w:val="44403C"/>
-                <w:sz w:val="15"/>
-                <w:szCs w:val="15"/>
-              </w:rPr>
-              <w:t xml:space="preserve">• Deep red cloth — Dhanteras colour language</w:t>
-            </w:r>
-          </w:p>
-          <w:p>
-            <w:pPr>
-              <w:spacing w:after="30" w:before="0" w:line="220"/>
-            </w:pPr>
-            <w:r>
-              <w:rPr>
-                <w:rFonts w:ascii="Calibri" w:cs="Calibri" w:eastAsia="Calibri" w:hAnsi="Calibri"/>
-                <w:b w:val="false"/>
-                <w:bCs w:val="false"/>
-                <w:i w:val="false"/>
-                <w:iCs w:val="false"/>
-                <w:color w:val="44403C"/>
-                <w:sz w:val="15"/>
-                <w:szCs w:val="15"/>
-              </w:rPr>
-              <w:t xml:space="preserve">• Top strip: "Dhanteras Muhurat · 6 November"</w:t>
-            </w:r>
-          </w:p>
-          <w:p>
-            <w:pPr>
-              <w:spacing w:after="30" w:before="0" w:line="220"/>
-            </w:pPr>
-            <w:r>
-              <w:rPr>
-                <w:rFonts w:ascii="Calibri" w:cs="Calibri" w:eastAsia="Calibri" w:hAnsi="Calibri"/>
-                <w:b w:val="false"/>
-                <w:bCs w:val="false"/>
-                <w:i w:val="false"/>
-                <w:iCs w:val="false"/>
-                <w:color w:val="44403C"/>
-                <w:sz w:val="15"/>
-                <w:szCs w:val="15"/>
-              </w:rPr>
-              <w:t xml:space="preserve">• Add a live countdown treatment if your tool supports it</w:t>
+            <w:shd w:fill="FFFFFF" w:color="auto" w:val="clear"/>
+            <w:tcMar>
+              <w:top w:type="dxa" w:w="90"/>
+              <w:left w:type="dxa" w:w="110"/>
+              <w:bottom w:type="dxa" w:w="90"/>
+              <w:right w:type="dxa" w:w="110"/>
+            </w:tcMar>
+            <w:vAlign w:val="top"/>
+          </w:tcPr>
+          <w:p>
+            <w:pPr>
+              <w:spacing w:after="30" w:before="0" w:line="220"/>
+            </w:pPr>
+            <w:r>
+              <w:rPr>
+                <w:rFonts w:ascii="Calibri" w:cs="Calibri" w:eastAsia="Calibri" w:hAnsi="Calibri"/>
+                <w:b w:val="false"/>
+                <w:bCs w:val="false"/>
+                <w:i w:val="false"/>
+                <w:iCs w:val="false"/>
+                <w:color w:val="44403C"/>
+                <w:sz w:val="15"/>
+                <w:szCs w:val="15"/>
+              </w:rPr>
+              <w:t xml:space="preserve">• NO PRODUCT IN FRAME — that is the entire point</w:t>
+            </w:r>
+          </w:p>
+          <w:p>
+            <w:pPr>
+              <w:spacing w:after="30" w:before="0" w:line="220"/>
+            </w:pPr>
+            <w:r>
+              <w:rPr>
+                <w:rFonts w:ascii="Calibri" w:cs="Calibri" w:eastAsia="Calibri" w:hAnsi="Calibri"/>
+                <w:b w:val="false"/>
+                <w:bCs w:val="false"/>
+                <w:i w:val="false"/>
+                <w:iCs w:val="false"/>
+                <w:color w:val="44403C"/>
+                <w:sz w:val="15"/>
+                <w:szCs w:val="15"/>
+              </w:rPr>
+              <w:t xml:space="preserve">• A single lit oil diya against a dark, warm, near-black ground</w:t>
+            </w:r>
+          </w:p>
+          <w:p>
+            <w:pPr>
+              <w:spacing w:after="30" w:before="0" w:line="220"/>
+            </w:pPr>
+            <w:r>
+              <w:rPr>
+                <w:rFonts w:ascii="Calibri" w:cs="Calibri" w:eastAsia="Calibri" w:hAnsi="Calibri"/>
+                <w:b w:val="false"/>
+                <w:bCs w:val="false"/>
+                <w:i w:val="false"/>
+                <w:iCs w:val="false"/>
+                <w:color w:val="44403C"/>
+                <w:sz w:val="15"/>
+                <w:szCs w:val="15"/>
+              </w:rPr>
+              <w:t xml:space="preserve">• Generous empty space, small centred text, nothing else</w:t>
+            </w:r>
+          </w:p>
+          <w:p>
+            <w:pPr>
+              <w:spacing w:after="30" w:before="0" w:line="220"/>
+            </w:pPr>
+            <w:r>
+              <w:rPr>
+                <w:rFonts w:ascii="Calibri" w:cs="Calibri" w:eastAsia="Calibri" w:hAnsi="Calibri"/>
+                <w:b w:val="false"/>
+                <w:bCs w:val="false"/>
+                <w:i w:val="false"/>
+                <w:iCs w:val="false"/>
+                <w:color w:val="44403C"/>
+                <w:sz w:val="15"/>
+                <w:szCs w:val="15"/>
+              </w:rPr>
+              <w:t xml:space="preserve">• No 999 SILVER PLATED badge, no price, no button graphic</w:t>
+            </w:r>
+          </w:p>
+          <w:p>
+            <w:pPr>
+              <w:spacing w:after="30" w:before="0" w:line="220"/>
+            </w:pPr>
+            <w:r>
+              <w:rPr>
+                <w:rFonts w:ascii="Calibri" w:cs="Calibri" w:eastAsia="Calibri" w:hAnsi="Calibri"/>
+                <w:b w:val="false"/>
+                <w:bCs w:val="false"/>
+                <w:i w:val="false"/>
+                <w:iCs w:val="false"/>
+                <w:color w:val="44403C"/>
+                <w:sz w:val="15"/>
+                <w:szCs w:val="15"/>
+              </w:rPr>
+              <w:t xml:space="preserve">• If it looks like an ad, the message fails. Make it look like a note.</w:t>
             </w:r>
           </w:p>
         </w:tc>
         <w:tc>
           <w:tcPr>
             <w:tcW w:type="dxa" w:w="1680"/>
-            <w:shd w:fill="F5F5F4" w:color="auto" w:val="clear"/>
+            <w:shd w:fill="FFFFFF" w:color="auto" w:val="clear"/>
             <w:tcMar>
               <w:top w:type="dxa" w:w="90"/>
               <w:left w:type="dxa" w:w="110"/>
@@ -7463,7 +7003,7 @@
                 <w:sz w:val="16"/>
                 <w:szCs w:val="16"/>
               </w:rPr>
-              <w:t xml:space="preserve">▸ Buy Before Muhurat Ends</w:t>
+              <w:t xml:space="preserve">▸ Reserve for Navratri</w:t>
             </w:r>
           </w:p>
           <w:p>
@@ -7481,12 +7021,816 @@
                 <w:sz w:val="16"/>
                 <w:szCs w:val="16"/>
               </w:rPr>
+              <w:t xml:space="preserve">▸ Set a Reminder</w:t>
+            </w:r>
+          </w:p>
+        </w:tc>
+      </w:tr>
+      <w:tr>
+        <w:trPr>
+          <w:cantSplit w:val="false"/>
+        </w:trPr>
+        <w:tc>
+          <w:tcPr>
+            <w:tcW w:type="dxa" w:w="520"/>
+            <w:shd w:fill="F5F5F4" w:color="auto" w:val="clear"/>
+            <w:tcMar>
+              <w:top w:type="dxa" w:w="90"/>
+              <w:left w:type="dxa" w:w="110"/>
+              <w:bottom w:type="dxa" w:w="90"/>
+              <w:right w:type="dxa" w:w="110"/>
+            </w:tcMar>
+            <w:vAlign w:val="top"/>
+          </w:tcPr>
+          <w:p>
+            <w:pPr>
+              <w:spacing w:after="20" w:before="20" w:line="240"/>
+              <w:jc w:val="center"/>
+            </w:pPr>
+            <w:r>
+              <w:rPr>
+                <w:rFonts w:ascii="Calibri" w:cs="Calibri" w:eastAsia="Calibri" w:hAnsi="Calibri"/>
+                <w:b/>
+                <w:bCs/>
+                <w:i w:val="false"/>
+                <w:iCs w:val="false"/>
+                <w:color w:val="B45309"/>
+                <w:sz w:val="22"/>
+                <w:szCs w:val="22"/>
+              </w:rPr>
+              <w:t xml:space="preserve">10</w:t>
+            </w:r>
+          </w:p>
+        </w:tc>
+        <w:tc>
+          <w:tcPr>
+            <w:tcW w:type="dxa" w:w="2000"/>
+            <w:shd w:fill="F5F5F4" w:color="auto" w:val="clear"/>
+            <w:tcMar>
+              <w:top w:type="dxa" w:w="90"/>
+              <w:left w:type="dxa" w:w="110"/>
+              <w:bottom w:type="dxa" w:w="90"/>
+              <w:right w:type="dxa" w:w="110"/>
+            </w:tcMar>
+            <w:vAlign w:val="top"/>
+          </w:tcPr>
+          <w:p>
+            <w:pPr>
+              <w:spacing w:after="20" w:before="20" w:line="240"/>
+            </w:pPr>
+            <w:r>
+              <w:rPr>
+                <w:rFonts w:ascii="Calibri" w:cs="Calibri" w:eastAsia="Calibri" w:hAnsi="Calibri"/>
+                <w:b/>
+                <w:bCs/>
+                <w:i w:val="false"/>
+                <w:iCs w:val="false"/>
+                <w:color w:val="1C1917"/>
+                <w:sz w:val="18"/>
+                <w:szCs w:val="18"/>
+              </w:rPr>
+              <w:t xml:space="preserve">ALL COHORTS — Dhanteras</w:t>
+            </w:r>
+          </w:p>
+          <w:p>
+            <w:pPr>
+              <w:spacing w:after="20" w:before="20" w:line="240"/>
+            </w:pPr>
+            <w:r>
+              <w:rPr>
+                <w:rFonts w:ascii="Calibri" w:cs="Calibri" w:eastAsia="Calibri" w:hAnsi="Calibri"/>
+                <w:b w:val="false"/>
+                <w:bCs w:val="false"/>
+                <w:i w:val="false"/>
+                <w:iCs w:val="false"/>
+                <w:color w:val="78716C"/>
+                <w:sz w:val="15"/>
+                <w:szCs w:val="15"/>
+              </w:rPr>
+              <w:t xml:space="preserve">~27,000 contacts</w:t>
+            </w:r>
+          </w:p>
+          <w:p>
+            <w:pPr>
+              <w:spacing w:after="20" w:before="60" w:line="240"/>
+            </w:pPr>
+            <w:r>
+              <w:rPr>
+                <w:rFonts w:ascii="Calibri" w:cs="Calibri" w:eastAsia="Calibri" w:hAnsi="Calibri"/>
+                <w:b/>
+                <w:bCs/>
+                <w:i w:val="false"/>
+                <w:iCs w:val="false"/>
+                <w:color w:val="B45309"/>
+                <w:sz w:val="16"/>
+                <w:szCs w:val="16"/>
+              </w:rPr>
+              <w:t xml:space="preserve">SEND  6 Nov · 7:00 AM</w:t>
+            </w:r>
+          </w:p>
+        </w:tc>
+        <w:tc>
+          <w:tcPr>
+            <w:tcW w:type="dxa" w:w="5200"/>
+            <w:shd w:fill="F5F5F4" w:color="auto" w:val="clear"/>
+            <w:tcMar>
+              <w:top w:type="dxa" w:w="90"/>
+              <w:left w:type="dxa" w:w="110"/>
+              <w:bottom w:type="dxa" w:w="90"/>
+              <w:right w:type="dxa" w:w="110"/>
+            </w:tcMar>
+            <w:vAlign w:val="top"/>
+          </w:tcPr>
+          <w:p>
+            <w:pPr>
+              <w:spacing w:after="0" w:before="0" w:line="230"/>
+            </w:pPr>
+            <w:r>
+              <w:rPr>
+                <w:rFonts w:ascii="Calibri" w:cs="Calibri" w:eastAsia="Calibri" w:hAnsi="Calibri"/>
+                <w:b w:val="false"/>
+                <w:bCs w:val="false"/>
+                <w:i w:val="false"/>
+                <w:iCs w:val="false"/>
+                <w:color w:val="1C1917"/>
+                <w:sz w:val="17"/>
+                <w:szCs w:val="17"/>
+              </w:rPr>
+              <w:t xml:space="preserve">{{1}}, today is the one day *silver* must enter the house 🪔</w:t>
+            </w:r>
+          </w:p>
+          <w:p>
+            <w:pPr>
+              <w:spacing w:after="0" w:before="0" w:line="120"/>
+            </w:pPr>
+            <w:r>
+              <w:rPr>
+                <w:rFonts w:ascii="Calibri" w:cs="Calibri" w:eastAsia="Calibri" w:hAnsi="Calibri"/>
+                <w:b w:val="false"/>
+                <w:bCs w:val="false"/>
+                <w:i w:val="false"/>
+                <w:iCs w:val="false"/>
+                <w:color w:val="1C1917"/>
+                <w:sz w:val="17"/>
+                <w:szCs w:val="17"/>
+              </w:rPr>
+              <w:t xml:space="preserve"/>
+            </w:r>
+          </w:p>
+          <w:p>
+            <w:pPr>
+              <w:spacing w:after="0" w:before="0" w:line="230"/>
+            </w:pPr>
+            <w:r>
+              <w:rPr>
+                <w:rFonts w:ascii="Calibri" w:cs="Calibri" w:eastAsia="Calibri" w:hAnsi="Calibri"/>
+                <w:b w:val="false"/>
+                <w:bCs w:val="false"/>
+                <w:i w:val="false"/>
+                <w:iCs w:val="false"/>
+                <w:color w:val="1C1917"/>
+                <w:sz w:val="17"/>
+                <w:szCs w:val="17"/>
+              </w:rPr>
+              <w:t xml:space="preserve">*Dhanteras.* Silver bought today is not decoration — it is for the year ahead.</w:t>
+            </w:r>
+          </w:p>
+          <w:p>
+            <w:pPr>
+              <w:spacing w:after="0" w:before="0" w:line="120"/>
+            </w:pPr>
+            <w:r>
+              <w:rPr>
+                <w:rFonts w:ascii="Calibri" w:cs="Calibri" w:eastAsia="Calibri" w:hAnsi="Calibri"/>
+                <w:b w:val="false"/>
+                <w:bCs w:val="false"/>
+                <w:i w:val="false"/>
+                <w:iCs w:val="false"/>
+                <w:color w:val="1C1917"/>
+                <w:sz w:val="17"/>
+                <w:szCs w:val="17"/>
+              </w:rPr>
+              <w:t xml:space="preserve"/>
+            </w:r>
+          </w:p>
+          <w:p>
+            <w:pPr>
+              <w:spacing w:after="0" w:before="0" w:line="230"/>
+            </w:pPr>
+            <w:r>
+              <w:rPr>
+                <w:rFonts w:ascii="Calibri" w:cs="Calibri" w:eastAsia="Calibri" w:hAnsi="Calibri"/>
+                <w:b w:val="false"/>
+                <w:bCs w:val="false"/>
+                <w:i w:val="false"/>
+                <w:iCs w:val="false"/>
+                <w:color w:val="1C1917"/>
+                <w:sz w:val="17"/>
+                <w:szCs w:val="17"/>
+              </w:rPr>
+              <w:t xml:space="preserve">Lakshmi Charan ₹1,499 · Kuber Kalash ₹1,249</w:t>
+            </w:r>
+          </w:p>
+          <w:p>
+            <w:pPr>
+              <w:spacing w:after="0" w:before="0" w:line="230"/>
+            </w:pPr>
+            <w:r>
+              <w:rPr>
+                <w:rFonts w:ascii="Calibri" w:cs="Calibri" w:eastAsia="Calibri" w:hAnsi="Calibri"/>
+                <w:b w:val="false"/>
+                <w:bCs w:val="false"/>
+                <w:i w:val="false"/>
+                <w:iCs w:val="false"/>
+                <w:color w:val="1C1917"/>
+                <w:sz w:val="17"/>
+                <w:szCs w:val="17"/>
+              </w:rPr>
+              <w:t xml:space="preserve">Both together ₹2,748</w:t>
+            </w:r>
+          </w:p>
+          <w:p>
+            <w:pPr>
+              <w:spacing w:after="0" w:before="0" w:line="230"/>
+            </w:pPr>
+            <w:r>
+              <w:rPr>
+                <w:rFonts w:ascii="Calibri" w:cs="Calibri" w:eastAsia="Calibri" w:hAnsi="Calibri"/>
+                <w:b w:val="false"/>
+                <w:bCs w:val="false"/>
+                <w:i w:val="false"/>
+                <w:iCs w:val="false"/>
+                <w:color w:val="1C1917"/>
+                <w:sz w:val="17"/>
+                <w:szCs w:val="17"/>
+              </w:rPr>
+              <w:t xml:space="preserve">Flat *₹251 off* with Coupon Code *DHAN251* → *₹2,497* 🎁</w:t>
+            </w:r>
+          </w:p>
+          <w:p>
+            <w:pPr>
+              <w:spacing w:after="0" w:before="0" w:line="120"/>
+            </w:pPr>
+            <w:r>
+              <w:rPr>
+                <w:rFonts w:ascii="Calibri" w:cs="Calibri" w:eastAsia="Calibri" w:hAnsi="Calibri"/>
+                <w:b w:val="false"/>
+                <w:bCs w:val="false"/>
+                <w:i w:val="false"/>
+                <w:iCs w:val="false"/>
+                <w:color w:val="1C1917"/>
+                <w:sz w:val="17"/>
+                <w:szCs w:val="17"/>
+              </w:rPr>
+              <w:t xml:space="preserve"/>
+            </w:r>
+          </w:p>
+          <w:p>
+            <w:pPr>
+              <w:spacing w:after="0" w:before="0" w:line="230"/>
+            </w:pPr>
+            <w:r>
+              <w:rPr>
+                <w:rFonts w:ascii="Calibri" w:cs="Calibri" w:eastAsia="Calibri" w:hAnsi="Calibri"/>
+                <w:b w:val="false"/>
+                <w:bCs w:val="false"/>
+                <w:i w:val="false"/>
+                <w:iCs w:val="false"/>
+                <w:color w:val="1C1917"/>
+                <w:sz w:val="17"/>
+                <w:szCs w:val="17"/>
+              </w:rPr>
+              <w:t xml:space="preserve">⌛ Muhurat closes tonight — same-day dispatch till 2 PM !!</w:t>
+            </w:r>
+          </w:p>
+          <w:p>
+            <w:pPr>
+              <w:spacing w:after="0" w:before="0" w:line="120"/>
+            </w:pPr>
+            <w:r>
+              <w:rPr>
+                <w:rFonts w:ascii="Calibri" w:cs="Calibri" w:eastAsia="Calibri" w:hAnsi="Calibri"/>
+                <w:b w:val="false"/>
+                <w:bCs w:val="false"/>
+                <w:i w:val="false"/>
+                <w:iCs w:val="false"/>
+                <w:color w:val="1C1917"/>
+                <w:sz w:val="17"/>
+                <w:szCs w:val="17"/>
+              </w:rPr>
+              <w:t xml:space="preserve"/>
+            </w:r>
+          </w:p>
+          <w:p>
+            <w:pPr>
+              <w:spacing w:after="0" w:before="0" w:line="230"/>
+            </w:pPr>
+            <w:r>
+              <w:rPr>
+                <w:rFonts w:ascii="Calibri" w:cs="Calibri" w:eastAsia="Calibri" w:hAnsi="Calibri"/>
+                <w:b w:val="false"/>
+                <w:bCs w:val="false"/>
+                <w:i w:val="false"/>
+                <w:iCs w:val="false"/>
+                <w:color w:val="1C1917"/>
+                <w:sz w:val="17"/>
+                <w:szCs w:val="17"/>
+              </w:rPr>
+              <w:t xml:space="preserve">"May Lakshmi walk in today and stay all year 🙏"</w:t>
+            </w:r>
+          </w:p>
+          <w:p>
+            <w:pPr>
+              <w:spacing w:after="0" w:before="0" w:line="230"/>
+            </w:pPr>
+            <w:r>
+              <w:rPr>
+                <w:rFonts w:ascii="Calibri" w:cs="Calibri" w:eastAsia="Calibri" w:hAnsi="Calibri"/>
+                <w:b w:val="false"/>
+                <w:bCs w:val="false"/>
+                <w:i w:val="false"/>
+                <w:iCs w:val="false"/>
+                <w:color w:val="1C1917"/>
+                <w:sz w:val="17"/>
+                <w:szCs w:val="17"/>
+              </w:rPr>
+              <w:t xml:space="preserve">— Dev Aastha</w:t>
+            </w:r>
+          </w:p>
+        </w:tc>
+        <w:tc>
+          <w:tcPr>
+            <w:tcW w:type="dxa" w:w="1900"/>
+            <w:shd w:fill="F5F5F4" w:color="auto" w:val="clear"/>
+            <w:tcMar>
+              <w:top w:type="dxa" w:w="90"/>
+              <w:left w:type="dxa" w:w="110"/>
+              <w:bottom w:type="dxa" w:w="90"/>
+              <w:right w:type="dxa" w:w="110"/>
+            </w:tcMar>
+            <w:vAlign w:val="top"/>
+          </w:tcPr>
+          <w:p>
+            <w:pPr>
+              <w:spacing w:after="30" w:before="0" w:line="220"/>
+            </w:pPr>
+            <w:r>
+              <w:rPr>
+                <w:rFonts w:ascii="Calibri" w:cs="Calibri" w:eastAsia="Calibri" w:hAnsi="Calibri"/>
+                <w:b w:val="false"/>
+                <w:bCs w:val="false"/>
+                <w:i w:val="false"/>
+                <w:iCs w:val="false"/>
+                <w:color w:val="44403C"/>
+                <w:sz w:val="15"/>
+                <w:szCs w:val="15"/>
+              </w:rPr>
+              <w:t xml:space="preserve">• Flat ₹251 off</w:t>
+            </w:r>
+          </w:p>
+          <w:p>
+            <w:pPr>
+              <w:spacing w:after="30" w:before="0" w:line="220"/>
+            </w:pPr>
+            <w:r>
+              <w:rPr>
+                <w:rFonts w:ascii="Calibri" w:cs="Calibri" w:eastAsia="Calibri" w:hAnsi="Calibri"/>
+                <w:b w:val="false"/>
+                <w:bCs w:val="false"/>
+                <w:i w:val="false"/>
+                <w:iCs w:val="false"/>
+                <w:color w:val="44403C"/>
+                <w:sz w:val="15"/>
+                <w:szCs w:val="15"/>
+              </w:rPr>
+              <w:t xml:space="preserve">• Min cart ₹1,999</w:t>
+            </w:r>
+          </w:p>
+          <w:p>
+            <w:pPr>
+              <w:spacing w:after="30" w:before="0" w:line="220"/>
+            </w:pPr>
+            <w:r>
+              <w:rPr>
+                <w:rFonts w:ascii="Calibri" w:cs="Calibri" w:eastAsia="Calibri" w:hAnsi="Calibri"/>
+                <w:b w:val="false"/>
+                <w:bCs w:val="false"/>
+                <w:i w:val="false"/>
+                <w:iCs w:val="false"/>
+                <w:color w:val="44403C"/>
+                <w:sz w:val="15"/>
+                <w:szCs w:val="15"/>
+              </w:rPr>
+              <w:t xml:space="preserve">• Code: DHAN251</w:t>
+            </w:r>
+          </w:p>
+          <w:p>
+            <w:pPr>
+              <w:spacing w:after="30" w:before="0" w:line="220"/>
+            </w:pPr>
+            <w:r>
+              <w:rPr>
+                <w:rFonts w:ascii="Calibri" w:cs="Calibri" w:eastAsia="Calibri" w:hAnsi="Calibri"/>
+                <w:b w:val="false"/>
+                <w:bCs w:val="false"/>
+                <w:i w:val="false"/>
+                <w:iCs w:val="false"/>
+                <w:color w:val="44403C"/>
+                <w:sz w:val="15"/>
+                <w:szCs w:val="15"/>
+              </w:rPr>
+              <w:t xml:space="preserve">• ₹2,748 → ₹2,497</w:t>
+            </w:r>
+          </w:p>
+          <w:p>
+            <w:pPr>
+              <w:spacing w:after="30" w:before="0" w:line="220"/>
+            </w:pPr>
+            <w:r>
+              <w:rPr>
+                <w:rFonts w:ascii="Calibri" w:cs="Calibri" w:eastAsia="Calibri" w:hAnsi="Calibri"/>
+                <w:b w:val="false"/>
+                <w:bCs w:val="false"/>
+                <w:i w:val="false"/>
+                <w:iCs w:val="false"/>
+                <w:color w:val="44403C"/>
+                <w:sz w:val="15"/>
+                <w:szCs w:val="15"/>
+              </w:rPr>
+              <w:t xml:space="preserve">• Cap the code to 6 Nov only — biggest silver-buying day of the year</w:t>
+            </w:r>
+          </w:p>
+        </w:tc>
+        <w:tc>
+          <w:tcPr>
+            <w:tcW w:type="dxa" w:w="3100"/>
+            <w:shd w:fill="F5F5F4" w:color="auto" w:val="clear"/>
+            <w:tcMar>
+              <w:top w:type="dxa" w:w="90"/>
+              <w:left w:type="dxa" w:w="110"/>
+              <w:bottom w:type="dxa" w:w="90"/>
+              <w:right w:type="dxa" w:w="110"/>
+            </w:tcMar>
+            <w:vAlign w:val="top"/>
+          </w:tcPr>
+          <w:p>
+            <w:pPr>
+              <w:spacing w:after="30" w:before="0" w:line="220"/>
+            </w:pPr>
+            <w:r>
+              <w:rPr>
+                <w:rFonts w:ascii="Calibri" w:cs="Calibri" w:eastAsia="Calibri" w:hAnsi="Calibri"/>
+                <w:b w:val="false"/>
+                <w:bCs w:val="false"/>
+                <w:i w:val="false"/>
+                <w:iCs w:val="false"/>
+                <w:color w:val="44403C"/>
+                <w:sz w:val="15"/>
+                <w:szCs w:val="15"/>
+              </w:rPr>
+              <w:t xml:space="preserve">• Both pieces arranged on a silver puja thali</w:t>
+            </w:r>
+          </w:p>
+          <w:p>
+            <w:pPr>
+              <w:spacing w:after="30" w:before="0" w:line="220"/>
+            </w:pPr>
+            <w:r>
+              <w:rPr>
+                <w:rFonts w:ascii="Calibri" w:cs="Calibri" w:eastAsia="Calibri" w:hAnsi="Calibri"/>
+                <w:b w:val="false"/>
+                <w:bCs w:val="false"/>
+                <w:i w:val="false"/>
+                <w:iCs w:val="false"/>
+                <w:color w:val="44403C"/>
+                <w:sz w:val="15"/>
+                <w:szCs w:val="15"/>
+              </w:rPr>
+              <w:t xml:space="preserve">• Marigold petals, a few coins, one lit diya</w:t>
+            </w:r>
+          </w:p>
+          <w:p>
+            <w:pPr>
+              <w:spacing w:after="30" w:before="0" w:line="220"/>
+            </w:pPr>
+            <w:r>
+              <w:rPr>
+                <w:rFonts w:ascii="Calibri" w:cs="Calibri" w:eastAsia="Calibri" w:hAnsi="Calibri"/>
+                <w:b w:val="false"/>
+                <w:bCs w:val="false"/>
+                <w:i w:val="false"/>
+                <w:iCs w:val="false"/>
+                <w:color w:val="44403C"/>
+                <w:sz w:val="15"/>
+                <w:szCs w:val="15"/>
+              </w:rPr>
+              <w:t xml:space="preserve">• Deep red cloth — Dhanteras colour language</w:t>
+            </w:r>
+          </w:p>
+          <w:p>
+            <w:pPr>
+              <w:spacing w:after="30" w:before="0" w:line="220"/>
+            </w:pPr>
+            <w:r>
+              <w:rPr>
+                <w:rFonts w:ascii="Calibri" w:cs="Calibri" w:eastAsia="Calibri" w:hAnsi="Calibri"/>
+                <w:b w:val="false"/>
+                <w:bCs w:val="false"/>
+                <w:i w:val="false"/>
+                <w:iCs w:val="false"/>
+                <w:color w:val="44403C"/>
+                <w:sz w:val="15"/>
+                <w:szCs w:val="15"/>
+              </w:rPr>
+              <w:t xml:space="preserve">• Top strip: "Dhanteras Muhurat · 6 November"</w:t>
+            </w:r>
+          </w:p>
+          <w:p>
+            <w:pPr>
+              <w:spacing w:after="30" w:before="0" w:line="220"/>
+            </w:pPr>
+            <w:r>
+              <w:rPr>
+                <w:rFonts w:ascii="Calibri" w:cs="Calibri" w:eastAsia="Calibri" w:hAnsi="Calibri"/>
+                <w:b w:val="false"/>
+                <w:bCs w:val="false"/>
+                <w:i w:val="false"/>
+                <w:iCs w:val="false"/>
+                <w:color w:val="44403C"/>
+                <w:sz w:val="15"/>
+                <w:szCs w:val="15"/>
+              </w:rPr>
+              <w:t xml:space="preserve">• Add a live countdown treatment if your tool supports it</w:t>
+            </w:r>
+          </w:p>
+        </w:tc>
+        <w:tc>
+          <w:tcPr>
+            <w:tcW w:type="dxa" w:w="1680"/>
+            <w:shd w:fill="F5F5F4" w:color="auto" w:val="clear"/>
+            <w:tcMar>
+              <w:top w:type="dxa" w:w="90"/>
+              <w:left w:type="dxa" w:w="110"/>
+              <w:bottom w:type="dxa" w:w="90"/>
+              <w:right w:type="dxa" w:w="110"/>
+            </w:tcMar>
+            <w:vAlign w:val="top"/>
+          </w:tcPr>
+          <w:p>
+            <w:pPr>
+              <w:spacing w:after="70" w:before="20" w:line="240"/>
+            </w:pPr>
+            <w:r>
+              <w:rPr>
+                <w:rFonts w:ascii="Calibri" w:cs="Calibri" w:eastAsia="Calibri" w:hAnsi="Calibri"/>
+                <w:b/>
+                <w:bCs/>
+                <w:i w:val="false"/>
+                <w:iCs w:val="false"/>
+                <w:color w:val="7C2D12"/>
+                <w:sz w:val="16"/>
+                <w:szCs w:val="16"/>
+              </w:rPr>
+              <w:t xml:space="preserve">▸ Buy Before Muhurat Ends</w:t>
+            </w:r>
+          </w:p>
+          <w:p>
+            <w:pPr>
+              <w:spacing w:after="70" w:before="20" w:line="240"/>
+            </w:pPr>
+            <w:r>
+              <w:rPr>
+                <w:rFonts w:ascii="Calibri" w:cs="Calibri" w:eastAsia="Calibri" w:hAnsi="Calibri"/>
+                <w:b/>
+                <w:bCs/>
+                <w:i w:val="false"/>
+                <w:iCs w:val="false"/>
+                <w:color w:val="7C2D12"/>
+                <w:sz w:val="16"/>
+                <w:szCs w:val="16"/>
+              </w:rPr>
               <w:t xml:space="preserve">▸ Shop Dhanteras</w:t>
             </w:r>
           </w:p>
         </w:tc>
       </w:tr>
     </w:tbl>
+    <w:p>
+      <w:pPr>
+        <w:spacing w:after="60" w:before="260" w:line="240"/>
+      </w:pPr>
+      <w:r>
+        <w:rPr>
+          <w:rFonts w:ascii="Calibri" w:cs="Calibri" w:eastAsia="Calibri" w:hAnsi="Calibri"/>
+          <w:b/>
+          <w:bCs/>
+          <w:i w:val="false"/>
+          <w:iCs w:val="false"/>
+          <w:color w:val="7C2D12"/>
+          <w:sz w:val="24"/>
+          <w:szCs w:val="24"/>
+        </w:rPr>
+        <w:t xml:space="preserve">Send plan — the order they actually go out</w:t>
+      </w:r>
+    </w:p>
+    <w:p>
+      <w:pPr>
+        <w:spacing w:after="30" w:before="0" w:line="220"/>
+      </w:pPr>
+      <w:r>
+        <w:rPr>
+          <w:rFonts w:ascii="Calibri" w:cs="Calibri" w:eastAsia="Calibri" w:hAnsi="Calibri"/>
+          <w:b w:val="false"/>
+          <w:bCs w:val="false"/>
+          <w:i w:val="false"/>
+          <w:iCs w:val="false"/>
+          <w:color w:val="44403C"/>
+          <w:sz w:val="17"/>
+          <w:szCs w:val="17"/>
+        </w:rPr>
+        <w:t xml:space="preserve">• 24 Sep, 7:00 PM — Campaign 7 · ATC – 180 Days (2,398)</w:t>
+      </w:r>
+    </w:p>
+    <w:p>
+      <w:pPr>
+        <w:spacing w:after="30" w:before="0" w:line="220"/>
+      </w:pPr>
+      <w:r>
+        <w:rPr>
+          <w:rFonts w:ascii="Calibri" w:cs="Calibri" w:eastAsia="Calibri" w:hAnsi="Calibri"/>
+          <w:b w:val="false"/>
+          <w:bCs w:val="false"/>
+          <w:i w:val="false"/>
+          <w:iCs w:val="false"/>
+          <w:color w:val="44403C"/>
+          <w:sz w:val="17"/>
+          <w:szCs w:val="17"/>
+        </w:rPr>
+        <w:t xml:space="preserve">• 25 Sep, 11:00 AM — Campaign 3 · PDP Visit 2–7 Days (4,417)</w:t>
+      </w:r>
+    </w:p>
+    <w:p>
+      <w:pPr>
+        <w:spacing w:after="30" w:before="0" w:line="220"/>
+      </w:pPr>
+      <w:r>
+        <w:rPr>
+          <w:rFonts w:ascii="Calibri" w:cs="Calibri" w:eastAsia="Calibri" w:hAnsi="Calibri"/>
+          <w:b w:val="false"/>
+          <w:bCs w:val="false"/>
+          <w:i w:val="false"/>
+          <w:iCs w:val="false"/>
+          <w:color w:val="44403C"/>
+          <w:sz w:val="17"/>
+          <w:szCs w:val="17"/>
+        </w:rPr>
+        <w:t xml:space="preserve">• 25 Sep, 6:30 PM — Campaign 2 · PDP Visit 7–14 Days (4,231)</w:t>
+      </w:r>
+    </w:p>
+    <w:p>
+      <w:pPr>
+        <w:spacing w:after="30" w:before="0" w:line="220"/>
+      </w:pPr>
+      <w:r>
+        <w:rPr>
+          <w:rFonts w:ascii="Calibri" w:cs="Calibri" w:eastAsia="Calibri" w:hAnsi="Calibri"/>
+          <w:b w:val="false"/>
+          <w:bCs w:val="false"/>
+          <w:i w:val="false"/>
+          <w:iCs w:val="false"/>
+          <w:color w:val="44403C"/>
+          <w:sz w:val="17"/>
+          <w:szCs w:val="17"/>
+        </w:rPr>
+        <w:t xml:space="preserve">• 26 Sep, 12:00 PM — Campaign 1 · PDP Visit 15–30 Days (6,003)</w:t>
+      </w:r>
+    </w:p>
+    <w:p>
+      <w:pPr>
+        <w:spacing w:after="30" w:before="0" w:line="220"/>
+      </w:pPr>
+      <w:r>
+        <w:rPr>
+          <w:rFonts w:ascii="Calibri" w:cs="Calibri" w:eastAsia="Calibri" w:hAnsi="Calibri"/>
+          <w:b w:val="false"/>
+          <w:bCs w:val="false"/>
+          <w:i w:val="false"/>
+          <w:iCs w:val="false"/>
+          <w:color w:val="44403C"/>
+          <w:sz w:val="17"/>
+          <w:szCs w:val="17"/>
+        </w:rPr>
+        <w:t xml:space="preserve">• 26 Sep, 1:00 PM — Campaign 6 · Orders – 180 Days (2,635)</w:t>
+      </w:r>
+    </w:p>
+    <w:p>
+      <w:pPr>
+        <w:spacing w:after="30" w:before="0" w:line="220"/>
+      </w:pPr>
+      <w:r>
+        <w:rPr>
+          <w:rFonts w:ascii="Calibri" w:cs="Calibri" w:eastAsia="Calibri" w:hAnsi="Calibri"/>
+          <w:b w:val="false"/>
+          <w:bCs w:val="false"/>
+          <w:i w:val="false"/>
+          <w:iCs w:val="false"/>
+          <w:color w:val="44403C"/>
+          <w:sz w:val="17"/>
+          <w:szCs w:val="17"/>
+        </w:rPr>
+        <w:t xml:space="preserve">• 26 Sep, 5:00 PM — Campaign 4 · Coll Visit – 180 Days (1,538)</w:t>
+      </w:r>
+    </w:p>
+    <w:p>
+      <w:pPr>
+        <w:spacing w:after="30" w:before="0" w:line="220"/>
+      </w:pPr>
+      <w:r>
+        <w:rPr>
+          <w:rFonts w:ascii="Calibri" w:cs="Calibri" w:eastAsia="Calibri" w:hAnsi="Calibri"/>
+          <w:b w:val="false"/>
+          <w:bCs w:val="false"/>
+          <w:i w:val="false"/>
+          <w:iCs w:val="false"/>
+          <w:color w:val="44403C"/>
+          <w:sz w:val="17"/>
+          <w:szCs w:val="17"/>
+        </w:rPr>
+        <w:t xml:space="preserve">• 26 Sep, 8:00 PM — Campaign 5 · HP Visit 7–30 Days (5,975)</w:t>
+      </w:r>
+    </w:p>
+    <w:p>
+      <w:pPr>
+        <w:spacing w:after="30" w:before="0" w:line="220"/>
+      </w:pPr>
+      <w:r>
+        <w:rPr>
+          <w:rFonts w:ascii="Calibri" w:cs="Calibri" w:eastAsia="Calibri" w:hAnsi="Calibri"/>
+          <w:b w:val="false"/>
+          <w:bCs w:val="false"/>
+          <w:i w:val="false"/>
+          <w:iCs w:val="false"/>
+          <w:color w:val="44403C"/>
+          <w:sz w:val="17"/>
+          <w:szCs w:val="17"/>
+        </w:rPr>
+        <w:t xml:space="preserve">• 27 Sep – 10 Oct — SHRADDH. No selling.</w:t>
+      </w:r>
+    </w:p>
+    <w:p>
+      <w:pPr>
+        <w:spacing w:after="30" w:before="0" w:line="220"/>
+      </w:pPr>
+      <w:r>
+        <w:rPr>
+          <w:rFonts w:ascii="Calibri" w:cs="Calibri" w:eastAsia="Calibri" w:hAnsi="Calibri"/>
+          <w:b w:val="false"/>
+          <w:bCs w:val="false"/>
+          <w:i w:val="false"/>
+          <w:iCs w:val="false"/>
+          <w:color w:val="44403C"/>
+          <w:sz w:val="17"/>
+          <w:szCs w:val="17"/>
+        </w:rPr>
+        <w:t xml:space="preserve">• 28 Sep, 9:00 AM — Campaign 9 · all cohorts, Navratri pre-book (~27,000)</w:t>
+      </w:r>
+    </w:p>
+    <w:p>
+      <w:pPr>
+        <w:spacing w:after="30" w:before="0" w:line="220"/>
+      </w:pPr>
+      <w:r>
+        <w:rPr>
+          <w:rFonts w:ascii="Calibri" w:cs="Calibri" w:eastAsia="Calibri" w:hAnsi="Calibri"/>
+          <w:b w:val="false"/>
+          <w:bCs w:val="false"/>
+          <w:i w:val="false"/>
+          <w:iCs w:val="false"/>
+          <w:color w:val="44403C"/>
+          <w:sz w:val="17"/>
+          <w:szCs w:val="17"/>
+        </w:rPr>
+        <w:t xml:space="preserve">• 12 Oct, 11:00 AM — Campaign 8 · bulk / corporate slice (~300)</w:t>
+      </w:r>
+    </w:p>
+    <w:p>
+      <w:pPr>
+        <w:spacing w:after="30" w:before="0" w:line="220"/>
+      </w:pPr>
+      <w:r>
+        <w:rPr>
+          <w:rFonts w:ascii="Calibri" w:cs="Calibri" w:eastAsia="Calibri" w:hAnsi="Calibri"/>
+          <w:b w:val="false"/>
+          <w:bCs w:val="false"/>
+          <w:i w:val="false"/>
+          <w:iCs w:val="false"/>
+          <w:color w:val="44403C"/>
+          <w:sz w:val="17"/>
+          <w:szCs w:val="17"/>
+        </w:rPr>
+        <w:t xml:space="preserve">• 6 Nov, 7:00 AM — Campaign 10 · all cohorts, Dhanteras (~27,000)</w:t>
+      </w:r>
+    </w:p>
     <w:p>
       <w:pPr>
         <w:spacing w:after="60" w:before="260" w:line="240"/>

</xml_diff>

<commit_message>
Align send times to segment sequence and add Excel workbook
Send slots now follow the shared segment-list order across 24-26 Sep, and
the urgency lines are rewritten so each stays factually true on its new
send date - every campaign 1-7 offer now expires 26 Sep midnight.

Adds a two-sheet Excel workbook: the campaign table, plus a sheet with
the discount ladder, the Shopify codes to create and the send plan.

Co-Authored-By: Claude Opus 5 <noreply@anthropic.com>
Claude-Session: https://claude.ai/code/session_01RjSU6dDwFBwk34LrSdddTP
</commit_message>
<xml_diff>
--- a/campaigns/Dev-Aastha-WhatsApp-Campaign-Brief.docx
+++ b/campaigns/Dev-Aastha-WhatsApp-Campaign-Brief.docx
@@ -1633,7 +1633,7 @@
                 <w:sz w:val="16"/>
                 <w:szCs w:val="16"/>
               </w:rPr>
-              <w:t xml:space="preserve">SEND  26 Sep · 12:00 PM</w:t>
+              <w:t xml:space="preserve">SEND  24 Sep · 11:00 AM</w:t>
             </w:r>
           </w:p>
         </w:tc>
@@ -1844,7 +1844,7 @@
                 <w:sz w:val="17"/>
                 <w:szCs w:val="17"/>
               </w:rPr>
-              <w:t xml:space="preserve">⌛ Ends tonight — Shraddh starts tomorrow !!</w:t>
+              <w:t xml:space="preserve">⌛ Offer ends 26 Sep — Shraddh begins the 27th !!</w:t>
             </w:r>
           </w:p>
           <w:p>
@@ -2275,7 +2275,7 @@
                 <w:sz w:val="16"/>
                 <w:szCs w:val="16"/>
               </w:rPr>
-              <w:t xml:space="preserve">SEND  25 Sep · 6:30 PM</w:t>
+              <w:t xml:space="preserve">SEND  24 Sep · 6:30 PM</w:t>
             </w:r>
           </w:p>
         </w:tc>
@@ -2396,7 +2396,7 @@
                 <w:sz w:val="17"/>
                 <w:szCs w:val="17"/>
               </w:rPr>
-              <w:t xml:space="preserve">An *exclusive ₹151 off*, held 24 hours 🎁</w:t>
+              <w:t xml:space="preserve">An *exclusive ₹151 off*, held till 26 Sep 🎁</w:t>
             </w:r>
           </w:p>
           <w:p>
@@ -2607,7 +2607,7 @@
                 <w:sz w:val="15"/>
                 <w:szCs w:val="15"/>
               </w:rPr>
-              <w:t xml:space="preserve">• Price held 24 hours only</w:t>
+              <w:t xml:space="preserve">• Price held till 26 Sep</w:t>
             </w:r>
           </w:p>
         </w:tc>
@@ -2984,7 +2984,7 @@
                 <w:sz w:val="17"/>
                 <w:szCs w:val="17"/>
               </w:rPr>
-              <w:t xml:space="preserve">Order by tomorrow and it reaches you before *Shraddh* 🎁</w:t>
+              <w:t xml:space="preserve">Order by 26 Sep and it reaches you before *Shraddh* 🎁</w:t>
             </w:r>
           </w:p>
           <w:p>
@@ -3038,7 +3038,7 @@
                 <w:sz w:val="17"/>
                 <w:szCs w:val="17"/>
               </w:rPr>
-              <w:t xml:space="preserve">⌛ After 27 Sep, sthapana waits till Navratri — 11 Oct !!</w:t>
+              <w:t xml:space="preserve">⌛ Order by 26 Sep — sthapana after that waits till Navratri, 11 Oct !!</w:t>
             </w:r>
           </w:p>
           <w:p>
@@ -3451,7 +3451,7 @@
                 <w:sz w:val="16"/>
                 <w:szCs w:val="16"/>
               </w:rPr>
-              <w:t xml:space="preserve">SEND  26 Sep · 5:00 PM</w:t>
+              <w:t xml:space="preserve">SEND  25 Sep · 5:00 PM</w:t>
             </w:r>
           </w:p>
         </w:tc>
@@ -3626,7 +3626,7 @@
                 <w:sz w:val="17"/>
                 <w:szCs w:val="17"/>
               </w:rPr>
-              <w:t xml:space="preserve">⌛ Tonight only — Shraddh begins tomorrow !!</w:t>
+              <w:t xml:space="preserve">⌛ Ends 26 Sep — Shraddh begins the next morning !!</w:t>
             </w:r>
           </w:p>
           <w:p>
@@ -4057,7 +4057,7 @@
                 <w:sz w:val="16"/>
                 <w:szCs w:val="16"/>
               </w:rPr>
-              <w:t xml:space="preserve">SEND  26 Sep · 8:00 PM</w:t>
+              <w:t xml:space="preserve">SEND  25 Sep · 8:00 PM</w:t>
             </w:r>
           </w:p>
         </w:tc>
@@ -4268,7 +4268,7 @@
                 <w:sz w:val="17"/>
                 <w:szCs w:val="17"/>
               </w:rPr>
-              <w:t xml:space="preserve">⌛ Before Shraddh — tomorrow !!</w:t>
+              <w:t xml:space="preserve">⌛ Ends 26 Sep — before Shraddh !!</w:t>
             </w:r>
           </w:p>
           <w:p>
@@ -4699,7 +4699,7 @@
                 <w:sz w:val="16"/>
                 <w:szCs w:val="16"/>
               </w:rPr>
-              <w:t xml:space="preserve">SEND  26 Sep · 1:00 PM</w:t>
+              <w:t xml:space="preserve">SEND  26 Sep · 12:00 PM</w:t>
             </w:r>
           </w:p>
         </w:tc>
@@ -5305,7 +5305,7 @@
                 <w:sz w:val="16"/>
                 <w:szCs w:val="16"/>
               </w:rPr>
-              <w:t xml:space="preserve">SEND  24 Sep · 7:00 PM</w:t>
+              <w:t xml:space="preserve">SEND  26 Sep · 7:00 PM</w:t>
             </w:r>
           </w:p>
         </w:tc>
@@ -5619,7 +5619,7 @@
                 <w:sz w:val="15"/>
                 <w:szCs w:val="15"/>
               </w:rPr>
-              <w:t xml:space="preserve">• Expires 24 Sep, 11:59 PM</w:t>
+              <w:t xml:space="preserve">• Expires 26 Sep, 11:59 PM</w:t>
             </w:r>
           </w:p>
         </w:tc>
@@ -7718,7 +7718,7 @@
           <w:sz w:val="24"/>
           <w:szCs w:val="24"/>
         </w:rPr>
-        <w:t xml:space="preserve">Send plan — the order they actually go out</w:t>
+        <w:t xml:space="preserve">Send plan — your seven cohorts, in your segment-list sequence</w:t>
       </w:r>
     </w:p>
     <w:p>
@@ -7736,7 +7736,25 @@
           <w:sz w:val="17"/>
           <w:szCs w:val="17"/>
         </w:rPr>
-        <w:t xml:space="preserve">• 24 Sep, 7:00 PM — Campaign 7 · ATC – 180 Days (2,398)</w:t>
+        <w:t xml:space="preserve">• 24 Sep, 11:00 AM — Campaign 1 · PDP Visit 15–30 Days (6,003)</w:t>
+      </w:r>
+    </w:p>
+    <w:p>
+      <w:pPr>
+        <w:spacing w:after="30" w:before="0" w:line="220"/>
+      </w:pPr>
+      <w:r>
+        <w:rPr>
+          <w:rFonts w:ascii="Calibri" w:cs="Calibri" w:eastAsia="Calibri" w:hAnsi="Calibri"/>
+          <w:b w:val="false"/>
+          <w:bCs w:val="false"/>
+          <w:i w:val="false"/>
+          <w:iCs w:val="false"/>
+          <w:color w:val="44403C"/>
+          <w:sz w:val="17"/>
+          <w:szCs w:val="17"/>
+        </w:rPr>
+        <w:t xml:space="preserve">• 24 Sep, 6:30 PM — Campaign 2 · PDP Visit 7–14 Days (4,231)</w:t>
       </w:r>
     </w:p>
     <w:p>
@@ -7772,7 +7790,7 @@
           <w:sz w:val="17"/>
           <w:szCs w:val="17"/>
         </w:rPr>
-        <w:t xml:space="preserve">• 25 Sep, 6:30 PM — Campaign 2 · PDP Visit 7–14 Days (4,231)</w:t>
+        <w:t xml:space="preserve">• 25 Sep, 5:00 PM — Campaign 4 · Coll Visit – 180 Days (1,538)</w:t>
       </w:r>
     </w:p>
     <w:p>
@@ -7790,7 +7808,7 @@
           <w:sz w:val="17"/>
           <w:szCs w:val="17"/>
         </w:rPr>
-        <w:t xml:space="preserve">• 26 Sep, 12:00 PM — Campaign 1 · PDP Visit 15–30 Days (6,003)</w:t>
+        <w:t xml:space="preserve">• 25 Sep, 8:00 PM — Campaign 5 · HP Visit 7–30 Days (5,975)</w:t>
       </w:r>
     </w:p>
     <w:p>
@@ -7808,7 +7826,7 @@
           <w:sz w:val="17"/>
           <w:szCs w:val="17"/>
         </w:rPr>
-        <w:t xml:space="preserve">• 26 Sep, 1:00 PM — Campaign 6 · Orders – 180 Days (2,635)</w:t>
+        <w:t xml:space="preserve">• 26 Sep, 12:00 PM — Campaign 6 · Orders – 180 Days (2,635)</w:t>
       </w:r>
     </w:p>
     <w:p>
@@ -7826,25 +7844,7 @@
           <w:sz w:val="17"/>
           <w:szCs w:val="17"/>
         </w:rPr>
-        <w:t xml:space="preserve">• 26 Sep, 5:00 PM — Campaign 4 · Coll Visit – 180 Days (1,538)</w:t>
-      </w:r>
-    </w:p>
-    <w:p>
-      <w:pPr>
-        <w:spacing w:after="30" w:before="0" w:line="220"/>
-      </w:pPr>
-      <w:r>
-        <w:rPr>
-          <w:rFonts w:ascii="Calibri" w:cs="Calibri" w:eastAsia="Calibri" w:hAnsi="Calibri"/>
-          <w:b w:val="false"/>
-          <w:bCs w:val="false"/>
-          <w:i w:val="false"/>
-          <w:iCs w:val="false"/>
-          <w:color w:val="44403C"/>
-          <w:sz w:val="17"/>
-          <w:szCs w:val="17"/>
-        </w:rPr>
-        <w:t xml:space="preserve">• 26 Sep, 8:00 PM — Campaign 5 · HP Visit 7–30 Days (5,975)</w:t>
+        <w:t xml:space="preserve">• 26 Sep, 7:00 PM — Campaign 7 · ATC – 180 Days (2,398) — last send before the wall</w:t>
       </w:r>
     </w:p>
     <w:p>
@@ -7917,6 +7917,24 @@
           <w:szCs w:val="17"/>
         </w:rPr>
         <w:t xml:space="preserve">• 6 Nov, 7:00 AM — Campaign 10 · all cohorts, Dhanteras (~27,000)</w:t>
+      </w:r>
+    </w:p>
+    <w:p>
+      <w:pPr>
+        <w:spacing w:after="20" w:before="60" w:line="240"/>
+      </w:pPr>
+      <w:r>
+        <w:rPr>
+          <w:rFonts w:ascii="Calibri" w:cs="Calibri" w:eastAsia="Calibri" w:hAnsi="Calibri"/>
+          <w:b w:val="false"/>
+          <w:bCs w:val="false"/>
+          <w:i/>
+          <w:iCs/>
+          <w:color w:val="44403C"/>
+          <w:sz w:val="17"/>
+          <w:szCs w:val="17"/>
+        </w:rPr>
+        <w:t xml:space="preserve">Every offer in campaigns 1–7 expires 26 September at midnight, whatever day the message goes out. One shared deadline keeps the urgency true and means one expiry date to set on every code.</w:t>
       </w:r>
     </w:p>
     <w:p>

</xml_diff>